<commit_message>
Progress scrolling bar on Project pages, new shade of dark green, minor copy tweaks, LinkedIn on resume page
</commit_message>
<xml_diff>
--- a/src/public/dylan-austin-resume.docx
+++ b/src/public/dylan-austin-resume.docx
@@ -5,7 +5,7 @@
     <w:p>
       <w:pPr>
         <w:pStyle w:val="Heading1"/>
-        <w:spacing w:lineRule="auto" w:line="273" w:before="120" w:after="240"/>
+        <w:spacing w:lineRule="auto" w:line="271" w:before="120" w:after="240"/>
         <w:jc w:val="center"/>
         <w:rPr>
           <w:rFonts w:ascii="Arial" w:hAnsi="Arial"/>
@@ -24,7 +24,7 @@
       <w:pPr>
         <w:pStyle w:val="Normal"/>
         <w:bidi w:val="0"/>
-        <w:spacing w:lineRule="auto" w:line="273" w:before="0" w:after="240"/>
+        <w:spacing w:lineRule="auto" w:line="271" w:before="0" w:after="240"/>
         <w:jc w:val="center"/>
         <w:rPr/>
       </w:pPr>
@@ -87,7 +87,7 @@
     <w:p>
       <w:pPr>
         <w:pStyle w:val="Heading2"/>
-        <w:spacing w:lineRule="auto" w:line="273" w:before="0" w:after="120"/>
+        <w:spacing w:lineRule="auto" w:line="271" w:before="0" w:after="120"/>
         <w:rPr>
           <w:rFonts w:ascii="Arial" w:hAnsi="Arial"/>
         </w:rPr>
@@ -104,9 +104,8 @@
     <w:p>
       <w:pPr>
         <w:pStyle w:val="Normal"/>
-        <w:pBdr/>
-        <w:bidi w:val="0"/>
-        <w:spacing w:lineRule="auto" w:line="273" w:before="0" w:after="240"/>
+        <w:bidi w:val="0"/>
+        <w:spacing w:lineRule="auto" w:line="271" w:before="0" w:after="240"/>
         <w:jc w:val="left"/>
         <w:rPr>
           <w:rFonts w:ascii="Arial" w:hAnsi="Arial" w:eastAsia="Google Sans" w:cs="Google Sans"/>
@@ -118,20 +117,27 @@
           <w:rFonts w:eastAsia="Google Sans" w:cs="Google Sans" w:ascii="Arial" w:hAnsi="Arial"/>
           <w:color w:val="1F1F1F"/>
         </w:rPr>
-        <w:t>Dylan is a product-minded UX designer and content strategist in Seattle. He has written, designed, and strategized online experiences for over 10 years</w:t>
-      </w:r>
-      <w:r>
-        <w:rPr>
-          <w:rFonts w:eastAsia="Google Sans" w:cs="Google Sans" w:ascii="Arial" w:hAnsi="Arial"/>
-          <w:color w:val="1F1F1F"/>
-        </w:rPr>
-        <w:t>.</w:t>
+        <w:t xml:space="preserve">Dylan is a product-minded UX designer and content strategist in Seattle. He has written, designed, and </w:t>
+      </w:r>
+      <w:r>
+        <w:rPr>
+          <w:rFonts w:eastAsia="Google Sans" w:cs="Google Sans" w:ascii="Arial" w:hAnsi="Arial"/>
+          <w:color w:val="1F1F1F"/>
+        </w:rPr>
+        <w:t>built</w:t>
+      </w:r>
+      <w:r>
+        <w:rPr>
+          <w:rFonts w:eastAsia="Google Sans" w:cs="Google Sans" w:ascii="Arial" w:hAnsi="Arial"/>
+          <w:color w:val="1F1F1F"/>
+        </w:rPr>
+        <w:t xml:space="preserve"> online experiences for over 10 years.</w:t>
       </w:r>
     </w:p>
     <w:p>
       <w:pPr>
         <w:pStyle w:val="Heading3"/>
-        <w:spacing w:lineRule="auto" w:line="273" w:before="240" w:after="120"/>
+        <w:spacing w:lineRule="auto" w:line="271" w:before="240" w:after="120"/>
         <w:rPr>
           <w:rFonts w:ascii="Arial" w:hAnsi="Arial"/>
         </w:rPr>
@@ -143,6 +149,203 @@
           <w:rFonts w:ascii="Arial" w:hAnsi="Arial"/>
         </w:rPr>
         <w:t>Core Competencies</w:t>
+      </w:r>
+    </w:p>
+    <w:p>
+      <w:pPr>
+        <w:pStyle w:val="Normal"/>
+        <w:numPr>
+          <w:ilvl w:val="0"/>
+          <w:numId w:val="2"/>
+        </w:numPr>
+        <w:bidi w:val="0"/>
+        <w:spacing w:lineRule="auto" w:line="271" w:before="0" w:after="0"/>
+        <w:ind w:hanging="360" w:left="465" w:right="0"/>
+        <w:jc w:val="left"/>
+        <w:rPr>
+          <w:rFonts w:ascii="Arial" w:hAnsi="Arial"/>
+        </w:rPr>
+      </w:pPr>
+      <w:r>
+        <w:rPr>
+          <w:rFonts w:eastAsia="Google Sans" w:cs="Google Sans" w:ascii="Arial" w:hAnsi="Arial"/>
+          <w:b/>
+          <w:bCs/>
+          <w:color w:val="1F1F1F"/>
+        </w:rPr>
+        <w:t>UX/UI &amp; Responsive Design:</w:t>
+      </w:r>
+      <w:r>
+        <w:rPr>
+          <w:rFonts w:eastAsia="Google Sans" w:cs="Google Sans" w:ascii="Arial" w:hAnsi="Arial"/>
+          <w:color w:val="1F1F1F"/>
+        </w:rPr>
+        <w:t xml:space="preserve"> Wireframing, high-fidelity prototyping, and designing for complex functionality and user journeys</w:t>
+      </w:r>
+    </w:p>
+    <w:p>
+      <w:pPr>
+        <w:pStyle w:val="Normal"/>
+        <w:numPr>
+          <w:ilvl w:val="0"/>
+          <w:numId w:val="2"/>
+        </w:numPr>
+        <w:bidi w:val="0"/>
+        <w:spacing w:lineRule="auto" w:line="271" w:before="0" w:after="0"/>
+        <w:ind w:hanging="360" w:left="465" w:right="0"/>
+        <w:jc w:val="left"/>
+        <w:rPr>
+          <w:rFonts w:ascii="Arial" w:hAnsi="Arial"/>
+        </w:rPr>
+      </w:pPr>
+      <w:r>
+        <w:rPr>
+          <w:rFonts w:eastAsia="Google Sans" w:cs="Google Sans" w:ascii="Arial" w:hAnsi="Arial"/>
+          <w:b/>
+          <w:bCs/>
+          <w:color w:val="1F1F1F"/>
+        </w:rPr>
+        <w:t>Integrated Content Strategy:</w:t>
+      </w:r>
+      <w:r>
+        <w:rPr>
+          <w:rFonts w:eastAsia="Google Sans" w:cs="Google Sans" w:ascii="Arial" w:hAnsi="Arial"/>
+          <w:color w:val="1F1F1F"/>
+        </w:rPr>
+        <w:t xml:space="preserve"> Site-wide content audits, information architecture, and aligning brand voice across product touchpoints</w:t>
+      </w:r>
+    </w:p>
+    <w:p>
+      <w:pPr>
+        <w:pStyle w:val="Normal"/>
+        <w:numPr>
+          <w:ilvl w:val="0"/>
+          <w:numId w:val="2"/>
+        </w:numPr>
+        <w:bidi w:val="0"/>
+        <w:spacing w:lineRule="auto" w:line="271" w:before="0" w:after="0"/>
+        <w:ind w:hanging="360" w:left="465" w:right="0"/>
+        <w:jc w:val="left"/>
+        <w:rPr>
+          <w:rFonts w:ascii="Arial" w:hAnsi="Arial"/>
+        </w:rPr>
+      </w:pPr>
+      <w:r>
+        <w:rPr>
+          <w:rFonts w:eastAsia="Google Sans" w:cs="Google Sans" w:ascii="Arial" w:hAnsi="Arial"/>
+          <w:b/>
+          <w:bCs/>
+          <w:color w:val="1F1F1F"/>
+        </w:rPr>
+        <w:t>Systemic Health &amp; Accessibility:</w:t>
+      </w:r>
+      <w:r>
+        <w:rPr>
+          <w:rFonts w:eastAsia="Google Sans" w:cs="Google Sans" w:ascii="Arial" w:hAnsi="Arial"/>
+          <w:color w:val="1F1F1F"/>
+        </w:rPr>
+        <w:t xml:space="preserve"> Identifying and addressing design debt and accessibility (A11Y) issues within existing products</w:t>
+      </w:r>
+    </w:p>
+    <w:p>
+      <w:pPr>
+        <w:pStyle w:val="Normal"/>
+        <w:numPr>
+          <w:ilvl w:val="0"/>
+          <w:numId w:val="2"/>
+        </w:numPr>
+        <w:bidi w:val="0"/>
+        <w:spacing w:lineRule="auto" w:line="271" w:before="0" w:after="120"/>
+        <w:ind w:hanging="360" w:left="465" w:right="0"/>
+        <w:jc w:val="left"/>
+        <w:rPr>
+          <w:rFonts w:ascii="Arial" w:hAnsi="Arial"/>
+        </w:rPr>
+      </w:pPr>
+      <w:r>
+        <w:rPr>
+          <w:rFonts w:eastAsia="Google Sans" w:cs="Google Sans" w:ascii="Arial" w:hAnsi="Arial"/>
+          <w:b/>
+          <w:bCs/>
+          <w:color w:val="1F1F1F"/>
+        </w:rPr>
+        <w:t>Cross-Functional Alignment:</w:t>
+      </w:r>
+      <w:r>
+        <w:rPr>
+          <w:rFonts w:eastAsia="Google Sans" w:cs="Google Sans" w:ascii="Arial" w:hAnsi="Arial"/>
+          <w:color w:val="1F1F1F"/>
+        </w:rPr>
+        <w:t xml:space="preserve"> Coordinating between dev, design, and content teams to modernize site architecture and production workflows</w:t>
+      </w:r>
+    </w:p>
+    <w:p>
+      <w:pPr>
+        <w:pStyle w:val="Heading3"/>
+        <w:spacing w:lineRule="auto" w:line="271" w:before="240" w:after="120"/>
+        <w:rPr>
+          <w:rFonts w:ascii="Arial" w:hAnsi="Arial" w:eastAsia="Google Sans" w:cs="Google Sans"/>
+          <w:color w:val="1F1F1F"/>
+        </w:rPr>
+      </w:pPr>
+      <w:r>
+        <w:rPr>
+          <w:rFonts w:eastAsia="Google Sans" w:cs="Google Sans" w:ascii="Arial" w:hAnsi="Arial"/>
+          <w:color w:val="1F1F1F"/>
+        </w:rPr>
+        <w:t>Professional Experience</w:t>
+      </w:r>
+    </w:p>
+    <w:p>
+      <w:pPr>
+        <w:pStyle w:val="Normal"/>
+        <w:bidi w:val="0"/>
+        <w:spacing w:lineRule="auto" w:line="271" w:before="0" w:after="120"/>
+        <w:jc w:val="left"/>
+        <w:rPr>
+          <w:rFonts w:ascii="Arial" w:hAnsi="Arial"/>
+        </w:rPr>
+      </w:pPr>
+      <w:r>
+        <w:rPr>
+          <w:rFonts w:eastAsia="Google Sans" w:cs="Google Sans" w:ascii="Arial" w:hAnsi="Arial"/>
+          <w:b/>
+          <w:bCs/>
+          <w:color w:val="1F1F1F"/>
+        </w:rPr>
+        <w:t>Know Your Pet DNA by Ancestry</w:t>
+      </w:r>
+      <w:r>
+        <w:rPr>
+          <w:rFonts w:eastAsia="Google Sans" w:cs="Google Sans" w:ascii="Arial" w:hAnsi="Arial"/>
+          <w:color w:val="1F1F1F"/>
+        </w:rPr>
+        <w:t xml:space="preserve"> | </w:t>
+      </w:r>
+      <w:r>
+        <w:rPr>
+          <w:rFonts w:eastAsia="Google Sans" w:cs="Google Sans" w:ascii="Arial" w:hAnsi="Arial"/>
+          <w:i/>
+          <w:iCs/>
+          <w:color w:val="1F1F1F"/>
+        </w:rPr>
+        <w:t>Content Designer → UX Design</w:t>
+      </w:r>
+      <w:r>
+        <w:rPr>
+          <w:rFonts w:eastAsia="Google Sans" w:cs="Google Sans" w:ascii="Arial" w:hAnsi="Arial"/>
+          <w:color w:val="1F1F1F"/>
+        </w:rPr>
+        <w:t xml:space="preserve"> | </w:t>
+      </w:r>
+      <w:r>
+        <w:rPr>
+          <w:rFonts w:eastAsia="Google Sans" w:cs="Google Sans" w:ascii="Arial" w:hAnsi="Arial"/>
+          <w:b/>
+          <w:bCs/>
+          <w:color w:val="1F1F1F"/>
+        </w:rPr>
+        <w:t>Mar 2025 - Jan 2026</w:t>
       </w:r>
     </w:p>
     <w:p>
@@ -152,30 +355,21 @@
           <w:ilvl w:val="0"/>
           <w:numId w:val="3"/>
         </w:numPr>
-        <w:pBdr/>
-        <w:bidi w:val="0"/>
-        <w:spacing w:lineRule="auto" w:line="273" w:before="0" w:after="0"/>
+        <w:bidi w:val="0"/>
+        <w:spacing w:lineRule="auto" w:line="271" w:before="0" w:after="0"/>
         <w:ind w:hanging="360" w:left="465" w:right="0"/>
         <w:jc w:val="left"/>
         <w:rPr>
-          <w:rFonts w:ascii="Arial" w:hAnsi="Arial"/>
-        </w:rPr>
-      </w:pPr>
-      <w:r>
-        <w:rPr>
-          <w:rFonts w:eastAsia="Google Sans" w:cs="Google Sans" w:ascii="Arial" w:hAnsi="Arial"/>
-          <w:b/>
-          <w:bCs/>
-          <w:color w:val="1F1F1F"/>
-        </w:rPr>
-        <w:t>UX/UI &amp; Responsive Design:</w:t>
-      </w:r>
-      <w:r>
-        <w:rPr>
-          <w:rFonts w:eastAsia="Google Sans" w:cs="Google Sans" w:ascii="Arial" w:hAnsi="Arial"/>
-          <w:color w:val="1F1F1F"/>
-        </w:rPr>
-        <w:t xml:space="preserve"> Wireframing, high-fidelity prototyping, and designing for complex functionality and user journeys</w:t>
+          <w:rFonts w:ascii="Arial" w:hAnsi="Arial" w:eastAsia="Google Sans" w:cs="Google Sans"/>
+          <w:color w:val="1F1F1F"/>
+        </w:rPr>
+      </w:pPr>
+      <w:r>
+        <w:rPr>
+          <w:rFonts w:eastAsia="Google Sans" w:cs="Google Sans" w:ascii="Arial" w:hAnsi="Arial"/>
+          <w:color w:val="1F1F1F"/>
+        </w:rPr>
+        <w:t>Shifted to a UX lead capacity as team dynamics changed, designing new roles and permissions functionality, account settings experiences, and shareable graphic features</w:t>
       </w:r>
     </w:p>
     <w:p>
@@ -185,30 +379,21 @@
           <w:ilvl w:val="0"/>
           <w:numId w:val="3"/>
         </w:numPr>
-        <w:pBdr/>
-        <w:bidi w:val="0"/>
-        <w:spacing w:lineRule="auto" w:line="273" w:before="0" w:after="0"/>
+        <w:bidi w:val="0"/>
+        <w:spacing w:lineRule="auto" w:line="271" w:before="0" w:after="0"/>
         <w:ind w:hanging="360" w:left="465" w:right="0"/>
         <w:jc w:val="left"/>
         <w:rPr>
-          <w:rFonts w:ascii="Arial" w:hAnsi="Arial"/>
-        </w:rPr>
-      </w:pPr>
-      <w:r>
-        <w:rPr>
-          <w:rFonts w:eastAsia="Google Sans" w:cs="Google Sans" w:ascii="Arial" w:hAnsi="Arial"/>
-          <w:b/>
-          <w:bCs/>
-          <w:color w:val="1F1F1F"/>
-        </w:rPr>
-        <w:t>Integrated Content Strategy:</w:t>
-      </w:r>
-      <w:r>
-        <w:rPr>
-          <w:rFonts w:eastAsia="Google Sans" w:cs="Google Sans" w:ascii="Arial" w:hAnsi="Arial"/>
-          <w:color w:val="1F1F1F"/>
-        </w:rPr>
-        <w:t xml:space="preserve"> Site-wide content audits, information architecture, and aligning brand voice across product touchpoints</w:t>
+          <w:rFonts w:ascii="Arial" w:hAnsi="Arial" w:eastAsia="Google Sans" w:cs="Google Sans"/>
+          <w:color w:val="1F1F1F"/>
+        </w:rPr>
+      </w:pPr>
+      <w:r>
+        <w:rPr>
+          <w:rFonts w:eastAsia="Google Sans" w:cs="Google Sans" w:ascii="Arial" w:hAnsi="Arial"/>
+          <w:color w:val="1F1F1F"/>
+        </w:rPr>
+        <w:t>Addressed impeding design debt and A11Y issues</w:t>
       </w:r>
     </w:p>
     <w:p>
@@ -218,30 +403,21 @@
           <w:ilvl w:val="0"/>
           <w:numId w:val="3"/>
         </w:numPr>
-        <w:pBdr/>
-        <w:bidi w:val="0"/>
-        <w:spacing w:lineRule="auto" w:line="273" w:before="0" w:after="0"/>
+        <w:bidi w:val="0"/>
+        <w:spacing w:lineRule="auto" w:line="271" w:before="0" w:after="0"/>
         <w:ind w:hanging="360" w:left="465" w:right="0"/>
         <w:jc w:val="left"/>
         <w:rPr>
-          <w:rFonts w:ascii="Arial" w:hAnsi="Arial"/>
-        </w:rPr>
-      </w:pPr>
-      <w:r>
-        <w:rPr>
-          <w:rFonts w:eastAsia="Google Sans" w:cs="Google Sans" w:ascii="Arial" w:hAnsi="Arial"/>
-          <w:b/>
-          <w:bCs/>
-          <w:color w:val="1F1F1F"/>
-        </w:rPr>
-        <w:t>Systemic Health &amp; Accessibility:</w:t>
-      </w:r>
-      <w:r>
-        <w:rPr>
-          <w:rFonts w:eastAsia="Google Sans" w:cs="Google Sans" w:ascii="Arial" w:hAnsi="Arial"/>
-          <w:color w:val="1F1F1F"/>
-        </w:rPr>
-        <w:t xml:space="preserve"> Identifying and addressing design debt and accessibility (A11Y) issues within existing products</w:t>
+          <w:rFonts w:ascii="Arial" w:hAnsi="Arial" w:eastAsia="Google Sans" w:cs="Google Sans"/>
+          <w:color w:val="1F1F1F"/>
+        </w:rPr>
+      </w:pPr>
+      <w:r>
+        <w:rPr>
+          <w:rFonts w:eastAsia="Google Sans" w:cs="Google Sans" w:ascii="Arial" w:hAnsi="Arial"/>
+          <w:color w:val="1F1F1F"/>
+        </w:rPr>
+        <w:t>Realigned brand voice and ethos across CRM and the Know Your Pet DNA site</w:t>
       </w:r>
     </w:p>
     <w:p>
@@ -251,12 +427,78 @@
           <w:ilvl w:val="0"/>
           <w:numId w:val="3"/>
         </w:numPr>
-        <w:pBdr/>
-        <w:bidi w:val="0"/>
-        <w:spacing w:lineRule="auto" w:line="273" w:before="0" w:after="120"/>
+        <w:bidi w:val="0"/>
+        <w:spacing w:lineRule="auto" w:line="271" w:before="0" w:after="0"/>
         <w:ind w:hanging="360" w:left="465" w:right="0"/>
         <w:jc w:val="left"/>
         <w:rPr>
+          <w:rFonts w:ascii="Arial" w:hAnsi="Arial" w:eastAsia="Google Sans" w:cs="Google Sans"/>
+          <w:color w:val="1F1F1F"/>
+        </w:rPr>
+      </w:pPr>
+      <w:r>
+        <w:rPr>
+          <w:rFonts w:eastAsia="Google Sans" w:cs="Google Sans" w:ascii="Arial" w:hAnsi="Arial"/>
+          <w:color w:val="1F1F1F"/>
+        </w:rPr>
+        <w:t>Leveraged member services insights to address user experience gaps within the product</w:t>
+      </w:r>
+    </w:p>
+    <w:p>
+      <w:pPr>
+        <w:pStyle w:val="Normal"/>
+        <w:numPr>
+          <w:ilvl w:val="0"/>
+          <w:numId w:val="3"/>
+        </w:numPr>
+        <w:bidi w:val="0"/>
+        <w:spacing w:lineRule="auto" w:line="271" w:before="0" w:after="0"/>
+        <w:ind w:hanging="360" w:left="465" w:right="0"/>
+        <w:jc w:val="left"/>
+        <w:rPr>
+          <w:rFonts w:ascii="Arial" w:hAnsi="Arial" w:eastAsia="Google Sans" w:cs="Google Sans"/>
+          <w:color w:val="1F1F1F"/>
+        </w:rPr>
+      </w:pPr>
+      <w:r>
+        <w:rPr>
+          <w:rFonts w:eastAsia="Google Sans" w:cs="Google Sans" w:ascii="Arial" w:hAnsi="Arial"/>
+          <w:color w:val="1F1F1F"/>
+        </w:rPr>
+        <w:t>Conducted a comprehensive site content audit and cleanup to streamline information architecture</w:t>
+      </w:r>
+    </w:p>
+    <w:p>
+      <w:pPr>
+        <w:pStyle w:val="Normal"/>
+        <w:numPr>
+          <w:ilvl w:val="0"/>
+          <w:numId w:val="3"/>
+        </w:numPr>
+        <w:bidi w:val="0"/>
+        <w:spacing w:lineRule="auto" w:line="271" w:before="0" w:after="120"/>
+        <w:ind w:hanging="360" w:left="465" w:right="0"/>
+        <w:jc w:val="left"/>
+        <w:rPr>
+          <w:rFonts w:ascii="Arial" w:hAnsi="Arial" w:eastAsia="Google Sans" w:cs="Google Sans"/>
+          <w:color w:val="1F1F1F"/>
+        </w:rPr>
+      </w:pPr>
+      <w:r>
+        <w:rPr>
+          <w:rFonts w:eastAsia="Google Sans" w:cs="Google Sans" w:ascii="Arial" w:hAnsi="Arial"/>
+          <w:color w:val="1F1F1F"/>
+        </w:rPr>
+        <w:t>Partnered with the dev team and product stakeholders to facilitate a product migration to a new parent company, including transition of content ecosystem in Hygraph and the user experience for customer data migration</w:t>
+      </w:r>
+    </w:p>
+    <w:p>
+      <w:pPr>
+        <w:pStyle w:val="Normal"/>
+        <w:bidi w:val="0"/>
+        <w:spacing w:lineRule="auto" w:line="271" w:before="240" w:after="120"/>
+        <w:jc w:val="left"/>
+        <w:rPr>
           <w:rFonts w:ascii="Arial" w:hAnsi="Arial"/>
         </w:rPr>
       </w:pPr>
@@ -267,45 +509,31 @@
           <w:bCs/>
           <w:color w:val="1F1F1F"/>
         </w:rPr>
-        <w:t>Cross-Functional Alignment:</w:t>
-      </w:r>
-      <w:r>
-        <w:rPr>
-          <w:rFonts w:eastAsia="Google Sans" w:cs="Google Sans" w:ascii="Arial" w:hAnsi="Arial"/>
-          <w:color w:val="1F1F1F"/>
-        </w:rPr>
-        <w:t xml:space="preserve"> Coordinating between dev, design, and content teams to modernize site architecture and production workflows</w:t>
-      </w:r>
-    </w:p>
-    <w:p>
-      <w:pPr>
-        <w:pStyle w:val="Heading3"/>
-        <w:pBdr/>
-        <w:spacing w:lineRule="auto" w:line="273" w:before="240" w:after="120"/>
-        <w:rPr>
-          <w:rFonts w:ascii="Arial" w:hAnsi="Arial" w:eastAsia="Google Sans" w:cs="Google Sans"/>
-          <w:color w:val="1F1F1F"/>
-        </w:rPr>
-      </w:pPr>
-      <w:r>
-        <w:rPr>
-          <w:rFonts w:eastAsia="Google Sans" w:cs="Google Sans" w:ascii="Arial" w:hAnsi="Arial"/>
-          <w:color w:val="1F1F1F"/>
-        </w:rPr>
-        <w:t>Professional Experience</w:t>
-      </w:r>
-    </w:p>
-    <w:p>
-      <w:pPr>
-        <w:pStyle w:val="Normal"/>
-        <w:pBdr/>
-        <w:bidi w:val="0"/>
-        <w:spacing w:lineRule="auto" w:line="273" w:before="0" w:after="120"/>
-        <w:jc w:val="left"/>
-        <w:rPr>
-          <w:rFonts w:ascii="Arial" w:hAnsi="Arial"/>
-        </w:rPr>
-      </w:pPr>
+        <w:t>Independence Pet Group</w:t>
+      </w:r>
+      <w:r>
+        <w:rPr>
+          <w:rFonts w:eastAsia="Google Sans" w:cs="Google Sans" w:ascii="Arial" w:hAnsi="Arial"/>
+          <w:color w:val="1F1F1F"/>
+        </w:rPr>
+        <w:t xml:space="preserve"> | </w:t>
+      </w:r>
+      <w:r>
+        <w:rPr>
+          <w:rFonts w:eastAsia="Google Sans" w:cs="Google Sans" w:ascii="Arial" w:hAnsi="Arial"/>
+          <w:i/>
+          <w:iCs/>
+          <w:color w:val="1F1F1F"/>
+        </w:rPr>
+        <w:t>Content Strategy Manager</w:t>
+      </w:r>
+      <w:r>
+        <w:rPr>
+          <w:rFonts w:eastAsia="Google Sans" w:cs="Google Sans" w:ascii="Arial" w:hAnsi="Arial"/>
+          <w:color w:val="1F1F1F"/>
+        </w:rPr>
+        <w:t xml:space="preserve"> | </w:t>
+      </w:r>
       <w:r>
         <w:rPr>
           <w:rFonts w:eastAsia="Google Sans" w:cs="Google Sans" w:ascii="Arial" w:hAnsi="Arial"/>
@@ -313,39 +541,7 @@
           <w:bCs/>
           <w:color w:val="1F1F1F"/>
         </w:rPr>
-        <w:t>Know Your Pet DNA by Ancestry</w:t>
-      </w:r>
-      <w:r>
-        <w:rPr>
-          <w:rFonts w:eastAsia="Google Sans" w:cs="Google Sans" w:ascii="Arial" w:hAnsi="Arial"/>
-          <w:color w:val="1F1F1F"/>
-        </w:rPr>
-        <w:t xml:space="preserve"> | </w:t>
-      </w:r>
-      <w:r>
-        <w:rPr>
-          <w:rFonts w:eastAsia="Google Sans" w:cs="Google Sans" w:ascii="Arial" w:hAnsi="Arial"/>
-          <w:i/>
-          <w:iCs/>
-          <w:color w:val="1F1F1F"/>
-        </w:rPr>
-        <w:t>Content Designer → UX Design</w:t>
-      </w:r>
-      <w:r>
-        <w:rPr>
-          <w:rFonts w:eastAsia="Google Sans" w:cs="Google Sans" w:ascii="Arial" w:hAnsi="Arial"/>
-          <w:color w:val="1F1F1F"/>
-        </w:rPr>
-        <w:t xml:space="preserve"> | </w:t>
-      </w:r>
-      <w:r>
-        <w:rPr>
-          <w:rFonts w:eastAsia="Google Sans" w:cs="Google Sans" w:ascii="Arial" w:hAnsi="Arial"/>
-          <w:b/>
-          <w:bCs/>
-          <w:color w:val="1F1F1F"/>
-        </w:rPr>
-        <w:t>Mar 2025 - Jan 2026</w:t>
+        <w:t>Jun 2023 - Apr 2025</w:t>
       </w:r>
     </w:p>
     <w:p>
@@ -355,9 +551,8 @@
           <w:ilvl w:val="0"/>
           <w:numId w:val="4"/>
         </w:numPr>
-        <w:pBdr/>
-        <w:bidi w:val="0"/>
-        <w:spacing w:lineRule="auto" w:line="273" w:before="0" w:after="0"/>
+        <w:bidi w:val="0"/>
+        <w:spacing w:lineRule="auto" w:line="271" w:before="0" w:after="0"/>
         <w:ind w:hanging="360" w:left="465" w:right="0"/>
         <w:jc w:val="left"/>
         <w:rPr>
@@ -370,7 +565,7 @@
           <w:rFonts w:eastAsia="Google Sans" w:cs="Google Sans" w:ascii="Arial" w:hAnsi="Arial"/>
           <w:color w:val="1F1F1F"/>
         </w:rPr>
-        <w:t>Shifted to a UX lead capacity as team dynamics changed, designing new roles and permissions functionality, account settings experiences, and shareable graphic features</w:t>
+        <w:t>Led a content strategy transformation that aligned dev, design, and content teams to modernize site architecture and production workflows</w:t>
       </w:r>
     </w:p>
     <w:p>
@@ -380,9 +575,8 @@
           <w:ilvl w:val="0"/>
           <w:numId w:val="4"/>
         </w:numPr>
-        <w:pBdr/>
-        <w:bidi w:val="0"/>
-        <w:spacing w:lineRule="auto" w:line="273" w:before="0" w:after="0"/>
+        <w:bidi w:val="0"/>
+        <w:spacing w:lineRule="auto" w:line="271" w:before="0" w:after="0"/>
         <w:ind w:hanging="360" w:left="465" w:right="0"/>
         <w:jc w:val="left"/>
         <w:rPr>
@@ -395,7 +589,7 @@
           <w:rFonts w:eastAsia="Google Sans" w:cs="Google Sans" w:ascii="Arial" w:hAnsi="Arial"/>
           <w:color w:val="1F1F1F"/>
         </w:rPr>
-        <w:t>Addressed impeding design debt and A11Y issues</w:t>
+        <w:t>Spearheaded a comprehensive SEO content strategy overhaul for ASPCA Pet Health Insurance, achieving #1 and #2 rankings for competitive, high-intent keywords</w:t>
       </w:r>
     </w:p>
     <w:p>
@@ -405,9 +599,8 @@
           <w:ilvl w:val="0"/>
           <w:numId w:val="4"/>
         </w:numPr>
-        <w:pBdr/>
-        <w:bidi w:val="0"/>
-        <w:spacing w:lineRule="auto" w:line="273" w:before="0" w:after="0"/>
+        <w:bidi w:val="0"/>
+        <w:spacing w:lineRule="auto" w:line="271" w:before="0" w:after="0"/>
         <w:ind w:hanging="360" w:left="465" w:right="0"/>
         <w:jc w:val="left"/>
         <w:rPr>
@@ -420,7 +613,7 @@
           <w:rFonts w:eastAsia="Google Sans" w:cs="Google Sans" w:ascii="Arial" w:hAnsi="Arial"/>
           <w:color w:val="1F1F1F"/>
         </w:rPr>
-        <w:t>Realigned brand voice and ethos across CRM and the Know Your Pet DNA site</w:t>
+        <w:t>Collaborated on UX/UI site optimizations that converted organic traffic into revenue, resulting in a 4x growth in organic sales within 6 months</w:t>
       </w:r>
     </w:p>
     <w:p>
@@ -430,9 +623,8 @@
           <w:ilvl w:val="0"/>
           <w:numId w:val="4"/>
         </w:numPr>
-        <w:pBdr/>
-        <w:bidi w:val="0"/>
-        <w:spacing w:lineRule="auto" w:line="273" w:before="0" w:after="0"/>
+        <w:bidi w:val="0"/>
+        <w:spacing w:lineRule="auto" w:line="271" w:before="0" w:after="120"/>
         <w:ind w:hanging="360" w:left="465" w:right="0"/>
         <w:jc w:val="left"/>
         <w:rPr>
@@ -445,65 +637,14 @@
           <w:rFonts w:eastAsia="Google Sans" w:cs="Google Sans" w:ascii="Arial" w:hAnsi="Arial"/>
           <w:color w:val="1F1F1F"/>
         </w:rPr>
-        <w:t>Leveraged member services insights to address user experience gaps within the product</w:t>
-      </w:r>
-    </w:p>
-    <w:p>
-      <w:pPr>
-        <w:pStyle w:val="Normal"/>
-        <w:numPr>
-          <w:ilvl w:val="0"/>
-          <w:numId w:val="4"/>
-        </w:numPr>
-        <w:pBdr/>
-        <w:bidi w:val="0"/>
-        <w:spacing w:lineRule="auto" w:line="273" w:before="0" w:after="0"/>
-        <w:ind w:hanging="360" w:left="465" w:right="0"/>
-        <w:jc w:val="left"/>
-        <w:rPr>
-          <w:rFonts w:ascii="Arial" w:hAnsi="Arial" w:eastAsia="Google Sans" w:cs="Google Sans"/>
-          <w:color w:val="1F1F1F"/>
-        </w:rPr>
-      </w:pPr>
-      <w:r>
-        <w:rPr>
-          <w:rFonts w:eastAsia="Google Sans" w:cs="Google Sans" w:ascii="Arial" w:hAnsi="Arial"/>
-          <w:color w:val="1F1F1F"/>
-        </w:rPr>
-        <w:t>Conducted a comprehensive site content audit and cleanup to streamline information architecture</w:t>
-      </w:r>
-    </w:p>
-    <w:p>
-      <w:pPr>
-        <w:pStyle w:val="Normal"/>
-        <w:numPr>
-          <w:ilvl w:val="0"/>
-          <w:numId w:val="4"/>
-        </w:numPr>
-        <w:pBdr/>
-        <w:bidi w:val="0"/>
-        <w:spacing w:lineRule="auto" w:line="273" w:before="0" w:after="120"/>
-        <w:ind w:hanging="360" w:left="465" w:right="0"/>
-        <w:jc w:val="left"/>
-        <w:rPr>
-          <w:rFonts w:ascii="Arial" w:hAnsi="Arial" w:eastAsia="Google Sans" w:cs="Google Sans"/>
-          <w:color w:val="1F1F1F"/>
-        </w:rPr>
-      </w:pPr>
-      <w:r>
-        <w:rPr>
-          <w:rFonts w:eastAsia="Google Sans" w:cs="Google Sans" w:ascii="Arial" w:hAnsi="Arial"/>
-          <w:color w:val="1F1F1F"/>
-        </w:rPr>
-        <w:t>Partnered with the dev team and product stakeholders to facilitate a product migration to a new parent company, including transition of content ecosystem in Hygraph and the user experience for customer data migration</w:t>
-      </w:r>
-    </w:p>
-    <w:p>
-      <w:pPr>
-        <w:pStyle w:val="Normal"/>
-        <w:pBdr/>
-        <w:bidi w:val="0"/>
-        <w:spacing w:lineRule="auto" w:line="273" w:before="240" w:after="120"/>
+        <w:t>Managed optimized blog content driving 80% of total organic traffic and a 92% YoY improvement in conversion rates</w:t>
+      </w:r>
+    </w:p>
+    <w:p>
+      <w:pPr>
+        <w:pStyle w:val="Normal"/>
+        <w:bidi w:val="0"/>
+        <w:spacing w:lineRule="auto" w:line="271" w:before="240" w:after="120"/>
         <w:jc w:val="left"/>
         <w:rPr>
           <w:rFonts w:ascii="Arial" w:hAnsi="Arial"/>
@@ -516,7 +657,7 @@
           <w:bCs/>
           <w:color w:val="1F1F1F"/>
         </w:rPr>
-        <w:t>Independence Pet Group</w:t>
+        <w:t>Ollie</w:t>
       </w:r>
       <w:r>
         <w:rPr>
@@ -532,14 +673,14 @@
           <w:iCs/>
           <w:color w:val="1F1F1F"/>
         </w:rPr>
-        <w:t>Content Strategy Manager</w:t>
-      </w:r>
-      <w:r>
-        <w:rPr>
-          <w:rFonts w:eastAsia="Google Sans" w:cs="Google Sans" w:ascii="Arial" w:hAnsi="Arial"/>
-          <w:color w:val="1F1F1F"/>
-        </w:rPr>
-        <w:t xml:space="preserve"> | </w:t>
+        <w:t xml:space="preserve">Digital Copywriter </w:t>
+      </w:r>
+      <w:r>
+        <w:rPr>
+          <w:rFonts w:eastAsia="Google Sans" w:cs="Google Sans" w:ascii="Arial" w:hAnsi="Arial"/>
+          <w:color w:val="1F1F1F"/>
+        </w:rPr>
+        <w:t xml:space="preserve">| </w:t>
       </w:r>
       <w:r>
         <w:rPr>
@@ -548,7 +689,7 @@
           <w:bCs/>
           <w:color w:val="1F1F1F"/>
         </w:rPr>
-        <w:t>Jun 2023 - Apr 2025</w:t>
+        <w:t>Feb 2023 - Jun 2023</w:t>
       </w:r>
     </w:p>
     <w:p>
@@ -558,9 +699,8 @@
           <w:ilvl w:val="0"/>
           <w:numId w:val="5"/>
         </w:numPr>
-        <w:pBdr/>
-        <w:bidi w:val="0"/>
-        <w:spacing w:lineRule="auto" w:line="273" w:before="0" w:after="0"/>
+        <w:bidi w:val="0"/>
+        <w:spacing w:lineRule="auto" w:line="271" w:before="0" w:after="120"/>
         <w:ind w:hanging="360" w:left="465" w:right="0"/>
         <w:jc w:val="left"/>
         <w:rPr>
@@ -573,7 +713,59 @@
           <w:rFonts w:eastAsia="Google Sans" w:cs="Google Sans" w:ascii="Arial" w:hAnsi="Arial"/>
           <w:color w:val="1F1F1F"/>
         </w:rPr>
-        <w:t>Led a content strategy transformation that aligned dev, design, and content teams to modernize site architecture and production workflows</w:t>
+        <w:t>Email marketing campaigns, paid media (paid social, affiliate marketing, search), landing pages, and other creative copy</w:t>
+      </w:r>
+    </w:p>
+    <w:p>
+      <w:pPr>
+        <w:pStyle w:val="Normal"/>
+        <w:bidi w:val="0"/>
+        <w:spacing w:lineRule="auto" w:line="271" w:before="240" w:after="120"/>
+        <w:jc w:val="left"/>
+        <w:rPr>
+          <w:rFonts w:ascii="Arial" w:hAnsi="Arial"/>
+        </w:rPr>
+      </w:pPr>
+      <w:r>
+        <w:rPr>
+          <w:rFonts w:eastAsia="Google Sans" w:cs="Google Sans" w:ascii="Arial" w:hAnsi="Arial"/>
+          <w:b/>
+          <w:bCs/>
+          <w:color w:val="1F1F1F"/>
+        </w:rPr>
+        <w:t>Pinterest</w:t>
+      </w:r>
+      <w:r>
+        <w:rPr>
+          <w:rFonts w:eastAsia="Google Sans" w:cs="Google Sans" w:ascii="Arial" w:hAnsi="Arial"/>
+          <w:color w:val="1F1F1F"/>
+        </w:rPr>
+        <w:t xml:space="preserve"> | </w:t>
+      </w:r>
+      <w:r>
+        <w:rPr>
+          <w:rFonts w:eastAsia="Google Sans" w:cs="Google Sans" w:ascii="Arial" w:hAnsi="Arial"/>
+          <w:i/>
+          <w:iCs/>
+          <w:color w:val="1F1F1F"/>
+        </w:rPr>
+        <w:t xml:space="preserve">Editorial Content Writer </w:t>
+      </w:r>
+      <w:r>
+        <w:rPr>
+          <w:rFonts w:eastAsia="Google Sans" w:cs="Google Sans" w:ascii="Arial" w:hAnsi="Arial"/>
+          <w:color w:val="1F1F1F"/>
+        </w:rPr>
+        <w:t xml:space="preserve">| </w:t>
+      </w:r>
+      <w:r>
+        <w:rPr>
+          <w:rFonts w:eastAsia="Google Sans" w:cs="Google Sans" w:ascii="Arial" w:hAnsi="Arial"/>
+          <w:b/>
+          <w:bCs/>
+          <w:color w:val="1F1F1F"/>
+        </w:rPr>
+        <w:t>Jun 2022 - Feb 2023</w:t>
       </w:r>
     </w:p>
     <w:p>
@@ -583,9 +775,8 @@
           <w:ilvl w:val="0"/>
           <w:numId w:val="5"/>
         </w:numPr>
-        <w:pBdr/>
-        <w:bidi w:val="0"/>
-        <w:spacing w:lineRule="auto" w:line="273" w:before="0" w:after="0"/>
+        <w:bidi w:val="0"/>
+        <w:spacing w:lineRule="auto" w:line="271" w:before="0" w:after="0"/>
         <w:ind w:hanging="360" w:left="465" w:right="0"/>
         <w:jc w:val="left"/>
         <w:rPr>
@@ -598,7 +789,7 @@
           <w:rFonts w:eastAsia="Google Sans" w:cs="Google Sans" w:ascii="Arial" w:hAnsi="Arial"/>
           <w:color w:val="1F1F1F"/>
         </w:rPr>
-        <w:t>Spearheaded a comprehensive SEO content strategy overhaul for ASPCA Pet Health Insurance, achieving #1 and #2 rankings for competitive, high-intent keywords</w:t>
+        <w:t>Managed daily content for Today's Inspiration and Shopping Spotlight surfaces across a wide range of verticals—approximately 1,500 pieces of content</w:t>
       </w:r>
     </w:p>
     <w:p>
@@ -608,9 +799,8 @@
           <w:ilvl w:val="0"/>
           <w:numId w:val="5"/>
         </w:numPr>
-        <w:pBdr/>
-        <w:bidi w:val="0"/>
-        <w:spacing w:lineRule="auto" w:line="273" w:before="0" w:after="0"/>
+        <w:bidi w:val="0"/>
+        <w:spacing w:lineRule="auto" w:line="271" w:before="0" w:after="0"/>
         <w:ind w:hanging="360" w:left="465" w:right="0"/>
         <w:jc w:val="left"/>
         <w:rPr>
@@ -623,7 +813,7 @@
           <w:rFonts w:eastAsia="Google Sans" w:cs="Google Sans" w:ascii="Arial" w:hAnsi="Arial"/>
           <w:color w:val="1F1F1F"/>
         </w:rPr>
-        <w:t>Collaborated on UX/UI site optimizations that converted organic traffic into revenue, resulting in a 4x growth in organic sales within 6 months</w:t>
+        <w:t>Handled content management, curation, scheduling, and trend identification on and off-platform</w:t>
       </w:r>
     </w:p>
     <w:p>
@@ -633,9 +823,8 @@
           <w:ilvl w:val="0"/>
           <w:numId w:val="5"/>
         </w:numPr>
-        <w:pBdr/>
-        <w:bidi w:val="0"/>
-        <w:spacing w:lineRule="auto" w:line="273" w:before="0" w:after="120"/>
+        <w:bidi w:val="0"/>
+        <w:spacing w:lineRule="auto" w:line="271" w:before="0" w:after="0"/>
         <w:ind w:hanging="360" w:left="465" w:right="0"/>
         <w:jc w:val="left"/>
         <w:rPr>
@@ -648,59 +837,48 @@
           <w:rFonts w:eastAsia="Google Sans" w:cs="Google Sans" w:ascii="Arial" w:hAnsi="Arial"/>
           <w:color w:val="1F1F1F"/>
         </w:rPr>
-        <w:t>Managed optimized blog content driving 80% of total organic traffic and a 92% YoY improvement in conversion rates</w:t>
-      </w:r>
-    </w:p>
-    <w:p>
-      <w:pPr>
-        <w:pStyle w:val="Normal"/>
-        <w:bidi w:val="0"/>
-        <w:spacing w:lineRule="auto" w:line="273" w:before="240" w:after="120"/>
+        <w:t>Drafted engaging copy for email marketing, landing pages, and paid media including social, affiliate, and search</w:t>
+      </w:r>
+    </w:p>
+    <w:p>
+      <w:pPr>
+        <w:pStyle w:val="Normal"/>
+        <w:numPr>
+          <w:ilvl w:val="0"/>
+          <w:numId w:val="5"/>
+        </w:numPr>
+        <w:bidi w:val="0"/>
+        <w:spacing w:lineRule="auto" w:line="271" w:before="0" w:after="120"/>
+        <w:ind w:hanging="360" w:left="465" w:right="0"/>
         <w:jc w:val="left"/>
         <w:rPr>
-          <w:rFonts w:ascii="Arial" w:hAnsi="Arial"/>
-        </w:rPr>
-      </w:pPr>
-      <w:r>
-        <w:rPr>
-          <w:rFonts w:eastAsia="Google Sans" w:cs="Google Sans" w:ascii="Arial" w:hAnsi="Arial"/>
-          <w:b/>
-          <w:bCs/>
-          <w:color w:val="1F1F1F"/>
-        </w:rPr>
-        <w:t>Ollie</w:t>
-      </w:r>
-      <w:r>
-        <w:rPr>
-          <w:rFonts w:eastAsia="Google Sans" w:cs="Google Sans" w:ascii="Arial" w:hAnsi="Arial"/>
-          <w:color w:val="1F1F1F"/>
-        </w:rPr>
-        <w:t xml:space="preserve"> | </w:t>
-      </w:r>
-      <w:r>
-        <w:rPr>
-          <w:rFonts w:eastAsia="Google Sans" w:cs="Google Sans" w:ascii="Arial" w:hAnsi="Arial"/>
-          <w:i/>
-          <w:iCs/>
-          <w:color w:val="1F1F1F"/>
-        </w:rPr>
-        <w:t xml:space="preserve">Digital Copywriter </w:t>
-      </w:r>
-      <w:r>
-        <w:rPr>
-          <w:rFonts w:eastAsia="Google Sans" w:cs="Google Sans" w:ascii="Arial" w:hAnsi="Arial"/>
-          <w:color w:val="1F1F1F"/>
-        </w:rPr>
-        <w:t xml:space="preserve">| </w:t>
-      </w:r>
-      <w:r>
-        <w:rPr>
-          <w:rFonts w:eastAsia="Google Sans" w:cs="Google Sans" w:ascii="Arial" w:hAnsi="Arial"/>
-          <w:b/>
-          <w:bCs/>
-          <w:color w:val="1F1F1F"/>
-        </w:rPr>
-        <w:t>Feb 2023 - Jun 2023</w:t>
+          <w:rFonts w:ascii="Arial" w:hAnsi="Arial" w:eastAsia="Google Sans" w:cs="Google Sans"/>
+          <w:color w:val="1F1F1F"/>
+        </w:rPr>
+      </w:pPr>
+      <w:r>
+        <w:rPr>
+          <w:rFonts w:eastAsia="Google Sans" w:cs="Google Sans" w:ascii="Arial" w:hAnsi="Arial"/>
+          <w:color w:val="1F1F1F"/>
+        </w:rPr>
+        <w:t>Assisted on cross-functional projects for paid social campaigns and creator teams, including music curation and features for Vogue and Allure</w:t>
+      </w:r>
+    </w:p>
+    <w:p>
+      <w:pPr>
+        <w:pStyle w:val="Heading3"/>
+        <w:spacing w:lineRule="auto" w:line="271" w:before="240" w:after="120"/>
+        <w:rPr>
+          <w:rFonts w:ascii="Arial" w:hAnsi="Arial" w:eastAsia="Google Sans" w:cs="Google Sans"/>
+          <w:color w:val="1F1F1F"/>
+        </w:rPr>
+      </w:pPr>
+      <w:r>
+        <w:rPr>
+          <w:rFonts w:eastAsia="Google Sans" w:cs="Google Sans" w:ascii="Arial" w:hAnsi="Arial"/>
+          <w:color w:val="1F1F1F"/>
+        </w:rPr>
+        <w:t>Education &amp; Certifications</w:t>
       </w:r>
     </w:p>
     <w:p>
@@ -711,7 +889,7 @@
           <w:numId w:val="6"/>
         </w:numPr>
         <w:bidi w:val="0"/>
-        <w:spacing w:lineRule="auto" w:line="273" w:before="0" w:after="120"/>
+        <w:spacing w:lineRule="auto" w:line="271" w:before="0" w:after="0"/>
         <w:ind w:hanging="360" w:left="465" w:right="0"/>
         <w:jc w:val="left"/>
         <w:rPr>
@@ -724,60 +902,7 @@
           <w:rFonts w:eastAsia="Google Sans" w:cs="Google Sans" w:ascii="Arial" w:hAnsi="Arial"/>
           <w:color w:val="1F1F1F"/>
         </w:rPr>
-        <w:t>Email marketing campaigns, paid media (paid social, affiliate marketing, search), landing pages, and other creative copy</w:t>
-      </w:r>
-    </w:p>
-    <w:p>
-      <w:pPr>
-        <w:pStyle w:val="Normal"/>
-        <w:pBdr/>
-        <w:bidi w:val="0"/>
-        <w:spacing w:lineRule="auto" w:line="273" w:before="240" w:after="120"/>
-        <w:jc w:val="left"/>
-        <w:rPr>
-          <w:rFonts w:ascii="Arial" w:hAnsi="Arial"/>
-        </w:rPr>
-      </w:pPr>
-      <w:r>
-        <w:rPr>
-          <w:rFonts w:eastAsia="Google Sans" w:cs="Google Sans" w:ascii="Arial" w:hAnsi="Arial"/>
-          <w:b/>
-          <w:bCs/>
-          <w:color w:val="1F1F1F"/>
-        </w:rPr>
-        <w:t>Pinterest</w:t>
-      </w:r>
-      <w:r>
-        <w:rPr>
-          <w:rFonts w:eastAsia="Google Sans" w:cs="Google Sans" w:ascii="Arial" w:hAnsi="Arial"/>
-          <w:color w:val="1F1F1F"/>
-        </w:rPr>
-        <w:t xml:space="preserve"> | </w:t>
-      </w:r>
-      <w:r>
-        <w:rPr>
-          <w:rFonts w:eastAsia="Google Sans" w:cs="Google Sans" w:ascii="Arial" w:hAnsi="Arial"/>
-          <w:i/>
-          <w:iCs/>
-          <w:color w:val="1F1F1F"/>
-        </w:rPr>
-        <w:t xml:space="preserve">Editorial Content Writer </w:t>
-      </w:r>
-      <w:r>
-        <w:rPr>
-          <w:rFonts w:eastAsia="Google Sans" w:cs="Google Sans" w:ascii="Arial" w:hAnsi="Arial"/>
-          <w:color w:val="1F1F1F"/>
-        </w:rPr>
-        <w:t xml:space="preserve">| </w:t>
-      </w:r>
-      <w:r>
-        <w:rPr>
-          <w:rFonts w:eastAsia="Google Sans" w:cs="Google Sans" w:ascii="Arial" w:hAnsi="Arial"/>
-          <w:b/>
-          <w:bCs/>
-          <w:color w:val="1F1F1F"/>
-        </w:rPr>
-        <w:t>Jun 2022 - Feb 2023</w:t>
+        <w:t>Google UX Design Professional Certificate</w:t>
       </w:r>
     </w:p>
     <w:p>
@@ -787,9 +912,8 @@
           <w:ilvl w:val="0"/>
           <w:numId w:val="6"/>
         </w:numPr>
-        <w:pBdr/>
-        <w:bidi w:val="0"/>
-        <w:spacing w:lineRule="auto" w:line="273" w:before="0" w:after="0"/>
+        <w:bidi w:val="0"/>
+        <w:spacing w:lineRule="auto" w:line="271" w:before="0" w:after="0"/>
         <w:ind w:hanging="360" w:left="465" w:right="0"/>
         <w:jc w:val="left"/>
         <w:rPr>
@@ -802,7 +926,7 @@
           <w:rFonts w:eastAsia="Google Sans" w:cs="Google Sans" w:ascii="Arial" w:hAnsi="Arial"/>
           <w:color w:val="1F1F1F"/>
         </w:rPr>
-        <w:t>Managed daily content for Today's Inspiration and Shopping Spotlight surfaces across a wide range of verticals—approximately 1,500 pieces of content</w:t>
+        <w:t>W3Schools Certified Accessibility Practitioner</w:t>
       </w:r>
     </w:p>
     <w:p>
@@ -812,9 +936,8 @@
           <w:ilvl w:val="0"/>
           <w:numId w:val="6"/>
         </w:numPr>
-        <w:pBdr/>
-        <w:bidi w:val="0"/>
-        <w:spacing w:lineRule="auto" w:line="273" w:before="0" w:after="0"/>
+        <w:bidi w:val="0"/>
+        <w:spacing w:lineRule="auto" w:line="271" w:before="0" w:after="120"/>
         <w:ind w:hanging="360" w:left="465" w:right="0"/>
         <w:jc w:val="left"/>
         <w:rPr>
@@ -827,158 +950,14 @@
           <w:rFonts w:eastAsia="Google Sans" w:cs="Google Sans" w:ascii="Arial" w:hAnsi="Arial"/>
           <w:color w:val="1F1F1F"/>
         </w:rPr>
-        <w:t>Handled content management, curation, scheduling, and trend identification on and off-platform</w:t>
-      </w:r>
-    </w:p>
-    <w:p>
-      <w:pPr>
-        <w:pStyle w:val="Normal"/>
-        <w:numPr>
-          <w:ilvl w:val="0"/>
-          <w:numId w:val="6"/>
-        </w:numPr>
-        <w:pBdr/>
-        <w:bidi w:val="0"/>
-        <w:spacing w:lineRule="auto" w:line="273" w:before="0" w:after="0"/>
-        <w:ind w:hanging="360" w:left="465" w:right="0"/>
-        <w:jc w:val="left"/>
-        <w:rPr>
-          <w:rFonts w:ascii="Arial" w:hAnsi="Arial" w:eastAsia="Google Sans" w:cs="Google Sans"/>
-          <w:color w:val="1F1F1F"/>
-        </w:rPr>
-      </w:pPr>
-      <w:r>
-        <w:rPr>
-          <w:rFonts w:eastAsia="Google Sans" w:cs="Google Sans" w:ascii="Arial" w:hAnsi="Arial"/>
-          <w:color w:val="1F1F1F"/>
-        </w:rPr>
-        <w:t>Drafted engaging copy for email marketing, landing pages, and paid media including social, affiliate, and search</w:t>
-      </w:r>
-    </w:p>
-    <w:p>
-      <w:pPr>
-        <w:pStyle w:val="Normal"/>
-        <w:numPr>
-          <w:ilvl w:val="0"/>
-          <w:numId w:val="6"/>
-        </w:numPr>
-        <w:pBdr/>
-        <w:bidi w:val="0"/>
-        <w:spacing w:lineRule="auto" w:line="273" w:before="0" w:after="120"/>
-        <w:ind w:hanging="360" w:left="465" w:right="0"/>
-        <w:jc w:val="left"/>
-        <w:rPr>
-          <w:rFonts w:ascii="Arial" w:hAnsi="Arial" w:eastAsia="Google Sans" w:cs="Google Sans"/>
-          <w:color w:val="1F1F1F"/>
-        </w:rPr>
-      </w:pPr>
-      <w:r>
-        <w:rPr>
-          <w:rFonts w:eastAsia="Google Sans" w:cs="Google Sans" w:ascii="Arial" w:hAnsi="Arial"/>
-          <w:color w:val="1F1F1F"/>
-        </w:rPr>
-        <w:t>Assisted on cross-functional projects for paid social campaigns and creator teams, including music curation and features for Vogue and Allure</w:t>
-      </w:r>
-    </w:p>
-    <w:p>
-      <w:pPr>
-        <w:pStyle w:val="Heading3"/>
-        <w:pBdr/>
-        <w:spacing w:lineRule="auto" w:line="273" w:before="240" w:after="120"/>
-        <w:rPr>
-          <w:rFonts w:ascii="Arial" w:hAnsi="Arial" w:eastAsia="Google Sans" w:cs="Google Sans"/>
-          <w:color w:val="1F1F1F"/>
-        </w:rPr>
-      </w:pPr>
-      <w:r>
-        <w:rPr>
-          <w:rFonts w:eastAsia="Google Sans" w:cs="Google Sans" w:ascii="Arial" w:hAnsi="Arial"/>
-          <w:color w:val="1F1F1F"/>
-        </w:rPr>
-        <w:t>Education &amp; Certifications</w:t>
-      </w:r>
-    </w:p>
-    <w:p>
-      <w:pPr>
-        <w:pStyle w:val="Normal"/>
-        <w:numPr>
-          <w:ilvl w:val="0"/>
-          <w:numId w:val="7"/>
-        </w:numPr>
-        <w:pBdr/>
-        <w:bidi w:val="0"/>
-        <w:spacing w:lineRule="auto" w:line="273" w:before="0" w:after="0"/>
-        <w:ind w:hanging="360" w:left="465" w:right="0"/>
-        <w:jc w:val="left"/>
-        <w:rPr>
-          <w:rFonts w:ascii="Arial" w:hAnsi="Arial" w:eastAsia="Google Sans" w:cs="Google Sans"/>
-          <w:color w:val="1F1F1F"/>
-        </w:rPr>
-      </w:pPr>
-      <w:r>
-        <w:rPr>
-          <w:rFonts w:eastAsia="Google Sans" w:cs="Google Sans" w:ascii="Arial" w:hAnsi="Arial"/>
-          <w:color w:val="1F1F1F"/>
-        </w:rPr>
-        <w:t>Google UX Design Professional Certificate</w:t>
-      </w:r>
-    </w:p>
-    <w:p>
-      <w:pPr>
-        <w:pStyle w:val="Normal"/>
-        <w:numPr>
-          <w:ilvl w:val="0"/>
-          <w:numId w:val="7"/>
-        </w:numPr>
-        <w:pBdr/>
-        <w:bidi w:val="0"/>
-        <w:spacing w:lineRule="auto" w:line="273" w:before="0" w:after="0"/>
-        <w:ind w:hanging="360" w:left="465" w:right="0"/>
-        <w:jc w:val="left"/>
-        <w:rPr>
-          <w:rFonts w:ascii="Arial" w:hAnsi="Arial" w:eastAsia="Google Sans" w:cs="Google Sans"/>
-          <w:color w:val="1F1F1F"/>
-        </w:rPr>
-      </w:pPr>
-      <w:r>
-        <w:rPr>
-          <w:rFonts w:eastAsia="Google Sans" w:cs="Google Sans" w:ascii="Arial" w:hAnsi="Arial"/>
-          <w:color w:val="1F1F1F"/>
-        </w:rPr>
-        <w:t>W3Schools Certified Accessibility Practitioner</w:t>
-      </w:r>
-    </w:p>
-    <w:p>
-      <w:pPr>
-        <w:pStyle w:val="Normal"/>
-        <w:numPr>
-          <w:ilvl w:val="0"/>
-          <w:numId w:val="7"/>
-        </w:numPr>
-        <w:pBdr/>
-        <w:bidi w:val="0"/>
-        <w:spacing w:lineRule="auto" w:line="273" w:before="0" w:after="120"/>
-        <w:ind w:hanging="360" w:left="465" w:right="0"/>
-        <w:jc w:val="left"/>
-        <w:rPr>
-          <w:rFonts w:ascii="Arial" w:hAnsi="Arial" w:eastAsia="Google Sans" w:cs="Google Sans"/>
-          <w:color w:val="1F1F1F"/>
-        </w:rPr>
-      </w:pPr>
-      <w:r>
-        <w:rPr>
-          <w:rFonts w:eastAsia="Google Sans" w:cs="Google Sans" w:ascii="Arial" w:hAnsi="Arial"/>
-          <w:color w:val="1F1F1F"/>
-        </w:rPr>
         <w:t>HubSpot Academy: SEO I, SEO II, Content Marketing, and Inbound Marketing</w:t>
       </w:r>
     </w:p>
     <w:p>
       <w:pPr>
         <w:pStyle w:val="Normal"/>
-        <w:pBdr/>
-        <w:bidi w:val="0"/>
-        <w:spacing w:lineRule="auto" w:line="273" w:before="240" w:after="120"/>
+        <w:bidi w:val="0"/>
+        <w:spacing w:lineRule="auto" w:line="271" w:before="240" w:after="120"/>
         <w:jc w:val="left"/>
         <w:rPr>
           <w:rFonts w:ascii="Arial" w:hAnsi="Arial" w:eastAsia="Google Sans" w:cs="Google Sans"/>
@@ -1002,11 +981,10 @@
         <w:pStyle w:val="Normal"/>
         <w:numPr>
           <w:ilvl w:val="0"/>
-          <w:numId w:val="2"/>
+          <w:numId w:val="1"/>
         </w:numPr>
-        <w:pBdr/>
-        <w:bidi w:val="0"/>
-        <w:spacing w:lineRule="auto" w:line="273" w:before="0" w:after="0"/>
+        <w:bidi w:val="0"/>
+        <w:spacing w:lineRule="auto" w:line="271" w:before="0" w:after="0"/>
         <w:ind w:hanging="360" w:left="465" w:right="0"/>
         <w:jc w:val="left"/>
         <w:rPr>
@@ -1027,11 +1005,10 @@
         <w:pStyle w:val="Normal"/>
         <w:numPr>
           <w:ilvl w:val="0"/>
-          <w:numId w:val="2"/>
+          <w:numId w:val="1"/>
         </w:numPr>
-        <w:pBdr/>
-        <w:bidi w:val="0"/>
-        <w:spacing w:lineRule="auto" w:line="273" w:before="0" w:after="0"/>
+        <w:bidi w:val="0"/>
+        <w:spacing w:lineRule="auto" w:line="271" w:before="0" w:after="0"/>
         <w:ind w:hanging="360" w:left="465" w:right="0"/>
         <w:jc w:val="left"/>
         <w:rPr>
@@ -1052,11 +1029,10 @@
         <w:pStyle w:val="Normal"/>
         <w:numPr>
           <w:ilvl w:val="0"/>
-          <w:numId w:val="2"/>
+          <w:numId w:val="1"/>
         </w:numPr>
-        <w:pBdr/>
-        <w:bidi w:val="0"/>
-        <w:spacing w:lineRule="auto" w:line="273" w:before="0" w:after="0"/>
+        <w:bidi w:val="0"/>
+        <w:spacing w:lineRule="auto" w:line="271" w:before="0" w:after="0"/>
         <w:ind w:hanging="360" w:left="465" w:right="0"/>
         <w:jc w:val="left"/>
         <w:rPr>
@@ -1077,11 +1053,10 @@
         <w:pStyle w:val="Normal"/>
         <w:numPr>
           <w:ilvl w:val="0"/>
-          <w:numId w:val="2"/>
+          <w:numId w:val="1"/>
         </w:numPr>
-        <w:pBdr/>
-        <w:bidi w:val="0"/>
-        <w:spacing w:lineRule="auto" w:line="273" w:before="0" w:after="120"/>
+        <w:bidi w:val="0"/>
+        <w:spacing w:lineRule="auto" w:line="271" w:before="0" w:after="120"/>
         <w:ind w:hanging="360" w:left="465" w:right="0"/>
         <w:jc w:val="left"/>
         <w:rPr>
@@ -1115,120 +1090,273 @@
   <w:abstractNum w:abstractNumId="1">
     <w:lvl w:ilvl="0">
       <w:start w:val="1"/>
-      <w:numFmt w:val="none"/>
-      <w:suff w:val="nothing"/>
-      <w:lvlText w:val="%1"/>
-      <w:lvlJc w:val="left"/>
-      <w:pPr>
-        <w:tabs>
-          <w:tab w:val="num" w:pos="0"/>
-        </w:tabs>
-        <w:ind w:left="0" w:hanging="0"/>
-      </w:pPr>
+      <w:numFmt w:val="bullet"/>
+      <w:lvlText w:val="●"/>
+      <w:lvlJc w:val="left"/>
+      <w:pPr>
+        <w:tabs>
+          <w:tab w:val="num" w:pos="0"/>
+        </w:tabs>
+        <w:ind w:left="465" w:hanging="360"/>
+      </w:pPr>
+      <w:rPr>
+        <w:rFonts w:ascii="Arial" w:hAnsi="Arial" w:cs="Arial" w:hint="default"/>
+        <w:smallCaps w:val="false"/>
+        <w:caps w:val="false"/>
+        <w:dstrike w:val="false"/>
+        <w:strike w:val="false"/>
+        <w:vertAlign w:val="baseline"/>
+        <w:position w:val="0"/>
+        <w:sz w:val="22"/>
+        <w:sz w:val="22"/>
+        <w:i w:val="false"/>
+        <w:u w:val="none"/>
+        <w:b w:val="false"/>
+        <w:szCs w:val="22"/>
+        <w:iCs w:val="false"/>
+        <w:bCs w:val="false"/>
+        <w:color w:val="000000"/>
+      </w:rPr>
     </w:lvl>
     <w:lvl w:ilvl="1">
       <w:start w:val="1"/>
-      <w:numFmt w:val="none"/>
-      <w:suff w:val="nothing"/>
-      <w:lvlText w:val="%2"/>
-      <w:lvlJc w:val="left"/>
-      <w:pPr>
-        <w:tabs>
-          <w:tab w:val="num" w:pos="0"/>
-        </w:tabs>
-        <w:ind w:left="0" w:hanging="0"/>
-      </w:pPr>
+      <w:numFmt w:val="bullet"/>
+      <w:lvlText w:val="○"/>
+      <w:lvlJc w:val="left"/>
+      <w:pPr>
+        <w:tabs>
+          <w:tab w:val="num" w:pos="0"/>
+        </w:tabs>
+        <w:ind w:left="1440" w:hanging="360"/>
+      </w:pPr>
+      <w:rPr>
+        <w:rFonts w:ascii="Arial" w:hAnsi="Arial" w:cs="Arial" w:hint="default"/>
+        <w:smallCaps w:val="false"/>
+        <w:caps w:val="false"/>
+        <w:dstrike w:val="false"/>
+        <w:strike w:val="false"/>
+        <w:vertAlign w:val="baseline"/>
+        <w:position w:val="0"/>
+        <w:sz w:val="22"/>
+        <w:sz w:val="22"/>
+        <w:i w:val="false"/>
+        <w:u w:val="none"/>
+        <w:b w:val="false"/>
+        <w:szCs w:val="22"/>
+        <w:iCs w:val="false"/>
+        <w:bCs w:val="false"/>
+        <w:color w:val="000000"/>
+      </w:rPr>
     </w:lvl>
     <w:lvl w:ilvl="2">
       <w:start w:val="1"/>
-      <w:numFmt w:val="none"/>
-      <w:suff w:val="nothing"/>
-      <w:lvlText w:val="%3"/>
-      <w:lvlJc w:val="left"/>
-      <w:pPr>
-        <w:tabs>
-          <w:tab w:val="num" w:pos="0"/>
-        </w:tabs>
-        <w:ind w:left="0" w:hanging="0"/>
-      </w:pPr>
+      <w:numFmt w:val="bullet"/>
+      <w:lvlText w:val="■"/>
+      <w:lvlJc w:val="left"/>
+      <w:pPr>
+        <w:tabs>
+          <w:tab w:val="num" w:pos="0"/>
+        </w:tabs>
+        <w:ind w:left="2160" w:hanging="360"/>
+      </w:pPr>
+      <w:rPr>
+        <w:rFonts w:ascii="Arial" w:hAnsi="Arial" w:cs="Arial" w:hint="default"/>
+        <w:smallCaps w:val="false"/>
+        <w:caps w:val="false"/>
+        <w:dstrike w:val="false"/>
+        <w:strike w:val="false"/>
+        <w:vertAlign w:val="baseline"/>
+        <w:position w:val="0"/>
+        <w:sz w:val="22"/>
+        <w:sz w:val="22"/>
+        <w:i w:val="false"/>
+        <w:u w:val="none"/>
+        <w:b w:val="false"/>
+        <w:szCs w:val="22"/>
+        <w:iCs w:val="false"/>
+        <w:bCs w:val="false"/>
+        <w:color w:val="000000"/>
+      </w:rPr>
     </w:lvl>
     <w:lvl w:ilvl="3">
       <w:start w:val="1"/>
-      <w:numFmt w:val="none"/>
-      <w:suff w:val="nothing"/>
-      <w:lvlText w:val="%4"/>
-      <w:lvlJc w:val="left"/>
-      <w:pPr>
-        <w:tabs>
-          <w:tab w:val="num" w:pos="0"/>
-        </w:tabs>
-        <w:ind w:left="0" w:hanging="0"/>
-      </w:pPr>
+      <w:numFmt w:val="bullet"/>
+      <w:lvlText w:val="■"/>
+      <w:lvlJc w:val="left"/>
+      <w:pPr>
+        <w:tabs>
+          <w:tab w:val="num" w:pos="0"/>
+        </w:tabs>
+        <w:ind w:left="2880" w:hanging="360"/>
+      </w:pPr>
+      <w:rPr>
+        <w:rFonts w:ascii="Arial" w:hAnsi="Arial" w:cs="Arial" w:hint="default"/>
+        <w:smallCaps w:val="false"/>
+        <w:caps w:val="false"/>
+        <w:dstrike w:val="false"/>
+        <w:strike w:val="false"/>
+        <w:vertAlign w:val="baseline"/>
+        <w:position w:val="0"/>
+        <w:sz w:val="22"/>
+        <w:sz w:val="22"/>
+        <w:i w:val="false"/>
+        <w:u w:val="none"/>
+        <w:b w:val="false"/>
+        <w:szCs w:val="22"/>
+        <w:iCs w:val="false"/>
+        <w:bCs w:val="false"/>
+        <w:color w:val="000000"/>
+      </w:rPr>
     </w:lvl>
     <w:lvl w:ilvl="4">
       <w:start w:val="1"/>
-      <w:numFmt w:val="none"/>
-      <w:suff w:val="nothing"/>
-      <w:lvlText w:val="%5"/>
-      <w:lvlJc w:val="left"/>
-      <w:pPr>
-        <w:tabs>
-          <w:tab w:val="num" w:pos="0"/>
-        </w:tabs>
-        <w:ind w:left="0" w:hanging="0"/>
-      </w:pPr>
+      <w:numFmt w:val="bullet"/>
+      <w:lvlText w:val="■"/>
+      <w:lvlJc w:val="left"/>
+      <w:pPr>
+        <w:tabs>
+          <w:tab w:val="num" w:pos="0"/>
+        </w:tabs>
+        <w:ind w:left="3600" w:hanging="360"/>
+      </w:pPr>
+      <w:rPr>
+        <w:rFonts w:ascii="Arial" w:hAnsi="Arial" w:cs="Arial" w:hint="default"/>
+        <w:smallCaps w:val="false"/>
+        <w:caps w:val="false"/>
+        <w:dstrike w:val="false"/>
+        <w:strike w:val="false"/>
+        <w:vertAlign w:val="baseline"/>
+        <w:position w:val="0"/>
+        <w:sz w:val="22"/>
+        <w:sz w:val="22"/>
+        <w:i w:val="false"/>
+        <w:u w:val="none"/>
+        <w:b w:val="false"/>
+        <w:szCs w:val="22"/>
+        <w:iCs w:val="false"/>
+        <w:bCs w:val="false"/>
+        <w:color w:val="000000"/>
+      </w:rPr>
     </w:lvl>
     <w:lvl w:ilvl="5">
       <w:start w:val="1"/>
-      <w:numFmt w:val="none"/>
-      <w:suff w:val="nothing"/>
-      <w:lvlText w:val="%6"/>
-      <w:lvlJc w:val="left"/>
-      <w:pPr>
-        <w:tabs>
-          <w:tab w:val="num" w:pos="0"/>
-        </w:tabs>
-        <w:ind w:left="0" w:hanging="0"/>
-      </w:pPr>
+      <w:numFmt w:val="bullet"/>
+      <w:lvlText w:val="■"/>
+      <w:lvlJc w:val="left"/>
+      <w:pPr>
+        <w:tabs>
+          <w:tab w:val="num" w:pos="0"/>
+        </w:tabs>
+        <w:ind w:left="4320" w:hanging="360"/>
+      </w:pPr>
+      <w:rPr>
+        <w:rFonts w:ascii="Arial" w:hAnsi="Arial" w:cs="Arial" w:hint="default"/>
+        <w:smallCaps w:val="false"/>
+        <w:caps w:val="false"/>
+        <w:dstrike w:val="false"/>
+        <w:strike w:val="false"/>
+        <w:vertAlign w:val="baseline"/>
+        <w:position w:val="0"/>
+        <w:sz w:val="22"/>
+        <w:sz w:val="22"/>
+        <w:i w:val="false"/>
+        <w:u w:val="none"/>
+        <w:b w:val="false"/>
+        <w:szCs w:val="22"/>
+        <w:iCs w:val="false"/>
+        <w:bCs w:val="false"/>
+        <w:color w:val="000000"/>
+      </w:rPr>
     </w:lvl>
     <w:lvl w:ilvl="6">
       <w:start w:val="1"/>
-      <w:numFmt w:val="none"/>
-      <w:suff w:val="nothing"/>
-      <w:lvlText w:val="%7"/>
-      <w:lvlJc w:val="left"/>
-      <w:pPr>
-        <w:tabs>
-          <w:tab w:val="num" w:pos="0"/>
-        </w:tabs>
-        <w:ind w:left="0" w:hanging="0"/>
-      </w:pPr>
+      <w:numFmt w:val="bullet"/>
+      <w:lvlText w:val="■"/>
+      <w:lvlJc w:val="left"/>
+      <w:pPr>
+        <w:tabs>
+          <w:tab w:val="num" w:pos="0"/>
+        </w:tabs>
+        <w:ind w:left="5040" w:hanging="360"/>
+      </w:pPr>
+      <w:rPr>
+        <w:rFonts w:ascii="Arial" w:hAnsi="Arial" w:cs="Arial" w:hint="default"/>
+        <w:smallCaps w:val="false"/>
+        <w:caps w:val="false"/>
+        <w:dstrike w:val="false"/>
+        <w:strike w:val="false"/>
+        <w:vertAlign w:val="baseline"/>
+        <w:position w:val="0"/>
+        <w:sz w:val="22"/>
+        <w:sz w:val="22"/>
+        <w:i w:val="false"/>
+        <w:u w:val="none"/>
+        <w:b w:val="false"/>
+        <w:szCs w:val="22"/>
+        <w:iCs w:val="false"/>
+        <w:bCs w:val="false"/>
+        <w:color w:val="000000"/>
+      </w:rPr>
     </w:lvl>
     <w:lvl w:ilvl="7">
       <w:start w:val="1"/>
-      <w:numFmt w:val="none"/>
-      <w:suff w:val="nothing"/>
-      <w:lvlText w:val="%8"/>
-      <w:lvlJc w:val="left"/>
-      <w:pPr>
-        <w:tabs>
-          <w:tab w:val="num" w:pos="0"/>
-        </w:tabs>
-        <w:ind w:left="0" w:hanging="0"/>
-      </w:pPr>
+      <w:numFmt w:val="bullet"/>
+      <w:lvlText w:val="■"/>
+      <w:lvlJc w:val="left"/>
+      <w:pPr>
+        <w:tabs>
+          <w:tab w:val="num" w:pos="0"/>
+        </w:tabs>
+        <w:ind w:left="5760" w:hanging="360"/>
+      </w:pPr>
+      <w:rPr>
+        <w:rFonts w:ascii="Arial" w:hAnsi="Arial" w:cs="Arial" w:hint="default"/>
+        <w:smallCaps w:val="false"/>
+        <w:caps w:val="false"/>
+        <w:dstrike w:val="false"/>
+        <w:strike w:val="false"/>
+        <w:vertAlign w:val="baseline"/>
+        <w:position w:val="0"/>
+        <w:sz w:val="22"/>
+        <w:sz w:val="22"/>
+        <w:i w:val="false"/>
+        <w:u w:val="none"/>
+        <w:b w:val="false"/>
+        <w:szCs w:val="22"/>
+        <w:iCs w:val="false"/>
+        <w:bCs w:val="false"/>
+        <w:color w:val="000000"/>
+      </w:rPr>
     </w:lvl>
     <w:lvl w:ilvl="8">
       <w:start w:val="1"/>
-      <w:numFmt w:val="none"/>
-      <w:suff w:val="nothing"/>
-      <w:lvlText w:val="%9"/>
-      <w:lvlJc w:val="left"/>
-      <w:pPr>
-        <w:tabs>
-          <w:tab w:val="num" w:pos="0"/>
-        </w:tabs>
-        <w:ind w:left="0" w:hanging="0"/>
-      </w:pPr>
+      <w:numFmt w:val="bullet"/>
+      <w:lvlText w:val="■"/>
+      <w:lvlJc w:val="left"/>
+      <w:pPr>
+        <w:tabs>
+          <w:tab w:val="num" w:pos="0"/>
+        </w:tabs>
+        <w:ind w:left="6480" w:hanging="360"/>
+      </w:pPr>
+      <w:rPr>
+        <w:rFonts w:ascii="Arial" w:hAnsi="Arial" w:cs="Arial" w:hint="default"/>
+        <w:smallCaps w:val="false"/>
+        <w:caps w:val="false"/>
+        <w:dstrike w:val="false"/>
+        <w:strike w:val="false"/>
+        <w:vertAlign w:val="baseline"/>
+        <w:position w:val="0"/>
+        <w:sz w:val="22"/>
+        <w:sz w:val="22"/>
+        <w:i w:val="false"/>
+        <w:u w:val="none"/>
+        <w:b w:val="false"/>
+        <w:szCs w:val="22"/>
+        <w:iCs w:val="false"/>
+        <w:bCs w:val="false"/>
+        <w:color w:val="000000"/>
+      </w:rPr>
     </w:lvl>
   </w:abstractNum>
   <w:abstractNum w:abstractNumId="2">
@@ -2594,273 +2722,120 @@
   <w:abstractNum w:abstractNumId="7">
     <w:lvl w:ilvl="0">
       <w:start w:val="1"/>
-      <w:numFmt w:val="bullet"/>
-      <w:lvlText w:val="●"/>
-      <w:lvlJc w:val="left"/>
-      <w:pPr>
-        <w:tabs>
-          <w:tab w:val="num" w:pos="0"/>
-        </w:tabs>
-        <w:ind w:left="465" w:hanging="360"/>
-      </w:pPr>
-      <w:rPr>
-        <w:rFonts w:ascii="Arial" w:hAnsi="Arial" w:cs="Arial" w:hint="default"/>
-        <w:smallCaps w:val="false"/>
-        <w:caps w:val="false"/>
-        <w:dstrike w:val="false"/>
-        <w:strike w:val="false"/>
-        <w:vertAlign w:val="baseline"/>
-        <w:position w:val="0"/>
-        <w:sz w:val="22"/>
-        <w:sz w:val="22"/>
-        <w:i w:val="false"/>
-        <w:u w:val="none"/>
-        <w:b w:val="false"/>
-        <w:szCs w:val="22"/>
-        <w:iCs w:val="false"/>
-        <w:bCs w:val="false"/>
-        <w:color w:val="000000"/>
-      </w:rPr>
+      <w:numFmt w:val="none"/>
+      <w:suff w:val="nothing"/>
+      <w:lvlText w:val=""/>
+      <w:lvlJc w:val="left"/>
+      <w:pPr>
+        <w:tabs>
+          <w:tab w:val="num" w:pos="0"/>
+        </w:tabs>
+        <w:ind w:left="0" w:hanging="0"/>
+      </w:pPr>
     </w:lvl>
     <w:lvl w:ilvl="1">
       <w:start w:val="1"/>
-      <w:numFmt w:val="bullet"/>
-      <w:lvlText w:val="○"/>
-      <w:lvlJc w:val="left"/>
-      <w:pPr>
-        <w:tabs>
-          <w:tab w:val="num" w:pos="0"/>
-        </w:tabs>
-        <w:ind w:left="1440" w:hanging="360"/>
-      </w:pPr>
-      <w:rPr>
-        <w:rFonts w:ascii="Arial" w:hAnsi="Arial" w:cs="Arial" w:hint="default"/>
-        <w:smallCaps w:val="false"/>
-        <w:caps w:val="false"/>
-        <w:dstrike w:val="false"/>
-        <w:strike w:val="false"/>
-        <w:vertAlign w:val="baseline"/>
-        <w:position w:val="0"/>
-        <w:sz w:val="22"/>
-        <w:sz w:val="22"/>
-        <w:i w:val="false"/>
-        <w:u w:val="none"/>
-        <w:b w:val="false"/>
-        <w:szCs w:val="22"/>
-        <w:iCs w:val="false"/>
-        <w:bCs w:val="false"/>
-        <w:color w:val="000000"/>
-      </w:rPr>
+      <w:numFmt w:val="none"/>
+      <w:suff w:val="nothing"/>
+      <w:lvlText w:val=""/>
+      <w:lvlJc w:val="left"/>
+      <w:pPr>
+        <w:tabs>
+          <w:tab w:val="num" w:pos="0"/>
+        </w:tabs>
+        <w:ind w:left="0" w:hanging="0"/>
+      </w:pPr>
     </w:lvl>
     <w:lvl w:ilvl="2">
       <w:start w:val="1"/>
-      <w:numFmt w:val="bullet"/>
-      <w:lvlText w:val="■"/>
-      <w:lvlJc w:val="left"/>
-      <w:pPr>
-        <w:tabs>
-          <w:tab w:val="num" w:pos="0"/>
-        </w:tabs>
-        <w:ind w:left="2160" w:hanging="360"/>
-      </w:pPr>
-      <w:rPr>
-        <w:rFonts w:ascii="Arial" w:hAnsi="Arial" w:cs="Arial" w:hint="default"/>
-        <w:smallCaps w:val="false"/>
-        <w:caps w:val="false"/>
-        <w:dstrike w:val="false"/>
-        <w:strike w:val="false"/>
-        <w:vertAlign w:val="baseline"/>
-        <w:position w:val="0"/>
-        <w:sz w:val="22"/>
-        <w:sz w:val="22"/>
-        <w:i w:val="false"/>
-        <w:u w:val="none"/>
-        <w:b w:val="false"/>
-        <w:szCs w:val="22"/>
-        <w:iCs w:val="false"/>
-        <w:bCs w:val="false"/>
-        <w:color w:val="000000"/>
-      </w:rPr>
+      <w:numFmt w:val="none"/>
+      <w:suff w:val="nothing"/>
+      <w:lvlText w:val=""/>
+      <w:lvlJc w:val="left"/>
+      <w:pPr>
+        <w:tabs>
+          <w:tab w:val="num" w:pos="0"/>
+        </w:tabs>
+        <w:ind w:left="0" w:hanging="0"/>
+      </w:pPr>
     </w:lvl>
     <w:lvl w:ilvl="3">
       <w:start w:val="1"/>
-      <w:numFmt w:val="bullet"/>
-      <w:lvlText w:val="■"/>
-      <w:lvlJc w:val="left"/>
-      <w:pPr>
-        <w:tabs>
-          <w:tab w:val="num" w:pos="0"/>
-        </w:tabs>
-        <w:ind w:left="2880" w:hanging="360"/>
-      </w:pPr>
-      <w:rPr>
-        <w:rFonts w:ascii="Arial" w:hAnsi="Arial" w:cs="Arial" w:hint="default"/>
-        <w:smallCaps w:val="false"/>
-        <w:caps w:val="false"/>
-        <w:dstrike w:val="false"/>
-        <w:strike w:val="false"/>
-        <w:vertAlign w:val="baseline"/>
-        <w:position w:val="0"/>
-        <w:sz w:val="22"/>
-        <w:sz w:val="22"/>
-        <w:i w:val="false"/>
-        <w:u w:val="none"/>
-        <w:b w:val="false"/>
-        <w:szCs w:val="22"/>
-        <w:iCs w:val="false"/>
-        <w:bCs w:val="false"/>
-        <w:color w:val="000000"/>
-      </w:rPr>
+      <w:numFmt w:val="none"/>
+      <w:suff w:val="nothing"/>
+      <w:lvlText w:val=""/>
+      <w:lvlJc w:val="left"/>
+      <w:pPr>
+        <w:tabs>
+          <w:tab w:val="num" w:pos="0"/>
+        </w:tabs>
+        <w:ind w:left="0" w:hanging="0"/>
+      </w:pPr>
     </w:lvl>
     <w:lvl w:ilvl="4">
       <w:start w:val="1"/>
-      <w:numFmt w:val="bullet"/>
-      <w:lvlText w:val="■"/>
-      <w:lvlJc w:val="left"/>
-      <w:pPr>
-        <w:tabs>
-          <w:tab w:val="num" w:pos="0"/>
-        </w:tabs>
-        <w:ind w:left="3600" w:hanging="360"/>
-      </w:pPr>
-      <w:rPr>
-        <w:rFonts w:ascii="Arial" w:hAnsi="Arial" w:cs="Arial" w:hint="default"/>
-        <w:smallCaps w:val="false"/>
-        <w:caps w:val="false"/>
-        <w:dstrike w:val="false"/>
-        <w:strike w:val="false"/>
-        <w:vertAlign w:val="baseline"/>
-        <w:position w:val="0"/>
-        <w:sz w:val="22"/>
-        <w:sz w:val="22"/>
-        <w:i w:val="false"/>
-        <w:u w:val="none"/>
-        <w:b w:val="false"/>
-        <w:szCs w:val="22"/>
-        <w:iCs w:val="false"/>
-        <w:bCs w:val="false"/>
-        <w:color w:val="000000"/>
-      </w:rPr>
+      <w:numFmt w:val="none"/>
+      <w:suff w:val="nothing"/>
+      <w:lvlText w:val=""/>
+      <w:lvlJc w:val="left"/>
+      <w:pPr>
+        <w:tabs>
+          <w:tab w:val="num" w:pos="0"/>
+        </w:tabs>
+        <w:ind w:left="0" w:hanging="0"/>
+      </w:pPr>
     </w:lvl>
     <w:lvl w:ilvl="5">
       <w:start w:val="1"/>
-      <w:numFmt w:val="bullet"/>
-      <w:lvlText w:val="■"/>
-      <w:lvlJc w:val="left"/>
-      <w:pPr>
-        <w:tabs>
-          <w:tab w:val="num" w:pos="0"/>
-        </w:tabs>
-        <w:ind w:left="4320" w:hanging="360"/>
-      </w:pPr>
-      <w:rPr>
-        <w:rFonts w:ascii="Arial" w:hAnsi="Arial" w:cs="Arial" w:hint="default"/>
-        <w:smallCaps w:val="false"/>
-        <w:caps w:val="false"/>
-        <w:dstrike w:val="false"/>
-        <w:strike w:val="false"/>
-        <w:vertAlign w:val="baseline"/>
-        <w:position w:val="0"/>
-        <w:sz w:val="22"/>
-        <w:sz w:val="22"/>
-        <w:i w:val="false"/>
-        <w:u w:val="none"/>
-        <w:b w:val="false"/>
-        <w:szCs w:val="22"/>
-        <w:iCs w:val="false"/>
-        <w:bCs w:val="false"/>
-        <w:color w:val="000000"/>
-      </w:rPr>
+      <w:numFmt w:val="none"/>
+      <w:suff w:val="nothing"/>
+      <w:lvlText w:val=""/>
+      <w:lvlJc w:val="left"/>
+      <w:pPr>
+        <w:tabs>
+          <w:tab w:val="num" w:pos="0"/>
+        </w:tabs>
+        <w:ind w:left="0" w:hanging="0"/>
+      </w:pPr>
     </w:lvl>
     <w:lvl w:ilvl="6">
       <w:start w:val="1"/>
-      <w:numFmt w:val="bullet"/>
-      <w:lvlText w:val="■"/>
-      <w:lvlJc w:val="left"/>
-      <w:pPr>
-        <w:tabs>
-          <w:tab w:val="num" w:pos="0"/>
-        </w:tabs>
-        <w:ind w:left="5040" w:hanging="360"/>
-      </w:pPr>
-      <w:rPr>
-        <w:rFonts w:ascii="Arial" w:hAnsi="Arial" w:cs="Arial" w:hint="default"/>
-        <w:smallCaps w:val="false"/>
-        <w:caps w:val="false"/>
-        <w:dstrike w:val="false"/>
-        <w:strike w:val="false"/>
-        <w:vertAlign w:val="baseline"/>
-        <w:position w:val="0"/>
-        <w:sz w:val="22"/>
-        <w:sz w:val="22"/>
-        <w:i w:val="false"/>
-        <w:u w:val="none"/>
-        <w:b w:val="false"/>
-        <w:szCs w:val="22"/>
-        <w:iCs w:val="false"/>
-        <w:bCs w:val="false"/>
-        <w:color w:val="000000"/>
-      </w:rPr>
+      <w:numFmt w:val="none"/>
+      <w:suff w:val="nothing"/>
+      <w:lvlText w:val=""/>
+      <w:lvlJc w:val="left"/>
+      <w:pPr>
+        <w:tabs>
+          <w:tab w:val="num" w:pos="0"/>
+        </w:tabs>
+        <w:ind w:left="0" w:hanging="0"/>
+      </w:pPr>
     </w:lvl>
     <w:lvl w:ilvl="7">
       <w:start w:val="1"/>
-      <w:numFmt w:val="bullet"/>
-      <w:lvlText w:val="■"/>
-      <w:lvlJc w:val="left"/>
-      <w:pPr>
-        <w:tabs>
-          <w:tab w:val="num" w:pos="0"/>
-        </w:tabs>
-        <w:ind w:left="5760" w:hanging="360"/>
-      </w:pPr>
-      <w:rPr>
-        <w:rFonts w:ascii="Arial" w:hAnsi="Arial" w:cs="Arial" w:hint="default"/>
-        <w:smallCaps w:val="false"/>
-        <w:caps w:val="false"/>
-        <w:dstrike w:val="false"/>
-        <w:strike w:val="false"/>
-        <w:vertAlign w:val="baseline"/>
-        <w:position w:val="0"/>
-        <w:sz w:val="22"/>
-        <w:sz w:val="22"/>
-        <w:i w:val="false"/>
-        <w:u w:val="none"/>
-        <w:b w:val="false"/>
-        <w:szCs w:val="22"/>
-        <w:iCs w:val="false"/>
-        <w:bCs w:val="false"/>
-        <w:color w:val="000000"/>
-      </w:rPr>
+      <w:numFmt w:val="none"/>
+      <w:suff w:val="nothing"/>
+      <w:lvlText w:val=""/>
+      <w:lvlJc w:val="left"/>
+      <w:pPr>
+        <w:tabs>
+          <w:tab w:val="num" w:pos="0"/>
+        </w:tabs>
+        <w:ind w:left="0" w:hanging="0"/>
+      </w:pPr>
     </w:lvl>
     <w:lvl w:ilvl="8">
       <w:start w:val="1"/>
-      <w:numFmt w:val="bullet"/>
-      <w:lvlText w:val="■"/>
-      <w:lvlJc w:val="left"/>
-      <w:pPr>
-        <w:tabs>
-          <w:tab w:val="num" w:pos="0"/>
-        </w:tabs>
-        <w:ind w:left="6480" w:hanging="360"/>
-      </w:pPr>
-      <w:rPr>
-        <w:rFonts w:ascii="Arial" w:hAnsi="Arial" w:cs="Arial" w:hint="default"/>
-        <w:smallCaps w:val="false"/>
-        <w:caps w:val="false"/>
-        <w:dstrike w:val="false"/>
-        <w:strike w:val="false"/>
-        <w:vertAlign w:val="baseline"/>
-        <w:position w:val="0"/>
-        <w:sz w:val="22"/>
-        <w:sz w:val="22"/>
-        <w:i w:val="false"/>
-        <w:u w:val="none"/>
-        <w:b w:val="false"/>
-        <w:szCs w:val="22"/>
-        <w:iCs w:val="false"/>
-        <w:bCs w:val="false"/>
-        <w:color w:val="000000"/>
-      </w:rPr>
+      <w:numFmt w:val="none"/>
+      <w:suff w:val="nothing"/>
+      <w:lvlText w:val=""/>
+      <w:lvlJc w:val="left"/>
+      <w:pPr>
+        <w:tabs>
+          <w:tab w:val="num" w:pos="0"/>
+        </w:tabs>
+        <w:ind w:left="0" w:hanging="0"/>
+      </w:pPr>
     </w:lvl>
   </w:abstractNum>
   <w:num w:numId="1">
@@ -2901,7 +2876,6 @@
     </w:rPrDefault>
     <w:pPrDefault>
       <w:pPr>
-        <w:widowControl/>
         <w:suppressAutoHyphens w:val="true"/>
       </w:pPr>
     </w:pPrDefault>
@@ -2911,10 +2885,11 @@
     <w:qFormat/>
     <w:pPr>
       <w:widowControl/>
-      <w:kinsoku w:val="true"/>
-      <w:overflowPunct w:val="true"/>
-      <w:autoSpaceDE w:val="true"/>
+      <w:suppressAutoHyphens w:val="true"/>
+      <w:overflowPunct w:val="false"/>
       <w:bidi w:val="0"/>
+      <w:spacing w:before="0" w:after="0"/>
+      <w:jc w:val="left"/>
     </w:pPr>
     <w:rPr>
       <w:rFonts w:ascii="Liberation Serif" w:hAnsi="Liberation Serif" w:eastAsia="Noto Serif CJK SC" w:cs="FreeSans"/>
@@ -2931,7 +2906,6 @@
     <w:next w:val="Normal"/>
     <w:qFormat/>
     <w:pPr>
-      <w:pBdr/>
       <w:spacing w:lineRule="auto" w:line="240" w:before="240" w:after="240"/>
     </w:pPr>
     <w:rPr>
@@ -2949,7 +2923,6 @@
     <w:next w:val="Normal"/>
     <w:qFormat/>
     <w:pPr>
-      <w:pBdr/>
       <w:spacing w:lineRule="auto" w:line="240" w:before="225" w:after="225"/>
     </w:pPr>
     <w:rPr>
@@ -2967,7 +2940,6 @@
     <w:next w:val="Normal"/>
     <w:qFormat/>
     <w:pPr>
-      <w:pBdr/>
       <w:spacing w:lineRule="auto" w:line="240" w:before="240" w:after="240"/>
     </w:pPr>
     <w:rPr>
@@ -3049,10 +3021,10 @@
     <w:qFormat/>
     <w:pPr>
       <w:widowControl/>
-      <w:kinsoku w:val="true"/>
-      <w:overflowPunct w:val="true"/>
-      <w:autoSpaceDE w:val="true"/>
+      <w:suppressAutoHyphens w:val="true"/>
+      <w:overflowPunct w:val="false"/>
       <w:bidi w:val="0"/>
+      <w:spacing w:before="0" w:after="0"/>
       <w:jc w:val="left"/>
     </w:pPr>
     <w:rPr>

</xml_diff>

<commit_message>
New project, color contrast accessibility tweaks on projects pagination buttons, added sustainability page and carbon rating, fixed homepage cards to use eleventy-img processing, typo duty
</commit_message>
<xml_diff>
--- a/src/public/dylan-austin-resume.docx
+++ b/src/public/dylan-austin-resume.docx
@@ -117,21 +117,7 @@
           <w:rFonts w:eastAsia="Google Sans" w:cs="Google Sans" w:ascii="Arial" w:hAnsi="Arial"/>
           <w:color w:val="1F1F1F"/>
         </w:rPr>
-        <w:t xml:space="preserve">Dylan is a product-minded UX designer and content strategist in Seattle. He has written, designed, and </w:t>
-      </w:r>
-      <w:r>
-        <w:rPr>
-          <w:rFonts w:eastAsia="Google Sans" w:cs="Google Sans" w:ascii="Arial" w:hAnsi="Arial"/>
-          <w:color w:val="1F1F1F"/>
-        </w:rPr>
-        <w:t>built</w:t>
-      </w:r>
-      <w:r>
-        <w:rPr>
-          <w:rFonts w:eastAsia="Google Sans" w:cs="Google Sans" w:ascii="Arial" w:hAnsi="Arial"/>
-          <w:color w:val="1F1F1F"/>
-        </w:rPr>
-        <w:t xml:space="preserve"> online experiences for over 10 years.</w:t>
+        <w:t>Dylan is a product-minded UX designer and content strategist in Seattle. He has written, designed, and built online experiences for over 10 years.</w:t>
       </w:r>
     </w:p>
     <w:p>
@@ -997,7 +983,7 @@
           <w:rFonts w:eastAsia="Google Sans" w:cs="Google Sans" w:ascii="Arial" w:hAnsi="Arial"/>
           <w:color w:val="1F1F1F"/>
         </w:rPr>
-        <w:t>Design &amp; Prototyping: Figma, Adobe XD, Adobe Creative Suite, Framer</w:t>
+        <w:t>Design &amp; Prototyping: Figma, Adobe Creative Suite, Framer</w:t>
       </w:r>
     </w:p>
     <w:p>
@@ -2886,7 +2872,7 @@
     <w:pPr>
       <w:widowControl/>
       <w:suppressAutoHyphens w:val="true"/>
-      <w:overflowPunct w:val="false"/>
+      <w:overflowPunct w:val="true"/>
       <w:bidi w:val="0"/>
       <w:spacing w:before="0" w:after="0"/>
       <w:jc w:val="left"/>
@@ -3022,7 +3008,7 @@
     <w:pPr>
       <w:widowControl/>
       <w:suppressAutoHyphens w:val="true"/>
-      <w:overflowPunct w:val="false"/>
+      <w:overflowPunct w:val="true"/>
       <w:bidi w:val="0"/>
       <w:spacing w:before="0" w:after="0"/>
       <w:jc w:val="left"/>

</xml_diff>

<commit_message>
Updating resume, about, fun facts, etc
</commit_message>
<xml_diff>
--- a/src/public/dylan-austin-resume.docx
+++ b/src/public/dylan-austin-resume.docx
@@ -5,7 +5,7 @@
     <w:p>
       <w:pPr>
         <w:pStyle w:val="Heading1"/>
-        <w:spacing w:lineRule="auto" w:line="271" w:before="120" w:after="240"/>
+        <w:spacing w:lineRule="auto" w:line="273" w:before="120" w:after="240"/>
         <w:jc w:val="center"/>
         <w:rPr>
           <w:rFonts w:ascii="Arial" w:hAnsi="Arial"/>
@@ -24,7 +24,7 @@
       <w:pPr>
         <w:pStyle w:val="Normal"/>
         <w:bidi w:val="0"/>
-        <w:spacing w:lineRule="auto" w:line="271" w:before="0" w:after="240"/>
+        <w:spacing w:lineRule="auto" w:line="273" w:before="0" w:after="240"/>
         <w:jc w:val="center"/>
         <w:rPr/>
       </w:pPr>
@@ -87,7 +87,7 @@
     <w:p>
       <w:pPr>
         <w:pStyle w:val="Heading2"/>
-        <w:spacing w:lineRule="auto" w:line="271" w:before="0" w:after="120"/>
+        <w:spacing w:lineRule="auto" w:line="273" w:before="0" w:after="120"/>
         <w:rPr>
           <w:rFonts w:ascii="Arial" w:hAnsi="Arial"/>
         </w:rPr>
@@ -104,9 +104,10 @@
     <w:p>
       <w:pPr>
         <w:pStyle w:val="Normal"/>
+        <w:pBdr/>
         <w:bidi w:val="0"/>
-        <w:spacing w:lineRule="auto" w:line="271" w:before="0" w:after="240"/>
-        <w:jc w:val="left"/>
+        <w:spacing w:lineRule="auto" w:line="273" w:before="0" w:after="240"/>
+        <w:jc w:val="start"/>
         <w:rPr>
           <w:rFonts w:ascii="Arial" w:hAnsi="Arial" w:eastAsia="Google Sans" w:cs="Google Sans"/>
           <w:color w:val="1F1F1F"/>
@@ -117,221 +118,22 @@
           <w:rFonts w:eastAsia="Google Sans" w:cs="Google Sans" w:ascii="Arial" w:hAnsi="Arial"/>
           <w:color w:val="1F1F1F"/>
         </w:rPr>
-        <w:t>Dylan is a product-minded UX designer and content strategist in Seattle. He has written, designed, and built online experiences for over 10 years.</w:t>
+        <w:t>Dylan is a product-minded UX designer and content strategist in Seattle. He’s a tinkerer and untangler who has spent 10+ years writing, designing, and building digital experiences at companies like Pinterest and Ancestry.</w:t>
       </w:r>
     </w:p>
     <w:p>
       <w:pPr>
         <w:pStyle w:val="Heading3"/>
-        <w:spacing w:lineRule="auto" w:line="271" w:before="240" w:after="120"/>
+        <w:spacing w:lineRule="auto" w:line="273" w:before="240" w:after="120"/>
         <w:rPr>
           <w:rFonts w:ascii="Arial" w:hAnsi="Arial"/>
         </w:rPr>
       </w:pPr>
-      <w:bookmarkStart w:id="2" w:name="_icjo02z6ncam"/>
-      <w:bookmarkEnd w:id="2"/>
       <w:r>
         <w:rPr>
           <w:rFonts w:ascii="Arial" w:hAnsi="Arial"/>
         </w:rPr>
-        <w:t>Core Competencies</w:t>
-      </w:r>
-    </w:p>
-    <w:p>
-      <w:pPr>
-        <w:pStyle w:val="Normal"/>
-        <w:numPr>
-          <w:ilvl w:val="0"/>
-          <w:numId w:val="2"/>
-        </w:numPr>
-        <w:bidi w:val="0"/>
-        <w:spacing w:lineRule="auto" w:line="271" w:before="0" w:after="0"/>
-        <w:ind w:hanging="360" w:left="465" w:right="0"/>
-        <w:jc w:val="left"/>
-        <w:rPr>
-          <w:rFonts w:ascii="Arial" w:hAnsi="Arial"/>
-        </w:rPr>
-      </w:pPr>
-      <w:r>
-        <w:rPr>
-          <w:rFonts w:eastAsia="Google Sans" w:cs="Google Sans" w:ascii="Arial" w:hAnsi="Arial"/>
-          <w:b/>
-          <w:bCs/>
-          <w:color w:val="1F1F1F"/>
-        </w:rPr>
-        <w:t>UX/UI &amp; Responsive Design:</w:t>
-      </w:r>
-      <w:r>
-        <w:rPr>
-          <w:rFonts w:eastAsia="Google Sans" w:cs="Google Sans" w:ascii="Arial" w:hAnsi="Arial"/>
-          <w:color w:val="1F1F1F"/>
-        </w:rPr>
-        <w:t xml:space="preserve"> Wireframing, high-fidelity prototyping, and designing for complex functionality and user journeys</w:t>
-      </w:r>
-    </w:p>
-    <w:p>
-      <w:pPr>
-        <w:pStyle w:val="Normal"/>
-        <w:numPr>
-          <w:ilvl w:val="0"/>
-          <w:numId w:val="2"/>
-        </w:numPr>
-        <w:bidi w:val="0"/>
-        <w:spacing w:lineRule="auto" w:line="271" w:before="0" w:after="0"/>
-        <w:ind w:hanging="360" w:left="465" w:right="0"/>
-        <w:jc w:val="left"/>
-        <w:rPr>
-          <w:rFonts w:ascii="Arial" w:hAnsi="Arial"/>
-        </w:rPr>
-      </w:pPr>
-      <w:r>
-        <w:rPr>
-          <w:rFonts w:eastAsia="Google Sans" w:cs="Google Sans" w:ascii="Arial" w:hAnsi="Arial"/>
-          <w:b/>
-          <w:bCs/>
-          <w:color w:val="1F1F1F"/>
-        </w:rPr>
-        <w:t>Integrated Content Strategy:</w:t>
-      </w:r>
-      <w:r>
-        <w:rPr>
-          <w:rFonts w:eastAsia="Google Sans" w:cs="Google Sans" w:ascii="Arial" w:hAnsi="Arial"/>
-          <w:color w:val="1F1F1F"/>
-        </w:rPr>
-        <w:t xml:space="preserve"> Site-wide content audits, information architecture, and aligning brand voice across product touchpoints</w:t>
-      </w:r>
-    </w:p>
-    <w:p>
-      <w:pPr>
-        <w:pStyle w:val="Normal"/>
-        <w:numPr>
-          <w:ilvl w:val="0"/>
-          <w:numId w:val="2"/>
-        </w:numPr>
-        <w:bidi w:val="0"/>
-        <w:spacing w:lineRule="auto" w:line="271" w:before="0" w:after="0"/>
-        <w:ind w:hanging="360" w:left="465" w:right="0"/>
-        <w:jc w:val="left"/>
-        <w:rPr>
-          <w:rFonts w:ascii="Arial" w:hAnsi="Arial"/>
-        </w:rPr>
-      </w:pPr>
-      <w:r>
-        <w:rPr>
-          <w:rFonts w:eastAsia="Google Sans" w:cs="Google Sans" w:ascii="Arial" w:hAnsi="Arial"/>
-          <w:b/>
-          <w:bCs/>
-          <w:color w:val="1F1F1F"/>
-        </w:rPr>
-        <w:t>Systemic Health &amp; Accessibility:</w:t>
-      </w:r>
-      <w:r>
-        <w:rPr>
-          <w:rFonts w:eastAsia="Google Sans" w:cs="Google Sans" w:ascii="Arial" w:hAnsi="Arial"/>
-          <w:color w:val="1F1F1F"/>
-        </w:rPr>
-        <w:t xml:space="preserve"> Identifying and addressing design debt and accessibility (A11Y) issues within existing products</w:t>
-      </w:r>
-    </w:p>
-    <w:p>
-      <w:pPr>
-        <w:pStyle w:val="Normal"/>
-        <w:numPr>
-          <w:ilvl w:val="0"/>
-          <w:numId w:val="2"/>
-        </w:numPr>
-        <w:bidi w:val="0"/>
-        <w:spacing w:lineRule="auto" w:line="271" w:before="0" w:after="120"/>
-        <w:ind w:hanging="360" w:left="465" w:right="0"/>
-        <w:jc w:val="left"/>
-        <w:rPr>
-          <w:rFonts w:ascii="Arial" w:hAnsi="Arial"/>
-        </w:rPr>
-      </w:pPr>
-      <w:r>
-        <w:rPr>
-          <w:rFonts w:eastAsia="Google Sans" w:cs="Google Sans" w:ascii="Arial" w:hAnsi="Arial"/>
-          <w:b/>
-          <w:bCs/>
-          <w:color w:val="1F1F1F"/>
-        </w:rPr>
-        <w:t>Cross-Functional Alignment:</w:t>
-      </w:r>
-      <w:r>
-        <w:rPr>
-          <w:rFonts w:eastAsia="Google Sans" w:cs="Google Sans" w:ascii="Arial" w:hAnsi="Arial"/>
-          <w:color w:val="1F1F1F"/>
-        </w:rPr>
-        <w:t xml:space="preserve"> Coordinating between dev, design, and content teams to modernize site architecture and production workflows</w:t>
-      </w:r>
-    </w:p>
-    <w:p>
-      <w:pPr>
-        <w:pStyle w:val="Heading3"/>
-        <w:spacing w:lineRule="auto" w:line="271" w:before="240" w:after="120"/>
-        <w:rPr>
-          <w:rFonts w:ascii="Arial" w:hAnsi="Arial" w:eastAsia="Google Sans" w:cs="Google Sans"/>
-          <w:color w:val="1F1F1F"/>
-        </w:rPr>
-      </w:pPr>
-      <w:r>
-        <w:rPr>
-          <w:rFonts w:eastAsia="Google Sans" w:cs="Google Sans" w:ascii="Arial" w:hAnsi="Arial"/>
-          <w:color w:val="1F1F1F"/>
-        </w:rPr>
-        <w:t>Professional Experience</w:t>
-      </w:r>
-    </w:p>
-    <w:p>
-      <w:pPr>
-        <w:pStyle w:val="Normal"/>
-        <w:bidi w:val="0"/>
-        <w:spacing w:lineRule="auto" w:line="271" w:before="0" w:after="120"/>
-        <w:jc w:val="left"/>
-        <w:rPr>
-          <w:rFonts w:ascii="Arial" w:hAnsi="Arial"/>
-        </w:rPr>
-      </w:pPr>
-      <w:r>
-        <w:rPr>
-          <w:rFonts w:eastAsia="Google Sans" w:cs="Google Sans" w:ascii="Arial" w:hAnsi="Arial"/>
-          <w:b/>
-          <w:bCs/>
-          <w:color w:val="1F1F1F"/>
-        </w:rPr>
-        <w:t>Know Your Pet DNA by Ancestry</w:t>
-      </w:r>
-      <w:r>
-        <w:rPr>
-          <w:rFonts w:eastAsia="Google Sans" w:cs="Google Sans" w:ascii="Arial" w:hAnsi="Arial"/>
-          <w:color w:val="1F1F1F"/>
-        </w:rPr>
-        <w:t xml:space="preserve"> | </w:t>
-      </w:r>
-      <w:r>
-        <w:rPr>
-          <w:rFonts w:eastAsia="Google Sans" w:cs="Google Sans" w:ascii="Arial" w:hAnsi="Arial"/>
-          <w:i/>
-          <w:iCs/>
-          <w:color w:val="1F1F1F"/>
-        </w:rPr>
-        <w:t>Content Designer → UX Design</w:t>
-      </w:r>
-      <w:r>
-        <w:rPr>
-          <w:rFonts w:eastAsia="Google Sans" w:cs="Google Sans" w:ascii="Arial" w:hAnsi="Arial"/>
-          <w:color w:val="1F1F1F"/>
-        </w:rPr>
-        <w:t xml:space="preserve"> | </w:t>
-      </w:r>
-      <w:r>
-        <w:rPr>
-          <w:rFonts w:eastAsia="Google Sans" w:cs="Google Sans" w:ascii="Arial" w:hAnsi="Arial"/>
-          <w:b/>
-          <w:bCs/>
-          <w:color w:val="1F1F1F"/>
-        </w:rPr>
-        <w:t>Mar 2025 - Jan 2026</w:t>
+        <w:t>Skills</w:t>
       </w:r>
     </w:p>
     <w:p>
@@ -341,21 +143,26 @@
           <w:ilvl w:val="0"/>
           <w:numId w:val="3"/>
         </w:numPr>
+        <w:pBdr/>
         <w:bidi w:val="0"/>
-        <w:spacing w:lineRule="auto" w:line="271" w:before="0" w:after="0"/>
-        <w:ind w:hanging="360" w:left="465" w:right="0"/>
-        <w:jc w:val="left"/>
+        <w:spacing w:lineRule="auto" w:line="273" w:before="0" w:after="0"/>
+        <w:ind w:hanging="360" w:start="465" w:end="0"/>
+        <w:jc w:val="start"/>
         <w:rPr>
           <w:rFonts w:ascii="Arial" w:hAnsi="Arial" w:eastAsia="Google Sans" w:cs="Google Sans"/>
-          <w:color w:val="1F1F1F"/>
-        </w:rPr>
-      </w:pPr>
-      <w:r>
-        <w:rPr>
-          <w:rFonts w:eastAsia="Google Sans" w:cs="Google Sans" w:ascii="Arial" w:hAnsi="Arial"/>
-          <w:color w:val="1F1F1F"/>
-        </w:rPr>
-        <w:t>Shifted to a UX lead capacity as team dynamics changed, designing new roles and permissions functionality, account settings experiences, and shareable graphic features</w:t>
+          <w:b w:val="false"/>
+          <w:bCs w:val="false"/>
+          <w:color w:val="1F1F1F"/>
+        </w:rPr>
+      </w:pPr>
+      <w:r>
+        <w:rPr>
+          <w:rFonts w:eastAsia="Google Sans" w:cs="Google Sans" w:ascii="Arial" w:hAnsi="Arial"/>
+          <w:b w:val="false"/>
+          <w:bCs w:val="false"/>
+          <w:color w:val="1F1F1F"/>
+        </w:rPr>
+        <w:t>UX/UI &amp; Responsive Design: Wireframing, high-fidelity prototyping, and designing for complex functionality and user journeys</w:t>
       </w:r>
     </w:p>
     <w:p>
@@ -365,21 +172,159 @@
           <w:ilvl w:val="0"/>
           <w:numId w:val="3"/>
         </w:numPr>
+        <w:pBdr/>
         <w:bidi w:val="0"/>
-        <w:spacing w:lineRule="auto" w:line="271" w:before="0" w:after="0"/>
-        <w:ind w:hanging="360" w:left="465" w:right="0"/>
-        <w:jc w:val="left"/>
-        <w:rPr>
-          <w:rFonts w:ascii="Arial" w:hAnsi="Arial" w:eastAsia="Google Sans" w:cs="Google Sans"/>
-          <w:color w:val="1F1F1F"/>
-        </w:rPr>
-      </w:pPr>
-      <w:r>
-        <w:rPr>
-          <w:rFonts w:eastAsia="Google Sans" w:cs="Google Sans" w:ascii="Arial" w:hAnsi="Arial"/>
-          <w:color w:val="1F1F1F"/>
-        </w:rPr>
-        <w:t>Addressed impeding design debt and A11Y issues</w:t>
+        <w:spacing w:lineRule="auto" w:line="273" w:before="0" w:after="0"/>
+        <w:ind w:hanging="360" w:start="465" w:end="0"/>
+        <w:jc w:val="start"/>
+        <w:rPr>
+          <w:b w:val="false"/>
+          <w:bCs w:val="false"/>
+        </w:rPr>
+      </w:pPr>
+      <w:r>
+        <w:rPr>
+          <w:rFonts w:eastAsia="Google Sans" w:cs="Google Sans" w:ascii="Arial" w:hAnsi="Arial"/>
+          <w:b w:val="false"/>
+          <w:bCs w:val="false"/>
+          <w:color w:val="1F1F1F"/>
+        </w:rPr>
+        <w:t>AI-Assisted Workflow</w:t>
+      </w:r>
+      <w:r>
+        <w:rPr>
+          <w:rFonts w:eastAsia="Google Sans" w:cs="Google Sans" w:ascii="Arial" w:hAnsi="Arial"/>
+          <w:b w:val="false"/>
+          <w:bCs w:val="false"/>
+          <w:color w:val="1F1F1F"/>
+        </w:rPr>
+        <w:t>s</w:t>
+      </w:r>
+      <w:r>
+        <w:rPr>
+          <w:rFonts w:eastAsia="Google Sans" w:cs="Google Sans" w:ascii="Arial" w:hAnsi="Arial"/>
+          <w:b w:val="false"/>
+          <w:bCs w:val="false"/>
+          <w:color w:val="1F1F1F"/>
+        </w:rPr>
+        <w:t xml:space="preserve">: Leveraging tools </w:t>
+      </w:r>
+      <w:r>
+        <w:rPr>
+          <w:rFonts w:eastAsia="Google Sans" w:cs="Google Sans" w:ascii="Arial" w:hAnsi="Arial"/>
+          <w:b w:val="false"/>
+          <w:bCs w:val="false"/>
+          <w:color w:val="1F1F1F"/>
+        </w:rPr>
+        <w:t xml:space="preserve">like </w:t>
+      </w:r>
+      <w:r>
+        <w:rPr>
+          <w:rFonts w:eastAsia="Google Sans" w:cs="Google Sans" w:ascii="Arial" w:hAnsi="Arial"/>
+          <w:b w:val="false"/>
+          <w:bCs w:val="false"/>
+          <w:color w:val="1F1F1F"/>
+        </w:rPr>
+        <w:t xml:space="preserve">Figma Make, Claude, </w:t>
+      </w:r>
+      <w:r>
+        <w:rPr>
+          <w:rFonts w:eastAsia="Google Sans" w:cs="Google Sans" w:ascii="Arial" w:hAnsi="Arial"/>
+          <w:b w:val="false"/>
+          <w:bCs w:val="false"/>
+          <w:color w:val="1F1F1F"/>
+        </w:rPr>
+        <w:t xml:space="preserve">and </w:t>
+      </w:r>
+      <w:r>
+        <w:rPr>
+          <w:rFonts w:eastAsia="Google Sans" w:cs="Google Sans" w:ascii="Arial" w:hAnsi="Arial"/>
+          <w:b w:val="false"/>
+          <w:bCs w:val="false"/>
+          <w:color w:val="1F1F1F"/>
+        </w:rPr>
+        <w:t xml:space="preserve">OpenCode </w:t>
+      </w:r>
+      <w:r>
+        <w:rPr>
+          <w:rFonts w:eastAsia="Google Sans" w:cs="Google Sans" w:ascii="Arial" w:hAnsi="Arial"/>
+          <w:b w:val="false"/>
+          <w:bCs w:val="false"/>
+          <w:color w:val="1F1F1F"/>
+        </w:rPr>
+        <w:t>with</w:t>
+      </w:r>
+      <w:r>
+        <w:rPr>
+          <w:rFonts w:eastAsia="Google Sans" w:cs="Google Sans" w:ascii="Arial" w:hAnsi="Arial"/>
+          <w:b w:val="false"/>
+          <w:bCs w:val="false"/>
+          <w:color w:val="1F1F1F"/>
+        </w:rPr>
+        <w:t xml:space="preserve"> well-tuned prompting </w:t>
+      </w:r>
+      <w:r>
+        <w:rPr>
+          <w:rFonts w:eastAsia="Google Sans" w:cs="Google Sans" w:ascii="Arial" w:hAnsi="Arial"/>
+          <w:b w:val="false"/>
+          <w:bCs w:val="false"/>
+          <w:color w:val="1F1F1F"/>
+        </w:rPr>
+        <w:t xml:space="preserve">for rapid iteration of live prototypes </w:t>
+      </w:r>
+      <w:r>
+        <w:rPr>
+          <w:rFonts w:eastAsia="Google Sans" w:cs="Google Sans" w:ascii="Arial" w:hAnsi="Arial"/>
+          <w:b w:val="false"/>
+          <w:bCs w:val="false"/>
+          <w:color w:val="1F1F1F"/>
+        </w:rPr>
+        <w:t>that</w:t>
+      </w:r>
+      <w:r>
+        <w:rPr>
+          <w:rFonts w:eastAsia="Google Sans" w:cs="Google Sans" w:ascii="Arial" w:hAnsi="Arial"/>
+          <w:b w:val="false"/>
+          <w:bCs w:val="false"/>
+          <w:color w:val="1F1F1F"/>
+        </w:rPr>
+        <w:t xml:space="preserve"> align with tech stacks, </w:t>
+      </w:r>
+      <w:r>
+        <w:rPr>
+          <w:rFonts w:eastAsia="Google Sans" w:cs="Google Sans" w:ascii="Arial" w:hAnsi="Arial"/>
+          <w:b w:val="false"/>
+          <w:bCs w:val="false"/>
+          <w:color w:val="1F1F1F"/>
+        </w:rPr>
+        <w:t>facilitating</w:t>
+      </w:r>
+      <w:r>
+        <w:rPr>
+          <w:rFonts w:eastAsia="Google Sans" w:cs="Google Sans" w:ascii="Arial" w:hAnsi="Arial"/>
+          <w:b w:val="false"/>
+          <w:bCs w:val="false"/>
+          <w:color w:val="1F1F1F"/>
+        </w:rPr>
+        <w:t xml:space="preserve"> </w:t>
+      </w:r>
+      <w:r>
+        <w:rPr>
+          <w:rFonts w:eastAsia="Google Sans" w:cs="Google Sans" w:ascii="Arial" w:hAnsi="Arial"/>
+          <w:b w:val="false"/>
+          <w:bCs w:val="false"/>
+          <w:color w:val="1F1F1F"/>
+        </w:rPr>
+        <w:t>collaboration and</w:t>
+      </w:r>
+      <w:r>
+        <w:rPr>
+          <w:rFonts w:eastAsia="Google Sans" w:cs="Google Sans" w:ascii="Arial" w:hAnsi="Arial"/>
+          <w:b w:val="false"/>
+          <w:bCs w:val="false"/>
+          <w:color w:val="1F1F1F"/>
+        </w:rPr>
+        <w:t xml:space="preserve"> developer handoff</w:t>
       </w:r>
     </w:p>
     <w:p>
@@ -389,21 +334,26 @@
           <w:ilvl w:val="0"/>
           <w:numId w:val="3"/>
         </w:numPr>
+        <w:pBdr/>
         <w:bidi w:val="0"/>
-        <w:spacing w:lineRule="auto" w:line="271" w:before="0" w:after="0"/>
-        <w:ind w:hanging="360" w:left="465" w:right="0"/>
-        <w:jc w:val="left"/>
+        <w:spacing w:lineRule="auto" w:line="273" w:before="0" w:after="0"/>
+        <w:ind w:hanging="360" w:start="465" w:end="0"/>
+        <w:jc w:val="start"/>
         <w:rPr>
           <w:rFonts w:ascii="Arial" w:hAnsi="Arial" w:eastAsia="Google Sans" w:cs="Google Sans"/>
-          <w:color w:val="1F1F1F"/>
-        </w:rPr>
-      </w:pPr>
-      <w:r>
-        <w:rPr>
-          <w:rFonts w:eastAsia="Google Sans" w:cs="Google Sans" w:ascii="Arial" w:hAnsi="Arial"/>
-          <w:color w:val="1F1F1F"/>
-        </w:rPr>
-        <w:t>Realigned brand voice and ethos across CRM and the Know Your Pet DNA site</w:t>
+          <w:b w:val="false"/>
+          <w:bCs w:val="false"/>
+          <w:color w:val="1F1F1F"/>
+        </w:rPr>
+      </w:pPr>
+      <w:r>
+        <w:rPr>
+          <w:rFonts w:eastAsia="Google Sans" w:cs="Google Sans" w:ascii="Arial" w:hAnsi="Arial"/>
+          <w:b w:val="false"/>
+          <w:bCs w:val="false"/>
+          <w:color w:val="1F1F1F"/>
+        </w:rPr>
+        <w:t>Integrated Content Strategy: Site-wide content audits, information architecture, and aligning brand voice across product touchpoints</w:t>
       </w:r>
     </w:p>
     <w:p>
@@ -413,21 +363,26 @@
           <w:ilvl w:val="0"/>
           <w:numId w:val="3"/>
         </w:numPr>
+        <w:pBdr/>
         <w:bidi w:val="0"/>
-        <w:spacing w:lineRule="auto" w:line="271" w:before="0" w:after="0"/>
-        <w:ind w:hanging="360" w:left="465" w:right="0"/>
-        <w:jc w:val="left"/>
+        <w:spacing w:lineRule="auto" w:line="273" w:before="0" w:after="0"/>
+        <w:ind w:hanging="360" w:start="465" w:end="0"/>
+        <w:jc w:val="start"/>
         <w:rPr>
           <w:rFonts w:ascii="Arial" w:hAnsi="Arial" w:eastAsia="Google Sans" w:cs="Google Sans"/>
-          <w:color w:val="1F1F1F"/>
-        </w:rPr>
-      </w:pPr>
-      <w:r>
-        <w:rPr>
-          <w:rFonts w:eastAsia="Google Sans" w:cs="Google Sans" w:ascii="Arial" w:hAnsi="Arial"/>
-          <w:color w:val="1F1F1F"/>
-        </w:rPr>
-        <w:t>Leveraged member services insights to address user experience gaps within the product</w:t>
+          <w:b w:val="false"/>
+          <w:bCs w:val="false"/>
+          <w:color w:val="1F1F1F"/>
+        </w:rPr>
+      </w:pPr>
+      <w:r>
+        <w:rPr>
+          <w:rFonts w:eastAsia="Google Sans" w:cs="Google Sans" w:ascii="Arial" w:hAnsi="Arial"/>
+          <w:b w:val="false"/>
+          <w:bCs w:val="false"/>
+          <w:color w:val="1F1F1F"/>
+        </w:rPr>
+        <w:t>Systemic Health &amp; Accessibility: Identifying and addressing design debt and accessibility (A11Y) issues within existing products</w:t>
       </w:r>
     </w:p>
     <w:p>
@@ -437,10 +392,37 @@
           <w:ilvl w:val="0"/>
           <w:numId w:val="3"/>
         </w:numPr>
+        <w:pBdr/>
         <w:bidi w:val="0"/>
-        <w:spacing w:lineRule="auto" w:line="271" w:before="0" w:after="0"/>
-        <w:ind w:hanging="360" w:left="465" w:right="0"/>
-        <w:jc w:val="left"/>
+        <w:spacing w:lineRule="auto" w:line="273" w:before="0" w:after="120"/>
+        <w:ind w:hanging="360" w:start="465" w:end="0"/>
+        <w:jc w:val="start"/>
+        <w:rPr>
+          <w:rFonts w:ascii="Arial" w:hAnsi="Arial"/>
+        </w:rPr>
+      </w:pPr>
+      <w:r>
+        <w:rPr>
+          <w:rFonts w:eastAsia="Google Sans" w:cs="Google Sans" w:ascii="Arial" w:hAnsi="Arial"/>
+          <w:b w:val="false"/>
+          <w:bCs w:val="false"/>
+          <w:color w:val="1F1F1F"/>
+        </w:rPr>
+        <w:t>Cross-Functional Alignment: Coordinating between dev, design, and content teams to modernize site architecture and productio</w:t>
+      </w:r>
+      <w:r>
+        <w:rPr>
+          <w:rFonts w:eastAsia="Google Sans" w:cs="Google Sans" w:ascii="Arial" w:hAnsi="Arial"/>
+          <w:color w:val="1F1F1F"/>
+        </w:rPr>
+        <w:t>n workflows</w:t>
+      </w:r>
+    </w:p>
+    <w:p>
+      <w:pPr>
+        <w:pStyle w:val="Heading3"/>
+        <w:pBdr/>
+        <w:spacing w:lineRule="auto" w:line="273" w:before="240" w:after="120"/>
         <w:rPr>
           <w:rFonts w:ascii="Arial" w:hAnsi="Arial" w:eastAsia="Google Sans" w:cs="Google Sans"/>
           <w:color w:val="1F1F1F"/>
@@ -451,39 +433,16 @@
           <w:rFonts w:eastAsia="Google Sans" w:cs="Google Sans" w:ascii="Arial" w:hAnsi="Arial"/>
           <w:color w:val="1F1F1F"/>
         </w:rPr>
-        <w:t>Conducted a comprehensive site content audit and cleanup to streamline information architecture</w:t>
+        <w:t>Experience</w:t>
       </w:r>
     </w:p>
     <w:p>
       <w:pPr>
         <w:pStyle w:val="Normal"/>
-        <w:numPr>
-          <w:ilvl w:val="0"/>
-          <w:numId w:val="3"/>
-        </w:numPr>
+        <w:pBdr/>
         <w:bidi w:val="0"/>
-        <w:spacing w:lineRule="auto" w:line="271" w:before="0" w:after="120"/>
-        <w:ind w:hanging="360" w:left="465" w:right="0"/>
-        <w:jc w:val="left"/>
-        <w:rPr>
-          <w:rFonts w:ascii="Arial" w:hAnsi="Arial" w:eastAsia="Google Sans" w:cs="Google Sans"/>
-          <w:color w:val="1F1F1F"/>
-        </w:rPr>
-      </w:pPr>
-      <w:r>
-        <w:rPr>
-          <w:rFonts w:eastAsia="Google Sans" w:cs="Google Sans" w:ascii="Arial" w:hAnsi="Arial"/>
-          <w:color w:val="1F1F1F"/>
-        </w:rPr>
-        <w:t>Partnered with the dev team and product stakeholders to facilitate a product migration to a new parent company, including transition of content ecosystem in Hygraph and the user experience for customer data migration</w:t>
-      </w:r>
-    </w:p>
-    <w:p>
-      <w:pPr>
-        <w:pStyle w:val="Normal"/>
-        <w:bidi w:val="0"/>
-        <w:spacing w:lineRule="auto" w:line="271" w:before="240" w:after="120"/>
-        <w:jc w:val="left"/>
+        <w:spacing w:lineRule="auto" w:line="273" w:before="0" w:after="120"/>
+        <w:jc w:val="start"/>
         <w:rPr>
           <w:rFonts w:ascii="Arial" w:hAnsi="Arial"/>
         </w:rPr>
@@ -493,41 +452,53 @@
           <w:rFonts w:eastAsia="Google Sans" w:cs="Google Sans" w:ascii="Arial" w:hAnsi="Arial"/>
           <w:b/>
           <w:bCs/>
-          <w:color w:val="1F1F1F"/>
-        </w:rPr>
-        <w:t>Independence Pet Group</w:t>
-      </w:r>
-      <w:r>
-        <w:rPr>
-          <w:rFonts w:eastAsia="Google Sans" w:cs="Google Sans" w:ascii="Arial" w:hAnsi="Arial"/>
-          <w:color w:val="1F1F1F"/>
-        </w:rPr>
-        <w:t xml:space="preserve"> | </w:t>
-      </w:r>
-      <w:r>
-        <w:rPr>
-          <w:rFonts w:eastAsia="Google Sans" w:cs="Google Sans" w:ascii="Arial" w:hAnsi="Arial"/>
+          <w:i w:val="false"/>
+          <w:iCs w:val="false"/>
+          <w:color w:val="1F1F1F"/>
+        </w:rPr>
+        <w:t>Content Designer / UX Design</w:t>
+      </w:r>
+      <w:r>
+        <w:rPr>
+          <w:rFonts w:eastAsia="Google Sans" w:cs="Google Sans" w:ascii="Arial" w:hAnsi="Arial"/>
+          <w:b/>
+          <w:bCs/>
+          <w:i w:val="false"/>
+          <w:iCs w:val="false"/>
+          <w:color w:val="1F1F1F"/>
+        </w:rPr>
+        <w:t>er</w:t>
+      </w:r>
+      <w:r>
+        <w:rPr>
+          <w:rFonts w:eastAsia="Google Sans" w:cs="Google Sans" w:ascii="Arial" w:hAnsi="Arial"/>
+          <w:b w:val="false"/>
+          <w:bCs w:val="false"/>
           <w:i/>
           <w:iCs/>
           <w:color w:val="1F1F1F"/>
         </w:rPr>
-        <w:t>Content Strategy Manager</w:t>
-      </w:r>
-      <w:r>
-        <w:rPr>
-          <w:rFonts w:eastAsia="Google Sans" w:cs="Google Sans" w:ascii="Arial" w:hAnsi="Arial"/>
-          <w:color w:val="1F1F1F"/>
-        </w:rPr>
         <w:t xml:space="preserve"> | </w:t>
       </w:r>
       <w:r>
         <w:rPr>
           <w:rFonts w:eastAsia="Google Sans" w:cs="Google Sans" w:ascii="Arial" w:hAnsi="Arial"/>
-          <w:b/>
-          <w:bCs/>
-          <w:color w:val="1F1F1F"/>
-        </w:rPr>
-        <w:t>Jun 2023 - Apr 2025</w:t>
+          <w:b w:val="false"/>
+          <w:bCs w:val="false"/>
+          <w:color w:val="1F1F1F"/>
+        </w:rPr>
+        <w:t xml:space="preserve">Know Your Pet DNA by Ancestry | </w:t>
+      </w:r>
+      <w:r>
+        <w:rPr>
+          <w:rFonts w:eastAsia="Google Sans" w:cs="Google Sans" w:ascii="Arial" w:hAnsi="Arial"/>
+          <w:b w:val="false"/>
+          <w:bCs w:val="false"/>
+          <w:i/>
+          <w:iCs/>
+          <w:color w:val="1F1F1F"/>
+        </w:rPr>
+        <w:t>Mar 2025 - Jan 2026</w:t>
       </w:r>
     </w:p>
     <w:p>
@@ -537,10 +508,11 @@
           <w:ilvl w:val="0"/>
           <w:numId w:val="4"/>
         </w:numPr>
+        <w:pBdr/>
         <w:bidi w:val="0"/>
-        <w:spacing w:lineRule="auto" w:line="271" w:before="0" w:after="0"/>
-        <w:ind w:hanging="360" w:left="465" w:right="0"/>
-        <w:jc w:val="left"/>
+        <w:spacing w:lineRule="auto" w:line="273" w:before="0" w:after="0"/>
+        <w:ind w:hanging="360" w:start="465" w:end="0"/>
+        <w:jc w:val="start"/>
         <w:rPr>
           <w:rFonts w:ascii="Arial" w:hAnsi="Arial" w:eastAsia="Google Sans" w:cs="Google Sans"/>
           <w:color w:val="1F1F1F"/>
@@ -551,7 +523,7 @@
           <w:rFonts w:eastAsia="Google Sans" w:cs="Google Sans" w:ascii="Arial" w:hAnsi="Arial"/>
           <w:color w:val="1F1F1F"/>
         </w:rPr>
-        <w:t>Led a content strategy transformation that aligned dev, design, and content teams to modernize site architecture and production workflows</w:t>
+        <w:t>Shifted to a UX lead capacity as team dynamics changed, designing new roles and permissions functionality, account settings experiences, and shareable graphic features</w:t>
       </w:r>
     </w:p>
     <w:p>
@@ -561,10 +533,11 @@
           <w:ilvl w:val="0"/>
           <w:numId w:val="4"/>
         </w:numPr>
+        <w:pBdr/>
         <w:bidi w:val="0"/>
-        <w:spacing w:lineRule="auto" w:line="271" w:before="0" w:after="0"/>
-        <w:ind w:hanging="360" w:left="465" w:right="0"/>
-        <w:jc w:val="left"/>
+        <w:spacing w:lineRule="auto" w:line="273" w:before="0" w:after="0"/>
+        <w:ind w:hanging="360" w:start="465" w:end="0"/>
+        <w:jc w:val="start"/>
         <w:rPr>
           <w:rFonts w:ascii="Arial" w:hAnsi="Arial" w:eastAsia="Google Sans" w:cs="Google Sans"/>
           <w:color w:val="1F1F1F"/>
@@ -575,7 +548,7 @@
           <w:rFonts w:eastAsia="Google Sans" w:cs="Google Sans" w:ascii="Arial" w:hAnsi="Arial"/>
           <w:color w:val="1F1F1F"/>
         </w:rPr>
-        <w:t>Spearheaded a comprehensive SEO content strategy overhaul for ASPCA Pet Health Insurance, achieving #1 and #2 rankings for competitive, high-intent keywords</w:t>
+        <w:t>Addressed impeding design debt and A11Y issues</w:t>
       </w:r>
     </w:p>
     <w:p>
@@ -585,10 +558,11 @@
           <w:ilvl w:val="0"/>
           <w:numId w:val="4"/>
         </w:numPr>
+        <w:pBdr/>
         <w:bidi w:val="0"/>
-        <w:spacing w:lineRule="auto" w:line="271" w:before="0" w:after="0"/>
-        <w:ind w:hanging="360" w:left="465" w:right="0"/>
-        <w:jc w:val="left"/>
+        <w:spacing w:lineRule="auto" w:line="273" w:before="0" w:after="0"/>
+        <w:ind w:hanging="360" w:start="465" w:end="0"/>
+        <w:jc w:val="start"/>
         <w:rPr>
           <w:rFonts w:ascii="Arial" w:hAnsi="Arial" w:eastAsia="Google Sans" w:cs="Google Sans"/>
           <w:color w:val="1F1F1F"/>
@@ -599,7 +573,7 @@
           <w:rFonts w:eastAsia="Google Sans" w:cs="Google Sans" w:ascii="Arial" w:hAnsi="Arial"/>
           <w:color w:val="1F1F1F"/>
         </w:rPr>
-        <w:t>Collaborated on UX/UI site optimizations that converted organic traffic into revenue, resulting in a 4x growth in organic sales within 6 months</w:t>
+        <w:t>Realigned brand voice and ethos across CRM and the Know Your Pet DNA site</w:t>
       </w:r>
     </w:p>
     <w:p>
@@ -609,10 +583,11 @@
           <w:ilvl w:val="0"/>
           <w:numId w:val="4"/>
         </w:numPr>
+        <w:pBdr/>
         <w:bidi w:val="0"/>
-        <w:spacing w:lineRule="auto" w:line="271" w:before="0" w:after="120"/>
-        <w:ind w:hanging="360" w:left="465" w:right="0"/>
-        <w:jc w:val="left"/>
+        <w:spacing w:lineRule="auto" w:line="273" w:before="0" w:after="0"/>
+        <w:ind w:hanging="360" w:start="465" w:end="0"/>
+        <w:jc w:val="start"/>
         <w:rPr>
           <w:rFonts w:ascii="Arial" w:hAnsi="Arial" w:eastAsia="Google Sans" w:cs="Google Sans"/>
           <w:color w:val="1F1F1F"/>
@@ -623,17 +598,71 @@
           <w:rFonts w:eastAsia="Google Sans" w:cs="Google Sans" w:ascii="Arial" w:hAnsi="Arial"/>
           <w:color w:val="1F1F1F"/>
         </w:rPr>
-        <w:t>Managed optimized blog content driving 80% of total organic traffic and a 92% YoY improvement in conversion rates</w:t>
+        <w:t>Leveraged member services insights to address user experience gaps within the product</w:t>
       </w:r>
     </w:p>
     <w:p>
       <w:pPr>
         <w:pStyle w:val="Normal"/>
+        <w:numPr>
+          <w:ilvl w:val="0"/>
+          <w:numId w:val="4"/>
+        </w:numPr>
+        <w:pBdr/>
         <w:bidi w:val="0"/>
-        <w:spacing w:lineRule="auto" w:line="271" w:before="240" w:after="120"/>
-        <w:jc w:val="left"/>
+        <w:spacing w:lineRule="auto" w:line="273" w:before="0" w:after="0"/>
+        <w:ind w:hanging="360" w:start="465" w:end="0"/>
+        <w:jc w:val="start"/>
+        <w:rPr>
+          <w:rFonts w:ascii="Arial" w:hAnsi="Arial" w:eastAsia="Google Sans" w:cs="Google Sans"/>
+          <w:color w:val="1F1F1F"/>
+        </w:rPr>
+      </w:pPr>
+      <w:r>
+        <w:rPr>
+          <w:rFonts w:eastAsia="Google Sans" w:cs="Google Sans" w:ascii="Arial" w:hAnsi="Arial"/>
+          <w:color w:val="1F1F1F"/>
+        </w:rPr>
+        <w:t>Conducted a comprehensive site content audit and cleanup to streamline information architecture</w:t>
+      </w:r>
+    </w:p>
+    <w:p>
+      <w:pPr>
+        <w:pStyle w:val="Normal"/>
+        <w:numPr>
+          <w:ilvl w:val="0"/>
+          <w:numId w:val="4"/>
+        </w:numPr>
+        <w:pBdr/>
+        <w:bidi w:val="0"/>
+        <w:spacing w:lineRule="auto" w:line="273" w:before="0" w:after="120"/>
+        <w:ind w:hanging="360" w:start="465" w:end="0"/>
+        <w:jc w:val="start"/>
+        <w:rPr>
+          <w:rFonts w:ascii="Arial" w:hAnsi="Arial" w:eastAsia="Google Sans" w:cs="Google Sans"/>
+          <w:color w:val="1F1F1F"/>
+        </w:rPr>
+      </w:pPr>
+      <w:r>
+        <w:rPr>
+          <w:rFonts w:eastAsia="Google Sans" w:cs="Google Sans" w:ascii="Arial" w:hAnsi="Arial"/>
+          <w:color w:val="1F1F1F"/>
+        </w:rPr>
+        <w:t>Partnered with the dev team and product stakeholders to facilitate a product migration to a new parent company, including transition of content ecosystem in Hygraph and the user experience for customer data migration</w:t>
+      </w:r>
+    </w:p>
+    <w:p>
+      <w:pPr>
+        <w:pStyle w:val="Normal"/>
+        <w:pBdr/>
+        <w:bidi w:val="0"/>
+        <w:spacing w:lineRule="auto" w:line="273" w:before="240" w:after="120"/>
+        <w:jc w:val="start"/>
         <w:rPr>
           <w:rFonts w:ascii="Arial" w:hAnsi="Arial"/>
+          <w:i w:val="false"/>
+          <w:i w:val="false"/>
+          <w:iCs w:val="false"/>
         </w:rPr>
       </w:pPr>
       <w:r>
@@ -641,41 +670,33 @@
           <w:rFonts w:eastAsia="Google Sans" w:cs="Google Sans" w:ascii="Arial" w:hAnsi="Arial"/>
           <w:b/>
           <w:bCs/>
-          <w:color w:val="1F1F1F"/>
-        </w:rPr>
-        <w:t>Ollie</w:t>
-      </w:r>
-      <w:r>
-        <w:rPr>
-          <w:rFonts w:eastAsia="Google Sans" w:cs="Google Sans" w:ascii="Arial" w:hAnsi="Arial"/>
-          <w:color w:val="1F1F1F"/>
-        </w:rPr>
-        <w:t xml:space="preserve"> | </w:t>
-      </w:r>
-      <w:r>
-        <w:rPr>
-          <w:rFonts w:eastAsia="Google Sans" w:cs="Google Sans" w:ascii="Arial" w:hAnsi="Arial"/>
+          <w:i w:val="false"/>
+          <w:iCs w:val="false"/>
+          <w:color w:val="1F1F1F"/>
+        </w:rPr>
+        <w:t>Content Strategy Manager</w:t>
+      </w:r>
+      <w:r>
+        <w:rPr>
+          <w:rFonts w:eastAsia="Google Sans" w:cs="Google Sans" w:ascii="Arial" w:hAnsi="Arial"/>
+          <w:b w:val="false"/>
+          <w:bCs w:val="false"/>
+          <w:i w:val="false"/>
+          <w:iCs w:val="false"/>
+          <w:color w:val="1F1F1F"/>
+        </w:rPr>
+        <w:t xml:space="preserve"> | Independence Pet Group | </w:t>
+      </w:r>
+      <w:r>
+        <w:rPr>
+          <w:rFonts w:eastAsia="Google Sans" w:cs="Google Sans" w:ascii="Arial" w:hAnsi="Arial"/>
+          <w:b w:val="false"/>
+          <w:bCs w:val="false"/>
           <w:i/>
           <w:iCs/>
           <w:color w:val="1F1F1F"/>
         </w:rPr>
-        <w:t xml:space="preserve">Digital Copywriter </w:t>
-      </w:r>
-      <w:r>
-        <w:rPr>
-          <w:rFonts w:eastAsia="Google Sans" w:cs="Google Sans" w:ascii="Arial" w:hAnsi="Arial"/>
-          <w:color w:val="1F1F1F"/>
-        </w:rPr>
-        <w:t xml:space="preserve">| </w:t>
-      </w:r>
-      <w:r>
-        <w:rPr>
-          <w:rFonts w:eastAsia="Google Sans" w:cs="Google Sans" w:ascii="Arial" w:hAnsi="Arial"/>
-          <w:b/>
-          <w:bCs/>
-          <w:color w:val="1F1F1F"/>
-        </w:rPr>
-        <w:t>Feb 2023 - Jun 2023</w:t>
+        <w:t>Jun 2023 - Apr 2025</w:t>
       </w:r>
     </w:p>
     <w:p>
@@ -685,10 +706,11 @@
           <w:ilvl w:val="0"/>
           <w:numId w:val="5"/>
         </w:numPr>
+        <w:pBdr/>
         <w:bidi w:val="0"/>
-        <w:spacing w:lineRule="auto" w:line="271" w:before="0" w:after="120"/>
-        <w:ind w:hanging="360" w:left="465" w:right="0"/>
-        <w:jc w:val="left"/>
+        <w:spacing w:lineRule="auto" w:line="273" w:before="0" w:after="0"/>
+        <w:ind w:hanging="360" w:start="465" w:end="0"/>
+        <w:jc w:val="start"/>
         <w:rPr>
           <w:rFonts w:ascii="Arial" w:hAnsi="Arial" w:eastAsia="Google Sans" w:cs="Google Sans"/>
           <w:color w:val="1F1F1F"/>
@@ -699,59 +721,7 @@
           <w:rFonts w:eastAsia="Google Sans" w:cs="Google Sans" w:ascii="Arial" w:hAnsi="Arial"/>
           <w:color w:val="1F1F1F"/>
         </w:rPr>
-        <w:t>Email marketing campaigns, paid media (paid social, affiliate marketing, search), landing pages, and other creative copy</w:t>
-      </w:r>
-    </w:p>
-    <w:p>
-      <w:pPr>
-        <w:pStyle w:val="Normal"/>
-        <w:bidi w:val="0"/>
-        <w:spacing w:lineRule="auto" w:line="271" w:before="240" w:after="120"/>
-        <w:jc w:val="left"/>
-        <w:rPr>
-          <w:rFonts w:ascii="Arial" w:hAnsi="Arial"/>
-        </w:rPr>
-      </w:pPr>
-      <w:r>
-        <w:rPr>
-          <w:rFonts w:eastAsia="Google Sans" w:cs="Google Sans" w:ascii="Arial" w:hAnsi="Arial"/>
-          <w:b/>
-          <w:bCs/>
-          <w:color w:val="1F1F1F"/>
-        </w:rPr>
-        <w:t>Pinterest</w:t>
-      </w:r>
-      <w:r>
-        <w:rPr>
-          <w:rFonts w:eastAsia="Google Sans" w:cs="Google Sans" w:ascii="Arial" w:hAnsi="Arial"/>
-          <w:color w:val="1F1F1F"/>
-        </w:rPr>
-        <w:t xml:space="preserve"> | </w:t>
-      </w:r>
-      <w:r>
-        <w:rPr>
-          <w:rFonts w:eastAsia="Google Sans" w:cs="Google Sans" w:ascii="Arial" w:hAnsi="Arial"/>
-          <w:i/>
-          <w:iCs/>
-          <w:color w:val="1F1F1F"/>
-        </w:rPr>
-        <w:t xml:space="preserve">Editorial Content Writer </w:t>
-      </w:r>
-      <w:r>
-        <w:rPr>
-          <w:rFonts w:eastAsia="Google Sans" w:cs="Google Sans" w:ascii="Arial" w:hAnsi="Arial"/>
-          <w:color w:val="1F1F1F"/>
-        </w:rPr>
-        <w:t xml:space="preserve">| </w:t>
-      </w:r>
-      <w:r>
-        <w:rPr>
-          <w:rFonts w:eastAsia="Google Sans" w:cs="Google Sans" w:ascii="Arial" w:hAnsi="Arial"/>
-          <w:b/>
-          <w:bCs/>
-          <w:color w:val="1F1F1F"/>
-        </w:rPr>
-        <w:t>Jun 2022 - Feb 2023</w:t>
+        <w:t>Led a content strategy transformation that aligned dev, design, and content teams to modernize site architecture and production workflows</w:t>
       </w:r>
     </w:p>
     <w:p>
@@ -761,10 +731,11 @@
           <w:ilvl w:val="0"/>
           <w:numId w:val="5"/>
         </w:numPr>
+        <w:pBdr/>
         <w:bidi w:val="0"/>
-        <w:spacing w:lineRule="auto" w:line="271" w:before="0" w:after="0"/>
-        <w:ind w:hanging="360" w:left="465" w:right="0"/>
-        <w:jc w:val="left"/>
+        <w:spacing w:lineRule="auto" w:line="273" w:before="0" w:after="0"/>
+        <w:ind w:hanging="360" w:start="465" w:end="0"/>
+        <w:jc w:val="start"/>
         <w:rPr>
           <w:rFonts w:ascii="Arial" w:hAnsi="Arial" w:eastAsia="Google Sans" w:cs="Google Sans"/>
           <w:color w:val="1F1F1F"/>
@@ -775,7 +746,7 @@
           <w:rFonts w:eastAsia="Google Sans" w:cs="Google Sans" w:ascii="Arial" w:hAnsi="Arial"/>
           <w:color w:val="1F1F1F"/>
         </w:rPr>
-        <w:t>Managed daily content for Today's Inspiration and Shopping Spotlight surfaces across a wide range of verticals—approximately 1,500 pieces of content</w:t>
+        <w:t>Spearheaded a comprehensive SEO content strategy overhaul for ASPCA Pet Health Insurance, achieving #1 and #2 rankings for competitive, high-intent keywords</w:t>
       </w:r>
     </w:p>
     <w:p>
@@ -785,10 +756,11 @@
           <w:ilvl w:val="0"/>
           <w:numId w:val="5"/>
         </w:numPr>
+        <w:pBdr/>
         <w:bidi w:val="0"/>
-        <w:spacing w:lineRule="auto" w:line="271" w:before="0" w:after="0"/>
-        <w:ind w:hanging="360" w:left="465" w:right="0"/>
-        <w:jc w:val="left"/>
+        <w:spacing w:lineRule="auto" w:line="273" w:before="0" w:after="0"/>
+        <w:ind w:hanging="360" w:start="465" w:end="0"/>
+        <w:jc w:val="start"/>
         <w:rPr>
           <w:rFonts w:ascii="Arial" w:hAnsi="Arial" w:eastAsia="Google Sans" w:cs="Google Sans"/>
           <w:color w:val="1F1F1F"/>
@@ -799,7 +771,7 @@
           <w:rFonts w:eastAsia="Google Sans" w:cs="Google Sans" w:ascii="Arial" w:hAnsi="Arial"/>
           <w:color w:val="1F1F1F"/>
         </w:rPr>
-        <w:t>Handled content management, curation, scheduling, and trend identification on and off-platform</w:t>
+        <w:t>Collaborated on UX/UI site optimizations that converted organic traffic into revenue, resulting in a 4x growth in organic sales within 6 months</w:t>
       </w:r>
     </w:p>
     <w:p>
@@ -809,10 +781,11 @@
           <w:ilvl w:val="0"/>
           <w:numId w:val="5"/>
         </w:numPr>
+        <w:pBdr/>
         <w:bidi w:val="0"/>
-        <w:spacing w:lineRule="auto" w:line="271" w:before="0" w:after="0"/>
-        <w:ind w:hanging="360" w:left="465" w:right="0"/>
-        <w:jc w:val="left"/>
+        <w:spacing w:lineRule="auto" w:line="273" w:before="0" w:after="120"/>
+        <w:ind w:hanging="360" w:start="465" w:end="0"/>
+        <w:jc w:val="start"/>
         <w:rPr>
           <w:rFonts w:ascii="Arial" w:hAnsi="Arial" w:eastAsia="Google Sans" w:cs="Google Sans"/>
           <w:color w:val="1F1F1F"/>
@@ -823,48 +796,56 @@
           <w:rFonts w:eastAsia="Google Sans" w:cs="Google Sans" w:ascii="Arial" w:hAnsi="Arial"/>
           <w:color w:val="1F1F1F"/>
         </w:rPr>
-        <w:t>Drafted engaging copy for email marketing, landing pages, and paid media including social, affiliate, and search</w:t>
+        <w:t>Managed optimized blog content driving 80% of total organic traffic and a 92% YoY improvement in conversion rates</w:t>
       </w:r>
     </w:p>
     <w:p>
       <w:pPr>
         <w:pStyle w:val="Normal"/>
-        <w:numPr>
-          <w:ilvl w:val="0"/>
-          <w:numId w:val="5"/>
-        </w:numPr>
         <w:bidi w:val="0"/>
-        <w:spacing w:lineRule="auto" w:line="271" w:before="0" w:after="120"/>
-        <w:ind w:hanging="360" w:left="465" w:right="0"/>
-        <w:jc w:val="left"/>
-        <w:rPr>
-          <w:rFonts w:ascii="Arial" w:hAnsi="Arial" w:eastAsia="Google Sans" w:cs="Google Sans"/>
-          <w:color w:val="1F1F1F"/>
-        </w:rPr>
-      </w:pPr>
-      <w:r>
-        <w:rPr>
-          <w:rFonts w:eastAsia="Google Sans" w:cs="Google Sans" w:ascii="Arial" w:hAnsi="Arial"/>
-          <w:color w:val="1F1F1F"/>
-        </w:rPr>
-        <w:t>Assisted on cross-functional projects for paid social campaigns and creator teams, including music curation and features for Vogue and Allure</w:t>
-      </w:r>
-    </w:p>
-    <w:p>
-      <w:pPr>
-        <w:pStyle w:val="Heading3"/>
-        <w:spacing w:lineRule="auto" w:line="271" w:before="240" w:after="120"/>
-        <w:rPr>
-          <w:rFonts w:ascii="Arial" w:hAnsi="Arial" w:eastAsia="Google Sans" w:cs="Google Sans"/>
-          <w:color w:val="1F1F1F"/>
-        </w:rPr>
-      </w:pPr>
-      <w:r>
-        <w:rPr>
-          <w:rFonts w:eastAsia="Google Sans" w:cs="Google Sans" w:ascii="Arial" w:hAnsi="Arial"/>
-          <w:color w:val="1F1F1F"/>
-        </w:rPr>
-        <w:t>Education &amp; Certifications</w:t>
+        <w:spacing w:lineRule="auto" w:line="273" w:before="240" w:after="120"/>
+        <w:jc w:val="start"/>
+        <w:rPr>
+          <w:rFonts w:ascii="Arial" w:hAnsi="Arial"/>
+          <w:b w:val="false"/>
+          <w:bCs w:val="false"/>
+          <w:i w:val="false"/>
+          <w:i w:val="false"/>
+          <w:iCs w:val="false"/>
+        </w:rPr>
+      </w:pPr>
+      <w:r>
+        <w:rPr>
+          <w:rFonts w:eastAsia="Google Sans" w:cs="Google Sans" w:ascii="Arial" w:hAnsi="Arial"/>
+          <w:b/>
+          <w:bCs/>
+          <w:i w:val="false"/>
+          <w:iCs w:val="false"/>
+          <w:color w:val="1F1F1F"/>
+        </w:rPr>
+        <w:t>Digital Copywriter</w:t>
+      </w:r>
+      <w:r>
+        <w:rPr>
+          <w:rFonts w:eastAsia="Google Sans" w:cs="Google Sans" w:ascii="Arial" w:hAnsi="Arial"/>
+          <w:b w:val="false"/>
+          <w:bCs w:val="false"/>
+          <w:i w:val="false"/>
+          <w:iCs w:val="false"/>
+          <w:color w:val="1F1F1F"/>
+        </w:rPr>
+        <w:t xml:space="preserve"> | Ollie | </w:t>
+      </w:r>
+      <w:r>
+        <w:rPr>
+          <w:rFonts w:eastAsia="Google Sans" w:cs="Google Sans" w:ascii="Arial" w:hAnsi="Arial"/>
+          <w:b w:val="false"/>
+          <w:bCs w:val="false"/>
+          <w:i/>
+          <w:iCs/>
+          <w:color w:val="1F1F1F"/>
+        </w:rPr>
+        <w:t>Feb 2023 - Jun 2023</w:t>
       </w:r>
     </w:p>
     <w:p>
@@ -875,9 +856,9 @@
           <w:numId w:val="6"/>
         </w:numPr>
         <w:bidi w:val="0"/>
-        <w:spacing w:lineRule="auto" w:line="271" w:before="0" w:after="0"/>
-        <w:ind w:hanging="360" w:left="465" w:right="0"/>
-        <w:jc w:val="left"/>
+        <w:spacing w:lineRule="auto" w:line="273" w:before="0" w:after="120"/>
+        <w:ind w:hanging="360" w:start="465" w:end="0"/>
+        <w:jc w:val="start"/>
         <w:rPr>
           <w:rFonts w:ascii="Arial" w:hAnsi="Arial" w:eastAsia="Google Sans" w:cs="Google Sans"/>
           <w:color w:val="1F1F1F"/>
@@ -888,7 +869,57 @@
           <w:rFonts w:eastAsia="Google Sans" w:cs="Google Sans" w:ascii="Arial" w:hAnsi="Arial"/>
           <w:color w:val="1F1F1F"/>
         </w:rPr>
-        <w:t>Google UX Design Professional Certificate</w:t>
+        <w:t>Email marketing campaigns, paid media (paid social, affiliate marketing, search), landing pages, and other creative copy</w:t>
+      </w:r>
+    </w:p>
+    <w:p>
+      <w:pPr>
+        <w:pStyle w:val="Normal"/>
+        <w:pBdr/>
+        <w:bidi w:val="0"/>
+        <w:spacing w:lineRule="auto" w:line="273" w:before="240" w:after="120"/>
+        <w:jc w:val="start"/>
+        <w:rPr>
+          <w:rFonts w:ascii="Arial" w:hAnsi="Arial"/>
+          <w:b w:val="false"/>
+          <w:bCs w:val="false"/>
+          <w:i w:val="false"/>
+          <w:i w:val="false"/>
+          <w:iCs w:val="false"/>
+        </w:rPr>
+      </w:pPr>
+      <w:r>
+        <w:rPr>
+          <w:rFonts w:eastAsia="Google Sans" w:cs="Google Sans" w:ascii="Arial" w:hAnsi="Arial"/>
+          <w:b/>
+          <w:bCs/>
+          <w:i w:val="false"/>
+          <w:iCs w:val="false"/>
+          <w:color w:val="1F1F1F"/>
+        </w:rPr>
+        <w:t>Editorial Content Writer</w:t>
+      </w:r>
+      <w:r>
+        <w:rPr>
+          <w:rFonts w:eastAsia="Google Sans" w:cs="Google Sans" w:ascii="Arial" w:hAnsi="Arial"/>
+          <w:b w:val="false"/>
+          <w:bCs w:val="false"/>
+          <w:i w:val="false"/>
+          <w:iCs w:val="false"/>
+          <w:color w:val="1F1F1F"/>
+        </w:rPr>
+        <w:t xml:space="preserve"> | Pinterest | </w:t>
+      </w:r>
+      <w:r>
+        <w:rPr>
+          <w:rFonts w:eastAsia="Google Sans" w:cs="Google Sans" w:ascii="Arial" w:hAnsi="Arial"/>
+          <w:b w:val="false"/>
+          <w:bCs w:val="false"/>
+          <w:i/>
+          <w:iCs/>
+          <w:color w:val="1F1F1F"/>
+        </w:rPr>
+        <w:t>Jun 2022 - Feb 2023</w:t>
       </w:r>
     </w:p>
     <w:p>
@@ -898,10 +929,11 @@
           <w:ilvl w:val="0"/>
           <w:numId w:val="6"/>
         </w:numPr>
+        <w:pBdr/>
         <w:bidi w:val="0"/>
-        <w:spacing w:lineRule="auto" w:line="271" w:before="0" w:after="0"/>
-        <w:ind w:hanging="360" w:left="465" w:right="0"/>
-        <w:jc w:val="left"/>
+        <w:spacing w:lineRule="auto" w:line="273" w:before="0" w:after="0"/>
+        <w:ind w:hanging="360" w:start="465" w:end="0"/>
+        <w:jc w:val="start"/>
         <w:rPr>
           <w:rFonts w:ascii="Arial" w:hAnsi="Arial" w:eastAsia="Google Sans" w:cs="Google Sans"/>
           <w:color w:val="1F1F1F"/>
@@ -912,7 +944,7 @@
           <w:rFonts w:eastAsia="Google Sans" w:cs="Google Sans" w:ascii="Arial" w:hAnsi="Arial"/>
           <w:color w:val="1F1F1F"/>
         </w:rPr>
-        <w:t>W3Schools Certified Accessibility Practitioner</w:t>
+        <w:t>Managed daily content for Today's Inspiration and Shopping Spotlight surfaces across a wide range of verticals—approximately 1,500 pieces of content</w:t>
       </w:r>
     </w:p>
     <w:p>
@@ -922,10 +954,11 @@
           <w:ilvl w:val="0"/>
           <w:numId w:val="6"/>
         </w:numPr>
+        <w:pBdr/>
         <w:bidi w:val="0"/>
-        <w:spacing w:lineRule="auto" w:line="271" w:before="0" w:after="120"/>
-        <w:ind w:hanging="360" w:left="465" w:right="0"/>
-        <w:jc w:val="left"/>
+        <w:spacing w:lineRule="auto" w:line="273" w:before="0" w:after="0"/>
+        <w:ind w:hanging="360" w:start="465" w:end="0"/>
+        <w:jc w:val="start"/>
         <w:rPr>
           <w:rFonts w:ascii="Arial" w:hAnsi="Arial" w:eastAsia="Google Sans" w:cs="Google Sans"/>
           <w:color w:val="1F1F1F"/>
@@ -936,15 +969,159 @@
           <w:rFonts w:eastAsia="Google Sans" w:cs="Google Sans" w:ascii="Arial" w:hAnsi="Arial"/>
           <w:color w:val="1F1F1F"/>
         </w:rPr>
+        <w:t>Handled content management, curation, scheduling, and trend identification on and off-platform</w:t>
+      </w:r>
+    </w:p>
+    <w:p>
+      <w:pPr>
+        <w:pStyle w:val="Normal"/>
+        <w:numPr>
+          <w:ilvl w:val="0"/>
+          <w:numId w:val="6"/>
+        </w:numPr>
+        <w:pBdr/>
+        <w:bidi w:val="0"/>
+        <w:spacing w:lineRule="auto" w:line="273" w:before="0" w:after="0"/>
+        <w:ind w:hanging="360" w:start="465" w:end="0"/>
+        <w:jc w:val="start"/>
+        <w:rPr>
+          <w:rFonts w:ascii="Arial" w:hAnsi="Arial" w:eastAsia="Google Sans" w:cs="Google Sans"/>
+          <w:color w:val="1F1F1F"/>
+        </w:rPr>
+      </w:pPr>
+      <w:r>
+        <w:rPr>
+          <w:rFonts w:eastAsia="Google Sans" w:cs="Google Sans" w:ascii="Arial" w:hAnsi="Arial"/>
+          <w:color w:val="1F1F1F"/>
+        </w:rPr>
+        <w:t>Drafted engaging copy for email marketing, landing pages, and paid media including social, affiliate, and search</w:t>
+      </w:r>
+    </w:p>
+    <w:p>
+      <w:pPr>
+        <w:pStyle w:val="Normal"/>
+        <w:numPr>
+          <w:ilvl w:val="0"/>
+          <w:numId w:val="6"/>
+        </w:numPr>
+        <w:pBdr/>
+        <w:bidi w:val="0"/>
+        <w:spacing w:lineRule="auto" w:line="273" w:before="0" w:after="120"/>
+        <w:ind w:hanging="360" w:start="465" w:end="0"/>
+        <w:jc w:val="start"/>
+        <w:rPr>
+          <w:rFonts w:ascii="Arial" w:hAnsi="Arial" w:eastAsia="Google Sans" w:cs="Google Sans"/>
+          <w:color w:val="1F1F1F"/>
+        </w:rPr>
+      </w:pPr>
+      <w:r>
+        <w:rPr>
+          <w:rFonts w:eastAsia="Google Sans" w:cs="Google Sans" w:ascii="Arial" w:hAnsi="Arial"/>
+          <w:color w:val="1F1F1F"/>
+        </w:rPr>
+        <w:t>Assisted on cross-functional projects for paid social campaigns and creator teams, including music curation and features for Vogue and Allure</w:t>
+      </w:r>
+    </w:p>
+    <w:p>
+      <w:pPr>
+        <w:pStyle w:val="Heading3"/>
+        <w:pBdr/>
+        <w:spacing w:lineRule="auto" w:line="273" w:before="240" w:after="120"/>
+        <w:rPr>
+          <w:rFonts w:ascii="Arial" w:hAnsi="Arial" w:eastAsia="Google Sans" w:cs="Google Sans"/>
+          <w:color w:val="1F1F1F"/>
+        </w:rPr>
+      </w:pPr>
+      <w:r>
+        <w:rPr>
+          <w:rFonts w:eastAsia="Google Sans" w:cs="Google Sans" w:ascii="Arial" w:hAnsi="Arial"/>
+          <w:color w:val="1F1F1F"/>
+        </w:rPr>
+        <w:t>Certifications</w:t>
+      </w:r>
+    </w:p>
+    <w:p>
+      <w:pPr>
+        <w:pStyle w:val="Normal"/>
+        <w:numPr>
+          <w:ilvl w:val="0"/>
+          <w:numId w:val="7"/>
+        </w:numPr>
+        <w:pBdr/>
+        <w:bidi w:val="0"/>
+        <w:spacing w:lineRule="auto" w:line="273" w:before="0" w:after="0"/>
+        <w:ind w:hanging="360" w:start="465" w:end="0"/>
+        <w:jc w:val="start"/>
+        <w:rPr>
+          <w:rFonts w:ascii="Arial" w:hAnsi="Arial" w:eastAsia="Google Sans" w:cs="Google Sans"/>
+          <w:color w:val="1F1F1F"/>
+        </w:rPr>
+      </w:pPr>
+      <w:r>
+        <w:rPr>
+          <w:rFonts w:eastAsia="Google Sans" w:cs="Google Sans" w:ascii="Arial" w:hAnsi="Arial"/>
+          <w:color w:val="1F1F1F"/>
+        </w:rPr>
+        <w:t>Google UX Design Professional Certificate</w:t>
+      </w:r>
+    </w:p>
+    <w:p>
+      <w:pPr>
+        <w:pStyle w:val="Normal"/>
+        <w:numPr>
+          <w:ilvl w:val="0"/>
+          <w:numId w:val="7"/>
+        </w:numPr>
+        <w:pBdr/>
+        <w:bidi w:val="0"/>
+        <w:spacing w:lineRule="auto" w:line="273" w:before="0" w:after="0"/>
+        <w:ind w:hanging="360" w:start="465" w:end="0"/>
+        <w:jc w:val="start"/>
+        <w:rPr>
+          <w:rFonts w:ascii="Arial" w:hAnsi="Arial" w:eastAsia="Google Sans" w:cs="Google Sans"/>
+          <w:color w:val="1F1F1F"/>
+        </w:rPr>
+      </w:pPr>
+      <w:r>
+        <w:rPr>
+          <w:rFonts w:eastAsia="Google Sans" w:cs="Google Sans" w:ascii="Arial" w:hAnsi="Arial"/>
+          <w:color w:val="1F1F1F"/>
+        </w:rPr>
+        <w:t>W3Schools Certified Accessibility Practitioner</w:t>
+      </w:r>
+    </w:p>
+    <w:p>
+      <w:pPr>
+        <w:pStyle w:val="Normal"/>
+        <w:numPr>
+          <w:ilvl w:val="0"/>
+          <w:numId w:val="7"/>
+        </w:numPr>
+        <w:pBdr/>
+        <w:bidi w:val="0"/>
+        <w:spacing w:lineRule="auto" w:line="273" w:before="0" w:after="120"/>
+        <w:ind w:hanging="360" w:start="465" w:end="0"/>
+        <w:jc w:val="start"/>
+        <w:rPr>
+          <w:rFonts w:ascii="Arial" w:hAnsi="Arial" w:eastAsia="Google Sans" w:cs="Google Sans"/>
+          <w:color w:val="1F1F1F"/>
+        </w:rPr>
+      </w:pPr>
+      <w:r>
+        <w:rPr>
+          <w:rFonts w:eastAsia="Google Sans" w:cs="Google Sans" w:ascii="Arial" w:hAnsi="Arial"/>
+          <w:color w:val="1F1F1F"/>
+        </w:rPr>
         <w:t>HubSpot Academy: SEO I, SEO II, Content Marketing, and Inbound Marketing</w:t>
       </w:r>
     </w:p>
     <w:p>
       <w:pPr>
         <w:pStyle w:val="Normal"/>
+        <w:pBdr/>
         <w:bidi w:val="0"/>
-        <w:spacing w:lineRule="auto" w:line="271" w:before="240" w:after="120"/>
-        <w:jc w:val="left"/>
+        <w:spacing w:lineRule="auto" w:line="273" w:before="240" w:after="120"/>
+        <w:jc w:val="start"/>
         <w:rPr>
           <w:rFonts w:ascii="Arial" w:hAnsi="Arial" w:eastAsia="Google Sans" w:cs="Google Sans"/>
           <w:b/>
@@ -959,7 +1136,7 @@
           <w:bCs/>
           <w:color w:val="1F1F1F"/>
         </w:rPr>
-        <w:t>Technical Toolkit</w:t>
+        <w:t>Tools</w:t>
       </w:r>
     </w:p>
     <w:p>
@@ -967,12 +1144,13 @@
         <w:pStyle w:val="Normal"/>
         <w:numPr>
           <w:ilvl w:val="0"/>
-          <w:numId w:val="1"/>
+          <w:numId w:val="2"/>
         </w:numPr>
+        <w:pBdr/>
         <w:bidi w:val="0"/>
-        <w:spacing w:lineRule="auto" w:line="271" w:before="0" w:after="0"/>
-        <w:ind w:hanging="360" w:left="465" w:right="0"/>
-        <w:jc w:val="left"/>
+        <w:spacing w:lineRule="auto" w:line="273" w:before="0" w:after="0"/>
+        <w:ind w:hanging="360" w:start="465" w:end="0"/>
+        <w:jc w:val="start"/>
         <w:rPr>
           <w:rFonts w:ascii="Arial" w:hAnsi="Arial" w:eastAsia="Google Sans" w:cs="Google Sans"/>
           <w:color w:val="1F1F1F"/>
@@ -991,12 +1169,13 @@
         <w:pStyle w:val="Normal"/>
         <w:numPr>
           <w:ilvl w:val="0"/>
-          <w:numId w:val="1"/>
+          <w:numId w:val="2"/>
         </w:numPr>
+        <w:pBdr/>
         <w:bidi w:val="0"/>
-        <w:spacing w:lineRule="auto" w:line="271" w:before="0" w:after="0"/>
-        <w:ind w:hanging="360" w:left="465" w:right="0"/>
-        <w:jc w:val="left"/>
+        <w:spacing w:lineRule="auto" w:line="273" w:before="0" w:after="0"/>
+        <w:ind w:hanging="360" w:start="465" w:end="0"/>
+        <w:jc w:val="start"/>
         <w:rPr>
           <w:rFonts w:ascii="Arial" w:hAnsi="Arial" w:eastAsia="Google Sans" w:cs="Google Sans"/>
           <w:color w:val="1F1F1F"/>
@@ -1007,7 +1186,7 @@
           <w:rFonts w:eastAsia="Google Sans" w:cs="Google Sans" w:ascii="Arial" w:hAnsi="Arial"/>
           <w:color w:val="1F1F1F"/>
         </w:rPr>
-        <w:t>Planning &amp; Collaboration: FigJam, Miro, Notion, Asana, Monday.com, Airtable</w:t>
+        <w:t>AI &amp; Development: Claude, OpenCode, HTML5, CSS, basic JavaScript</w:t>
       </w:r>
     </w:p>
     <w:p>
@@ -1015,12 +1194,13 @@
         <w:pStyle w:val="Normal"/>
         <w:numPr>
           <w:ilvl w:val="0"/>
-          <w:numId w:val="1"/>
+          <w:numId w:val="2"/>
         </w:numPr>
+        <w:pBdr/>
         <w:bidi w:val="0"/>
-        <w:spacing w:lineRule="auto" w:line="271" w:before="0" w:after="0"/>
-        <w:ind w:hanging="360" w:left="465" w:right="0"/>
-        <w:jc w:val="left"/>
+        <w:spacing w:lineRule="auto" w:line="273" w:before="0" w:after="0"/>
+        <w:ind w:hanging="360" w:start="465" w:end="0"/>
+        <w:jc w:val="start"/>
         <w:rPr>
           <w:rFonts w:ascii="Arial" w:hAnsi="Arial" w:eastAsia="Google Sans" w:cs="Google Sans"/>
           <w:color w:val="1F1F1F"/>
@@ -1031,7 +1211,7 @@
           <w:rFonts w:eastAsia="Google Sans" w:cs="Google Sans" w:ascii="Arial" w:hAnsi="Arial"/>
           <w:color w:val="1F1F1F"/>
         </w:rPr>
-        <w:t>CMS: Contentful, Hygraph, WordPress, Umbraco, Drupal, AEM, HubSpot</w:t>
+        <w:t>Planning &amp; Collaboration: FigJam, Miro, Notion, Asana, Monday.com, Airtable</w:t>
       </w:r>
     </w:p>
     <w:p>
@@ -1039,12 +1219,13 @@
         <w:pStyle w:val="Normal"/>
         <w:numPr>
           <w:ilvl w:val="0"/>
-          <w:numId w:val="1"/>
+          <w:numId w:val="2"/>
         </w:numPr>
+        <w:pBdr/>
         <w:bidi w:val="0"/>
-        <w:spacing w:lineRule="auto" w:line="271" w:before="0" w:after="120"/>
-        <w:ind w:hanging="360" w:left="465" w:right="0"/>
-        <w:jc w:val="left"/>
+        <w:spacing w:lineRule="auto" w:line="273" w:before="0" w:after="0"/>
+        <w:ind w:hanging="360" w:start="465" w:end="0"/>
+        <w:jc w:val="start"/>
         <w:rPr>
           <w:rFonts w:ascii="Arial" w:hAnsi="Arial" w:eastAsia="Google Sans" w:cs="Google Sans"/>
           <w:color w:val="1F1F1F"/>
@@ -1055,7 +1236,14 @@
           <w:rFonts w:eastAsia="Google Sans" w:cs="Google Sans" w:ascii="Arial" w:hAnsi="Arial"/>
           <w:color w:val="1F1F1F"/>
         </w:rPr>
-        <w:t>Web Fundamentals: HTML5 CSS, Responsive Design Principles</w:t>
+        <w:t>CMS: Contentful, Hygraph, WordPress, Umbraco, Drupal, AEM, HubSpo</w:t>
+      </w:r>
+      <w:r>
+        <w:rPr>
+          <w:rFonts w:eastAsia="Google Sans" w:cs="Google Sans" w:ascii="Arial" w:hAnsi="Arial"/>
+          <w:color w:val="1F1F1F"/>
+        </w:rPr>
+        <w:t>t</w:t>
       </w:r>
     </w:p>
     <w:sectPr>
@@ -1076,273 +1264,120 @@
   <w:abstractNum w:abstractNumId="1">
     <w:lvl w:ilvl="0">
       <w:start w:val="1"/>
-      <w:numFmt w:val="bullet"/>
-      <w:lvlText w:val="●"/>
-      <w:lvlJc w:val="left"/>
-      <w:pPr>
-        <w:tabs>
-          <w:tab w:val="num" w:pos="0"/>
-        </w:tabs>
-        <w:ind w:left="465" w:hanging="360"/>
-      </w:pPr>
-      <w:rPr>
-        <w:rFonts w:ascii="Arial" w:hAnsi="Arial" w:cs="Arial" w:hint="default"/>
-        <w:smallCaps w:val="false"/>
-        <w:caps w:val="false"/>
-        <w:dstrike w:val="false"/>
-        <w:strike w:val="false"/>
-        <w:vertAlign w:val="baseline"/>
-        <w:position w:val="0"/>
-        <w:sz w:val="22"/>
-        <w:sz w:val="22"/>
-        <w:i w:val="false"/>
-        <w:u w:val="none"/>
-        <w:b w:val="false"/>
-        <w:szCs w:val="22"/>
-        <w:iCs w:val="false"/>
-        <w:bCs w:val="false"/>
-        <w:color w:val="000000"/>
-      </w:rPr>
+      <w:numFmt w:val="none"/>
+      <w:suff w:val="nothing"/>
+      <w:lvlText w:val="%1"/>
+      <w:lvlJc w:val="start"/>
+      <w:pPr>
+        <w:tabs>
+          <w:tab w:val="num" w:pos="0"/>
+        </w:tabs>
+        <w:ind w:start="0" w:hanging="0"/>
+      </w:pPr>
     </w:lvl>
     <w:lvl w:ilvl="1">
       <w:start w:val="1"/>
-      <w:numFmt w:val="bullet"/>
-      <w:lvlText w:val="○"/>
-      <w:lvlJc w:val="left"/>
-      <w:pPr>
-        <w:tabs>
-          <w:tab w:val="num" w:pos="0"/>
-        </w:tabs>
-        <w:ind w:left="1440" w:hanging="360"/>
-      </w:pPr>
-      <w:rPr>
-        <w:rFonts w:ascii="Arial" w:hAnsi="Arial" w:cs="Arial" w:hint="default"/>
-        <w:smallCaps w:val="false"/>
-        <w:caps w:val="false"/>
-        <w:dstrike w:val="false"/>
-        <w:strike w:val="false"/>
-        <w:vertAlign w:val="baseline"/>
-        <w:position w:val="0"/>
-        <w:sz w:val="22"/>
-        <w:sz w:val="22"/>
-        <w:i w:val="false"/>
-        <w:u w:val="none"/>
-        <w:b w:val="false"/>
-        <w:szCs w:val="22"/>
-        <w:iCs w:val="false"/>
-        <w:bCs w:val="false"/>
-        <w:color w:val="000000"/>
-      </w:rPr>
+      <w:numFmt w:val="none"/>
+      <w:suff w:val="nothing"/>
+      <w:lvlText w:val="%2"/>
+      <w:lvlJc w:val="start"/>
+      <w:pPr>
+        <w:tabs>
+          <w:tab w:val="num" w:pos="0"/>
+        </w:tabs>
+        <w:ind w:start="0" w:hanging="0"/>
+      </w:pPr>
     </w:lvl>
     <w:lvl w:ilvl="2">
       <w:start w:val="1"/>
-      <w:numFmt w:val="bullet"/>
-      <w:lvlText w:val="■"/>
-      <w:lvlJc w:val="left"/>
-      <w:pPr>
-        <w:tabs>
-          <w:tab w:val="num" w:pos="0"/>
-        </w:tabs>
-        <w:ind w:left="2160" w:hanging="360"/>
-      </w:pPr>
-      <w:rPr>
-        <w:rFonts w:ascii="Arial" w:hAnsi="Arial" w:cs="Arial" w:hint="default"/>
-        <w:smallCaps w:val="false"/>
-        <w:caps w:val="false"/>
-        <w:dstrike w:val="false"/>
-        <w:strike w:val="false"/>
-        <w:vertAlign w:val="baseline"/>
-        <w:position w:val="0"/>
-        <w:sz w:val="22"/>
-        <w:sz w:val="22"/>
-        <w:i w:val="false"/>
-        <w:u w:val="none"/>
-        <w:b w:val="false"/>
-        <w:szCs w:val="22"/>
-        <w:iCs w:val="false"/>
-        <w:bCs w:val="false"/>
-        <w:color w:val="000000"/>
-      </w:rPr>
+      <w:numFmt w:val="none"/>
+      <w:suff w:val="nothing"/>
+      <w:lvlText w:val="%3"/>
+      <w:lvlJc w:val="start"/>
+      <w:pPr>
+        <w:tabs>
+          <w:tab w:val="num" w:pos="0"/>
+        </w:tabs>
+        <w:ind w:start="0" w:hanging="0"/>
+      </w:pPr>
     </w:lvl>
     <w:lvl w:ilvl="3">
       <w:start w:val="1"/>
-      <w:numFmt w:val="bullet"/>
-      <w:lvlText w:val="■"/>
-      <w:lvlJc w:val="left"/>
-      <w:pPr>
-        <w:tabs>
-          <w:tab w:val="num" w:pos="0"/>
-        </w:tabs>
-        <w:ind w:left="2880" w:hanging="360"/>
-      </w:pPr>
-      <w:rPr>
-        <w:rFonts w:ascii="Arial" w:hAnsi="Arial" w:cs="Arial" w:hint="default"/>
-        <w:smallCaps w:val="false"/>
-        <w:caps w:val="false"/>
-        <w:dstrike w:val="false"/>
-        <w:strike w:val="false"/>
-        <w:vertAlign w:val="baseline"/>
-        <w:position w:val="0"/>
-        <w:sz w:val="22"/>
-        <w:sz w:val="22"/>
-        <w:i w:val="false"/>
-        <w:u w:val="none"/>
-        <w:b w:val="false"/>
-        <w:szCs w:val="22"/>
-        <w:iCs w:val="false"/>
-        <w:bCs w:val="false"/>
-        <w:color w:val="000000"/>
-      </w:rPr>
+      <w:numFmt w:val="none"/>
+      <w:suff w:val="nothing"/>
+      <w:lvlText w:val="%4"/>
+      <w:lvlJc w:val="start"/>
+      <w:pPr>
+        <w:tabs>
+          <w:tab w:val="num" w:pos="0"/>
+        </w:tabs>
+        <w:ind w:start="0" w:hanging="0"/>
+      </w:pPr>
     </w:lvl>
     <w:lvl w:ilvl="4">
       <w:start w:val="1"/>
-      <w:numFmt w:val="bullet"/>
-      <w:lvlText w:val="■"/>
-      <w:lvlJc w:val="left"/>
-      <w:pPr>
-        <w:tabs>
-          <w:tab w:val="num" w:pos="0"/>
-        </w:tabs>
-        <w:ind w:left="3600" w:hanging="360"/>
-      </w:pPr>
-      <w:rPr>
-        <w:rFonts w:ascii="Arial" w:hAnsi="Arial" w:cs="Arial" w:hint="default"/>
-        <w:smallCaps w:val="false"/>
-        <w:caps w:val="false"/>
-        <w:dstrike w:val="false"/>
-        <w:strike w:val="false"/>
-        <w:vertAlign w:val="baseline"/>
-        <w:position w:val="0"/>
-        <w:sz w:val="22"/>
-        <w:sz w:val="22"/>
-        <w:i w:val="false"/>
-        <w:u w:val="none"/>
-        <w:b w:val="false"/>
-        <w:szCs w:val="22"/>
-        <w:iCs w:val="false"/>
-        <w:bCs w:val="false"/>
-        <w:color w:val="000000"/>
-      </w:rPr>
+      <w:numFmt w:val="none"/>
+      <w:suff w:val="nothing"/>
+      <w:lvlText w:val="%5"/>
+      <w:lvlJc w:val="start"/>
+      <w:pPr>
+        <w:tabs>
+          <w:tab w:val="num" w:pos="0"/>
+        </w:tabs>
+        <w:ind w:start="0" w:hanging="0"/>
+      </w:pPr>
     </w:lvl>
     <w:lvl w:ilvl="5">
       <w:start w:val="1"/>
-      <w:numFmt w:val="bullet"/>
-      <w:lvlText w:val="■"/>
-      <w:lvlJc w:val="left"/>
-      <w:pPr>
-        <w:tabs>
-          <w:tab w:val="num" w:pos="0"/>
-        </w:tabs>
-        <w:ind w:left="4320" w:hanging="360"/>
-      </w:pPr>
-      <w:rPr>
-        <w:rFonts w:ascii="Arial" w:hAnsi="Arial" w:cs="Arial" w:hint="default"/>
-        <w:smallCaps w:val="false"/>
-        <w:caps w:val="false"/>
-        <w:dstrike w:val="false"/>
-        <w:strike w:val="false"/>
-        <w:vertAlign w:val="baseline"/>
-        <w:position w:val="0"/>
-        <w:sz w:val="22"/>
-        <w:sz w:val="22"/>
-        <w:i w:val="false"/>
-        <w:u w:val="none"/>
-        <w:b w:val="false"/>
-        <w:szCs w:val="22"/>
-        <w:iCs w:val="false"/>
-        <w:bCs w:val="false"/>
-        <w:color w:val="000000"/>
-      </w:rPr>
+      <w:numFmt w:val="none"/>
+      <w:suff w:val="nothing"/>
+      <w:lvlText w:val="%6"/>
+      <w:lvlJc w:val="start"/>
+      <w:pPr>
+        <w:tabs>
+          <w:tab w:val="num" w:pos="0"/>
+        </w:tabs>
+        <w:ind w:start="0" w:hanging="0"/>
+      </w:pPr>
     </w:lvl>
     <w:lvl w:ilvl="6">
       <w:start w:val="1"/>
-      <w:numFmt w:val="bullet"/>
-      <w:lvlText w:val="■"/>
-      <w:lvlJc w:val="left"/>
-      <w:pPr>
-        <w:tabs>
-          <w:tab w:val="num" w:pos="0"/>
-        </w:tabs>
-        <w:ind w:left="5040" w:hanging="360"/>
-      </w:pPr>
-      <w:rPr>
-        <w:rFonts w:ascii="Arial" w:hAnsi="Arial" w:cs="Arial" w:hint="default"/>
-        <w:smallCaps w:val="false"/>
-        <w:caps w:val="false"/>
-        <w:dstrike w:val="false"/>
-        <w:strike w:val="false"/>
-        <w:vertAlign w:val="baseline"/>
-        <w:position w:val="0"/>
-        <w:sz w:val="22"/>
-        <w:sz w:val="22"/>
-        <w:i w:val="false"/>
-        <w:u w:val="none"/>
-        <w:b w:val="false"/>
-        <w:szCs w:val="22"/>
-        <w:iCs w:val="false"/>
-        <w:bCs w:val="false"/>
-        <w:color w:val="000000"/>
-      </w:rPr>
+      <w:numFmt w:val="none"/>
+      <w:suff w:val="nothing"/>
+      <w:lvlText w:val="%7"/>
+      <w:lvlJc w:val="start"/>
+      <w:pPr>
+        <w:tabs>
+          <w:tab w:val="num" w:pos="0"/>
+        </w:tabs>
+        <w:ind w:start="0" w:hanging="0"/>
+      </w:pPr>
     </w:lvl>
     <w:lvl w:ilvl="7">
       <w:start w:val="1"/>
-      <w:numFmt w:val="bullet"/>
-      <w:lvlText w:val="■"/>
-      <w:lvlJc w:val="left"/>
-      <w:pPr>
-        <w:tabs>
-          <w:tab w:val="num" w:pos="0"/>
-        </w:tabs>
-        <w:ind w:left="5760" w:hanging="360"/>
-      </w:pPr>
-      <w:rPr>
-        <w:rFonts w:ascii="Arial" w:hAnsi="Arial" w:cs="Arial" w:hint="default"/>
-        <w:smallCaps w:val="false"/>
-        <w:caps w:val="false"/>
-        <w:dstrike w:val="false"/>
-        <w:strike w:val="false"/>
-        <w:vertAlign w:val="baseline"/>
-        <w:position w:val="0"/>
-        <w:sz w:val="22"/>
-        <w:sz w:val="22"/>
-        <w:i w:val="false"/>
-        <w:u w:val="none"/>
-        <w:b w:val="false"/>
-        <w:szCs w:val="22"/>
-        <w:iCs w:val="false"/>
-        <w:bCs w:val="false"/>
-        <w:color w:val="000000"/>
-      </w:rPr>
+      <w:numFmt w:val="none"/>
+      <w:suff w:val="nothing"/>
+      <w:lvlText w:val="%8"/>
+      <w:lvlJc w:val="start"/>
+      <w:pPr>
+        <w:tabs>
+          <w:tab w:val="num" w:pos="0"/>
+        </w:tabs>
+        <w:ind w:start="0" w:hanging="0"/>
+      </w:pPr>
     </w:lvl>
     <w:lvl w:ilvl="8">
       <w:start w:val="1"/>
-      <w:numFmt w:val="bullet"/>
-      <w:lvlText w:val="■"/>
-      <w:lvlJc w:val="left"/>
-      <w:pPr>
-        <w:tabs>
-          <w:tab w:val="num" w:pos="0"/>
-        </w:tabs>
-        <w:ind w:left="6480" w:hanging="360"/>
-      </w:pPr>
-      <w:rPr>
-        <w:rFonts w:ascii="Arial" w:hAnsi="Arial" w:cs="Arial" w:hint="default"/>
-        <w:smallCaps w:val="false"/>
-        <w:caps w:val="false"/>
-        <w:dstrike w:val="false"/>
-        <w:strike w:val="false"/>
-        <w:vertAlign w:val="baseline"/>
-        <w:position w:val="0"/>
-        <w:sz w:val="22"/>
-        <w:sz w:val="22"/>
-        <w:i w:val="false"/>
-        <w:u w:val="none"/>
-        <w:b w:val="false"/>
-        <w:szCs w:val="22"/>
-        <w:iCs w:val="false"/>
-        <w:bCs w:val="false"/>
-        <w:color w:val="000000"/>
-      </w:rPr>
+      <w:numFmt w:val="none"/>
+      <w:suff w:val="nothing"/>
+      <w:lvlText w:val="%9"/>
+      <w:lvlJc w:val="start"/>
+      <w:pPr>
+        <w:tabs>
+          <w:tab w:val="num" w:pos="0"/>
+        </w:tabs>
+        <w:ind w:start="0" w:hanging="0"/>
+      </w:pPr>
     </w:lvl>
   </w:abstractNum>
   <w:abstractNum w:abstractNumId="2">
@@ -1350,12 +1385,12 @@
       <w:start w:val="1"/>
       <w:numFmt w:val="bullet"/>
       <w:lvlText w:val="●"/>
-      <w:lvlJc w:val="left"/>
-      <w:pPr>
-        <w:tabs>
-          <w:tab w:val="num" w:pos="0"/>
-        </w:tabs>
-        <w:ind w:left="465" w:hanging="360"/>
+      <w:lvlJc w:val="start"/>
+      <w:pPr>
+        <w:tabs>
+          <w:tab w:val="num" w:pos="0"/>
+        </w:tabs>
+        <w:ind w:start="465" w:hanging="360"/>
       </w:pPr>
       <w:rPr>
         <w:rFonts w:ascii="Arial" w:hAnsi="Arial" w:cs="Arial" w:hint="default"/>
@@ -1380,12 +1415,12 @@
       <w:start w:val="1"/>
       <w:numFmt w:val="bullet"/>
       <w:lvlText w:val="○"/>
-      <w:lvlJc w:val="left"/>
-      <w:pPr>
-        <w:tabs>
-          <w:tab w:val="num" w:pos="0"/>
-        </w:tabs>
-        <w:ind w:left="1440" w:hanging="360"/>
+      <w:lvlJc w:val="start"/>
+      <w:pPr>
+        <w:tabs>
+          <w:tab w:val="num" w:pos="0"/>
+        </w:tabs>
+        <w:ind w:start="1440" w:hanging="360"/>
       </w:pPr>
       <w:rPr>
         <w:rFonts w:ascii="Arial" w:hAnsi="Arial" w:cs="Arial" w:hint="default"/>
@@ -1410,12 +1445,12 @@
       <w:start w:val="1"/>
       <w:numFmt w:val="bullet"/>
       <w:lvlText w:val="■"/>
-      <w:lvlJc w:val="left"/>
-      <w:pPr>
-        <w:tabs>
-          <w:tab w:val="num" w:pos="0"/>
-        </w:tabs>
-        <w:ind w:left="2160" w:hanging="360"/>
+      <w:lvlJc w:val="start"/>
+      <w:pPr>
+        <w:tabs>
+          <w:tab w:val="num" w:pos="0"/>
+        </w:tabs>
+        <w:ind w:start="2160" w:hanging="360"/>
       </w:pPr>
       <w:rPr>
         <w:rFonts w:ascii="Arial" w:hAnsi="Arial" w:cs="Arial" w:hint="default"/>
@@ -1440,12 +1475,12 @@
       <w:start w:val="1"/>
       <w:numFmt w:val="bullet"/>
       <w:lvlText w:val="■"/>
-      <w:lvlJc w:val="left"/>
-      <w:pPr>
-        <w:tabs>
-          <w:tab w:val="num" w:pos="0"/>
-        </w:tabs>
-        <w:ind w:left="2880" w:hanging="360"/>
+      <w:lvlJc w:val="start"/>
+      <w:pPr>
+        <w:tabs>
+          <w:tab w:val="num" w:pos="0"/>
+        </w:tabs>
+        <w:ind w:start="2880" w:hanging="360"/>
       </w:pPr>
       <w:rPr>
         <w:rFonts w:ascii="Arial" w:hAnsi="Arial" w:cs="Arial" w:hint="default"/>
@@ -1470,12 +1505,12 @@
       <w:start w:val="1"/>
       <w:numFmt w:val="bullet"/>
       <w:lvlText w:val="■"/>
-      <w:lvlJc w:val="left"/>
-      <w:pPr>
-        <w:tabs>
-          <w:tab w:val="num" w:pos="0"/>
-        </w:tabs>
-        <w:ind w:left="3600" w:hanging="360"/>
+      <w:lvlJc w:val="start"/>
+      <w:pPr>
+        <w:tabs>
+          <w:tab w:val="num" w:pos="0"/>
+        </w:tabs>
+        <w:ind w:start="3600" w:hanging="360"/>
       </w:pPr>
       <w:rPr>
         <w:rFonts w:ascii="Arial" w:hAnsi="Arial" w:cs="Arial" w:hint="default"/>
@@ -1500,12 +1535,12 @@
       <w:start w:val="1"/>
       <w:numFmt w:val="bullet"/>
       <w:lvlText w:val="■"/>
-      <w:lvlJc w:val="left"/>
-      <w:pPr>
-        <w:tabs>
-          <w:tab w:val="num" w:pos="0"/>
-        </w:tabs>
-        <w:ind w:left="4320" w:hanging="360"/>
+      <w:lvlJc w:val="start"/>
+      <w:pPr>
+        <w:tabs>
+          <w:tab w:val="num" w:pos="0"/>
+        </w:tabs>
+        <w:ind w:start="4320" w:hanging="360"/>
       </w:pPr>
       <w:rPr>
         <w:rFonts w:ascii="Arial" w:hAnsi="Arial" w:cs="Arial" w:hint="default"/>
@@ -1530,12 +1565,12 @@
       <w:start w:val="1"/>
       <w:numFmt w:val="bullet"/>
       <w:lvlText w:val="■"/>
-      <w:lvlJc w:val="left"/>
-      <w:pPr>
-        <w:tabs>
-          <w:tab w:val="num" w:pos="0"/>
-        </w:tabs>
-        <w:ind w:left="5040" w:hanging="360"/>
+      <w:lvlJc w:val="start"/>
+      <w:pPr>
+        <w:tabs>
+          <w:tab w:val="num" w:pos="0"/>
+        </w:tabs>
+        <w:ind w:start="5040" w:hanging="360"/>
       </w:pPr>
       <w:rPr>
         <w:rFonts w:ascii="Arial" w:hAnsi="Arial" w:cs="Arial" w:hint="default"/>
@@ -1560,12 +1595,12 @@
       <w:start w:val="1"/>
       <w:numFmt w:val="bullet"/>
       <w:lvlText w:val="■"/>
-      <w:lvlJc w:val="left"/>
-      <w:pPr>
-        <w:tabs>
-          <w:tab w:val="num" w:pos="0"/>
-        </w:tabs>
-        <w:ind w:left="5760" w:hanging="360"/>
+      <w:lvlJc w:val="start"/>
+      <w:pPr>
+        <w:tabs>
+          <w:tab w:val="num" w:pos="0"/>
+        </w:tabs>
+        <w:ind w:start="5760" w:hanging="360"/>
       </w:pPr>
       <w:rPr>
         <w:rFonts w:ascii="Arial" w:hAnsi="Arial" w:cs="Arial" w:hint="default"/>
@@ -1590,12 +1625,12 @@
       <w:start w:val="1"/>
       <w:numFmt w:val="bullet"/>
       <w:lvlText w:val="■"/>
-      <w:lvlJc w:val="left"/>
-      <w:pPr>
-        <w:tabs>
-          <w:tab w:val="num" w:pos="0"/>
-        </w:tabs>
-        <w:ind w:left="6480" w:hanging="360"/>
+      <w:lvlJc w:val="start"/>
+      <w:pPr>
+        <w:tabs>
+          <w:tab w:val="num" w:pos="0"/>
+        </w:tabs>
+        <w:ind w:start="6480" w:hanging="360"/>
       </w:pPr>
       <w:rPr>
         <w:rFonts w:ascii="Arial" w:hAnsi="Arial" w:cs="Arial" w:hint="default"/>
@@ -1622,12 +1657,12 @@
       <w:start w:val="1"/>
       <w:numFmt w:val="bullet"/>
       <w:lvlText w:val="●"/>
-      <w:lvlJc w:val="left"/>
-      <w:pPr>
-        <w:tabs>
-          <w:tab w:val="num" w:pos="0"/>
-        </w:tabs>
-        <w:ind w:left="465" w:hanging="360"/>
+      <w:lvlJc w:val="start"/>
+      <w:pPr>
+        <w:tabs>
+          <w:tab w:val="num" w:pos="0"/>
+        </w:tabs>
+        <w:ind w:start="465" w:hanging="360"/>
       </w:pPr>
       <w:rPr>
         <w:rFonts w:ascii="Arial" w:hAnsi="Arial" w:cs="Arial" w:hint="default"/>
@@ -1652,12 +1687,12 @@
       <w:start w:val="1"/>
       <w:numFmt w:val="bullet"/>
       <w:lvlText w:val="○"/>
-      <w:lvlJc w:val="left"/>
-      <w:pPr>
-        <w:tabs>
-          <w:tab w:val="num" w:pos="0"/>
-        </w:tabs>
-        <w:ind w:left="1440" w:hanging="360"/>
+      <w:lvlJc w:val="start"/>
+      <w:pPr>
+        <w:tabs>
+          <w:tab w:val="num" w:pos="0"/>
+        </w:tabs>
+        <w:ind w:start="1440" w:hanging="360"/>
       </w:pPr>
       <w:rPr>
         <w:rFonts w:ascii="Arial" w:hAnsi="Arial" w:cs="Arial" w:hint="default"/>
@@ -1682,12 +1717,12 @@
       <w:start w:val="1"/>
       <w:numFmt w:val="bullet"/>
       <w:lvlText w:val="■"/>
-      <w:lvlJc w:val="left"/>
-      <w:pPr>
-        <w:tabs>
-          <w:tab w:val="num" w:pos="0"/>
-        </w:tabs>
-        <w:ind w:left="2160" w:hanging="360"/>
+      <w:lvlJc w:val="start"/>
+      <w:pPr>
+        <w:tabs>
+          <w:tab w:val="num" w:pos="0"/>
+        </w:tabs>
+        <w:ind w:start="2160" w:hanging="360"/>
       </w:pPr>
       <w:rPr>
         <w:rFonts w:ascii="Arial" w:hAnsi="Arial" w:cs="Arial" w:hint="default"/>
@@ -1712,12 +1747,12 @@
       <w:start w:val="1"/>
       <w:numFmt w:val="bullet"/>
       <w:lvlText w:val="■"/>
-      <w:lvlJc w:val="left"/>
-      <w:pPr>
-        <w:tabs>
-          <w:tab w:val="num" w:pos="0"/>
-        </w:tabs>
-        <w:ind w:left="2880" w:hanging="360"/>
+      <w:lvlJc w:val="start"/>
+      <w:pPr>
+        <w:tabs>
+          <w:tab w:val="num" w:pos="0"/>
+        </w:tabs>
+        <w:ind w:start="2880" w:hanging="360"/>
       </w:pPr>
       <w:rPr>
         <w:rFonts w:ascii="Arial" w:hAnsi="Arial" w:cs="Arial" w:hint="default"/>
@@ -1742,12 +1777,12 @@
       <w:start w:val="1"/>
       <w:numFmt w:val="bullet"/>
       <w:lvlText w:val="■"/>
-      <w:lvlJc w:val="left"/>
-      <w:pPr>
-        <w:tabs>
-          <w:tab w:val="num" w:pos="0"/>
-        </w:tabs>
-        <w:ind w:left="3600" w:hanging="360"/>
+      <w:lvlJc w:val="start"/>
+      <w:pPr>
+        <w:tabs>
+          <w:tab w:val="num" w:pos="0"/>
+        </w:tabs>
+        <w:ind w:start="3600" w:hanging="360"/>
       </w:pPr>
       <w:rPr>
         <w:rFonts w:ascii="Arial" w:hAnsi="Arial" w:cs="Arial" w:hint="default"/>
@@ -1772,12 +1807,12 @@
       <w:start w:val="1"/>
       <w:numFmt w:val="bullet"/>
       <w:lvlText w:val="■"/>
-      <w:lvlJc w:val="left"/>
-      <w:pPr>
-        <w:tabs>
-          <w:tab w:val="num" w:pos="0"/>
-        </w:tabs>
-        <w:ind w:left="4320" w:hanging="360"/>
+      <w:lvlJc w:val="start"/>
+      <w:pPr>
+        <w:tabs>
+          <w:tab w:val="num" w:pos="0"/>
+        </w:tabs>
+        <w:ind w:start="4320" w:hanging="360"/>
       </w:pPr>
       <w:rPr>
         <w:rFonts w:ascii="Arial" w:hAnsi="Arial" w:cs="Arial" w:hint="default"/>
@@ -1802,12 +1837,12 @@
       <w:start w:val="1"/>
       <w:numFmt w:val="bullet"/>
       <w:lvlText w:val="■"/>
-      <w:lvlJc w:val="left"/>
-      <w:pPr>
-        <w:tabs>
-          <w:tab w:val="num" w:pos="0"/>
-        </w:tabs>
-        <w:ind w:left="5040" w:hanging="360"/>
+      <w:lvlJc w:val="start"/>
+      <w:pPr>
+        <w:tabs>
+          <w:tab w:val="num" w:pos="0"/>
+        </w:tabs>
+        <w:ind w:start="5040" w:hanging="360"/>
       </w:pPr>
       <w:rPr>
         <w:rFonts w:ascii="Arial" w:hAnsi="Arial" w:cs="Arial" w:hint="default"/>
@@ -1832,12 +1867,12 @@
       <w:start w:val="1"/>
       <w:numFmt w:val="bullet"/>
       <w:lvlText w:val="■"/>
-      <w:lvlJc w:val="left"/>
-      <w:pPr>
-        <w:tabs>
-          <w:tab w:val="num" w:pos="0"/>
-        </w:tabs>
-        <w:ind w:left="5760" w:hanging="360"/>
+      <w:lvlJc w:val="start"/>
+      <w:pPr>
+        <w:tabs>
+          <w:tab w:val="num" w:pos="0"/>
+        </w:tabs>
+        <w:ind w:start="5760" w:hanging="360"/>
       </w:pPr>
       <w:rPr>
         <w:rFonts w:ascii="Arial" w:hAnsi="Arial" w:cs="Arial" w:hint="default"/>
@@ -1862,12 +1897,12 @@
       <w:start w:val="1"/>
       <w:numFmt w:val="bullet"/>
       <w:lvlText w:val="■"/>
-      <w:lvlJc w:val="left"/>
-      <w:pPr>
-        <w:tabs>
-          <w:tab w:val="num" w:pos="0"/>
-        </w:tabs>
-        <w:ind w:left="6480" w:hanging="360"/>
+      <w:lvlJc w:val="start"/>
+      <w:pPr>
+        <w:tabs>
+          <w:tab w:val="num" w:pos="0"/>
+        </w:tabs>
+        <w:ind w:start="6480" w:hanging="360"/>
       </w:pPr>
       <w:rPr>
         <w:rFonts w:ascii="Arial" w:hAnsi="Arial" w:cs="Arial" w:hint="default"/>
@@ -1894,12 +1929,12 @@
       <w:start w:val="1"/>
       <w:numFmt w:val="bullet"/>
       <w:lvlText w:val="●"/>
-      <w:lvlJc w:val="left"/>
-      <w:pPr>
-        <w:tabs>
-          <w:tab w:val="num" w:pos="0"/>
-        </w:tabs>
-        <w:ind w:left="465" w:hanging="360"/>
+      <w:lvlJc w:val="start"/>
+      <w:pPr>
+        <w:tabs>
+          <w:tab w:val="num" w:pos="0"/>
+        </w:tabs>
+        <w:ind w:start="465" w:hanging="360"/>
       </w:pPr>
       <w:rPr>
         <w:rFonts w:ascii="Arial" w:hAnsi="Arial" w:cs="Arial" w:hint="default"/>
@@ -1924,12 +1959,12 @@
       <w:start w:val="1"/>
       <w:numFmt w:val="bullet"/>
       <w:lvlText w:val="○"/>
-      <w:lvlJc w:val="left"/>
-      <w:pPr>
-        <w:tabs>
-          <w:tab w:val="num" w:pos="0"/>
-        </w:tabs>
-        <w:ind w:left="1440" w:hanging="360"/>
+      <w:lvlJc w:val="start"/>
+      <w:pPr>
+        <w:tabs>
+          <w:tab w:val="num" w:pos="0"/>
+        </w:tabs>
+        <w:ind w:start="1440" w:hanging="360"/>
       </w:pPr>
       <w:rPr>
         <w:rFonts w:ascii="Arial" w:hAnsi="Arial" w:cs="Arial" w:hint="default"/>
@@ -1954,12 +1989,12 @@
       <w:start w:val="1"/>
       <w:numFmt w:val="bullet"/>
       <w:lvlText w:val="■"/>
-      <w:lvlJc w:val="left"/>
-      <w:pPr>
-        <w:tabs>
-          <w:tab w:val="num" w:pos="0"/>
-        </w:tabs>
-        <w:ind w:left="2160" w:hanging="360"/>
+      <w:lvlJc w:val="start"/>
+      <w:pPr>
+        <w:tabs>
+          <w:tab w:val="num" w:pos="0"/>
+        </w:tabs>
+        <w:ind w:start="2160" w:hanging="360"/>
       </w:pPr>
       <w:rPr>
         <w:rFonts w:ascii="Arial" w:hAnsi="Arial" w:cs="Arial" w:hint="default"/>
@@ -1984,12 +2019,12 @@
       <w:start w:val="1"/>
       <w:numFmt w:val="bullet"/>
       <w:lvlText w:val="■"/>
-      <w:lvlJc w:val="left"/>
-      <w:pPr>
-        <w:tabs>
-          <w:tab w:val="num" w:pos="0"/>
-        </w:tabs>
-        <w:ind w:left="2880" w:hanging="360"/>
+      <w:lvlJc w:val="start"/>
+      <w:pPr>
+        <w:tabs>
+          <w:tab w:val="num" w:pos="0"/>
+        </w:tabs>
+        <w:ind w:start="2880" w:hanging="360"/>
       </w:pPr>
       <w:rPr>
         <w:rFonts w:ascii="Arial" w:hAnsi="Arial" w:cs="Arial" w:hint="default"/>
@@ -2014,12 +2049,12 @@
       <w:start w:val="1"/>
       <w:numFmt w:val="bullet"/>
       <w:lvlText w:val="■"/>
-      <w:lvlJc w:val="left"/>
-      <w:pPr>
-        <w:tabs>
-          <w:tab w:val="num" w:pos="0"/>
-        </w:tabs>
-        <w:ind w:left="3600" w:hanging="360"/>
+      <w:lvlJc w:val="start"/>
+      <w:pPr>
+        <w:tabs>
+          <w:tab w:val="num" w:pos="0"/>
+        </w:tabs>
+        <w:ind w:start="3600" w:hanging="360"/>
       </w:pPr>
       <w:rPr>
         <w:rFonts w:ascii="Arial" w:hAnsi="Arial" w:cs="Arial" w:hint="default"/>
@@ -2044,12 +2079,12 @@
       <w:start w:val="1"/>
       <w:numFmt w:val="bullet"/>
       <w:lvlText w:val="■"/>
-      <w:lvlJc w:val="left"/>
-      <w:pPr>
-        <w:tabs>
-          <w:tab w:val="num" w:pos="0"/>
-        </w:tabs>
-        <w:ind w:left="4320" w:hanging="360"/>
+      <w:lvlJc w:val="start"/>
+      <w:pPr>
+        <w:tabs>
+          <w:tab w:val="num" w:pos="0"/>
+        </w:tabs>
+        <w:ind w:start="4320" w:hanging="360"/>
       </w:pPr>
       <w:rPr>
         <w:rFonts w:ascii="Arial" w:hAnsi="Arial" w:cs="Arial" w:hint="default"/>
@@ -2074,12 +2109,12 @@
       <w:start w:val="1"/>
       <w:numFmt w:val="bullet"/>
       <w:lvlText w:val="■"/>
-      <w:lvlJc w:val="left"/>
-      <w:pPr>
-        <w:tabs>
-          <w:tab w:val="num" w:pos="0"/>
-        </w:tabs>
-        <w:ind w:left="5040" w:hanging="360"/>
+      <w:lvlJc w:val="start"/>
+      <w:pPr>
+        <w:tabs>
+          <w:tab w:val="num" w:pos="0"/>
+        </w:tabs>
+        <w:ind w:start="5040" w:hanging="360"/>
       </w:pPr>
       <w:rPr>
         <w:rFonts w:ascii="Arial" w:hAnsi="Arial" w:cs="Arial" w:hint="default"/>
@@ -2104,12 +2139,12 @@
       <w:start w:val="1"/>
       <w:numFmt w:val="bullet"/>
       <w:lvlText w:val="■"/>
-      <w:lvlJc w:val="left"/>
-      <w:pPr>
-        <w:tabs>
-          <w:tab w:val="num" w:pos="0"/>
-        </w:tabs>
-        <w:ind w:left="5760" w:hanging="360"/>
+      <w:lvlJc w:val="start"/>
+      <w:pPr>
+        <w:tabs>
+          <w:tab w:val="num" w:pos="0"/>
+        </w:tabs>
+        <w:ind w:start="5760" w:hanging="360"/>
       </w:pPr>
       <w:rPr>
         <w:rFonts w:ascii="Arial" w:hAnsi="Arial" w:cs="Arial" w:hint="default"/>
@@ -2134,12 +2169,12 @@
       <w:start w:val="1"/>
       <w:numFmt w:val="bullet"/>
       <w:lvlText w:val="■"/>
-      <w:lvlJc w:val="left"/>
-      <w:pPr>
-        <w:tabs>
-          <w:tab w:val="num" w:pos="0"/>
-        </w:tabs>
-        <w:ind w:left="6480" w:hanging="360"/>
+      <w:lvlJc w:val="start"/>
+      <w:pPr>
+        <w:tabs>
+          <w:tab w:val="num" w:pos="0"/>
+        </w:tabs>
+        <w:ind w:start="6480" w:hanging="360"/>
       </w:pPr>
       <w:rPr>
         <w:rFonts w:ascii="Arial" w:hAnsi="Arial" w:cs="Arial" w:hint="default"/>
@@ -2166,12 +2201,12 @@
       <w:start w:val="1"/>
       <w:numFmt w:val="bullet"/>
       <w:lvlText w:val="●"/>
-      <w:lvlJc w:val="left"/>
-      <w:pPr>
-        <w:tabs>
-          <w:tab w:val="num" w:pos="0"/>
-        </w:tabs>
-        <w:ind w:left="465" w:hanging="360"/>
+      <w:lvlJc w:val="start"/>
+      <w:pPr>
+        <w:tabs>
+          <w:tab w:val="num" w:pos="0"/>
+        </w:tabs>
+        <w:ind w:start="465" w:hanging="360"/>
       </w:pPr>
       <w:rPr>
         <w:rFonts w:ascii="Arial" w:hAnsi="Arial" w:cs="Arial" w:hint="default"/>
@@ -2196,12 +2231,12 @@
       <w:start w:val="1"/>
       <w:numFmt w:val="bullet"/>
       <w:lvlText w:val="○"/>
-      <w:lvlJc w:val="left"/>
-      <w:pPr>
-        <w:tabs>
-          <w:tab w:val="num" w:pos="0"/>
-        </w:tabs>
-        <w:ind w:left="1440" w:hanging="360"/>
+      <w:lvlJc w:val="start"/>
+      <w:pPr>
+        <w:tabs>
+          <w:tab w:val="num" w:pos="0"/>
+        </w:tabs>
+        <w:ind w:start="1440" w:hanging="360"/>
       </w:pPr>
       <w:rPr>
         <w:rFonts w:ascii="Arial" w:hAnsi="Arial" w:cs="Arial" w:hint="default"/>
@@ -2226,12 +2261,12 @@
       <w:start w:val="1"/>
       <w:numFmt w:val="bullet"/>
       <w:lvlText w:val="■"/>
-      <w:lvlJc w:val="left"/>
-      <w:pPr>
-        <w:tabs>
-          <w:tab w:val="num" w:pos="0"/>
-        </w:tabs>
-        <w:ind w:left="2160" w:hanging="360"/>
+      <w:lvlJc w:val="start"/>
+      <w:pPr>
+        <w:tabs>
+          <w:tab w:val="num" w:pos="0"/>
+        </w:tabs>
+        <w:ind w:start="2160" w:hanging="360"/>
       </w:pPr>
       <w:rPr>
         <w:rFonts w:ascii="Arial" w:hAnsi="Arial" w:cs="Arial" w:hint="default"/>
@@ -2256,12 +2291,12 @@
       <w:start w:val="1"/>
       <w:numFmt w:val="bullet"/>
       <w:lvlText w:val="■"/>
-      <w:lvlJc w:val="left"/>
-      <w:pPr>
-        <w:tabs>
-          <w:tab w:val="num" w:pos="0"/>
-        </w:tabs>
-        <w:ind w:left="2880" w:hanging="360"/>
+      <w:lvlJc w:val="start"/>
+      <w:pPr>
+        <w:tabs>
+          <w:tab w:val="num" w:pos="0"/>
+        </w:tabs>
+        <w:ind w:start="2880" w:hanging="360"/>
       </w:pPr>
       <w:rPr>
         <w:rFonts w:ascii="Arial" w:hAnsi="Arial" w:cs="Arial" w:hint="default"/>
@@ -2286,12 +2321,12 @@
       <w:start w:val="1"/>
       <w:numFmt w:val="bullet"/>
       <w:lvlText w:val="■"/>
-      <w:lvlJc w:val="left"/>
-      <w:pPr>
-        <w:tabs>
-          <w:tab w:val="num" w:pos="0"/>
-        </w:tabs>
-        <w:ind w:left="3600" w:hanging="360"/>
+      <w:lvlJc w:val="start"/>
+      <w:pPr>
+        <w:tabs>
+          <w:tab w:val="num" w:pos="0"/>
+        </w:tabs>
+        <w:ind w:start="3600" w:hanging="360"/>
       </w:pPr>
       <w:rPr>
         <w:rFonts w:ascii="Arial" w:hAnsi="Arial" w:cs="Arial" w:hint="default"/>
@@ -2316,12 +2351,12 @@
       <w:start w:val="1"/>
       <w:numFmt w:val="bullet"/>
       <w:lvlText w:val="■"/>
-      <w:lvlJc w:val="left"/>
-      <w:pPr>
-        <w:tabs>
-          <w:tab w:val="num" w:pos="0"/>
-        </w:tabs>
-        <w:ind w:left="4320" w:hanging="360"/>
+      <w:lvlJc w:val="start"/>
+      <w:pPr>
+        <w:tabs>
+          <w:tab w:val="num" w:pos="0"/>
+        </w:tabs>
+        <w:ind w:start="4320" w:hanging="360"/>
       </w:pPr>
       <w:rPr>
         <w:rFonts w:ascii="Arial" w:hAnsi="Arial" w:cs="Arial" w:hint="default"/>
@@ -2346,12 +2381,12 @@
       <w:start w:val="1"/>
       <w:numFmt w:val="bullet"/>
       <w:lvlText w:val="■"/>
-      <w:lvlJc w:val="left"/>
-      <w:pPr>
-        <w:tabs>
-          <w:tab w:val="num" w:pos="0"/>
-        </w:tabs>
-        <w:ind w:left="5040" w:hanging="360"/>
+      <w:lvlJc w:val="start"/>
+      <w:pPr>
+        <w:tabs>
+          <w:tab w:val="num" w:pos="0"/>
+        </w:tabs>
+        <w:ind w:start="5040" w:hanging="360"/>
       </w:pPr>
       <w:rPr>
         <w:rFonts w:ascii="Arial" w:hAnsi="Arial" w:cs="Arial" w:hint="default"/>
@@ -2376,12 +2411,12 @@
       <w:start w:val="1"/>
       <w:numFmt w:val="bullet"/>
       <w:lvlText w:val="■"/>
-      <w:lvlJc w:val="left"/>
-      <w:pPr>
-        <w:tabs>
-          <w:tab w:val="num" w:pos="0"/>
-        </w:tabs>
-        <w:ind w:left="5760" w:hanging="360"/>
+      <w:lvlJc w:val="start"/>
+      <w:pPr>
+        <w:tabs>
+          <w:tab w:val="num" w:pos="0"/>
+        </w:tabs>
+        <w:ind w:start="5760" w:hanging="360"/>
       </w:pPr>
       <w:rPr>
         <w:rFonts w:ascii="Arial" w:hAnsi="Arial" w:cs="Arial" w:hint="default"/>
@@ -2406,12 +2441,12 @@
       <w:start w:val="1"/>
       <w:numFmt w:val="bullet"/>
       <w:lvlText w:val="■"/>
-      <w:lvlJc w:val="left"/>
-      <w:pPr>
-        <w:tabs>
-          <w:tab w:val="num" w:pos="0"/>
-        </w:tabs>
-        <w:ind w:left="6480" w:hanging="360"/>
+      <w:lvlJc w:val="start"/>
+      <w:pPr>
+        <w:tabs>
+          <w:tab w:val="num" w:pos="0"/>
+        </w:tabs>
+        <w:ind w:start="6480" w:hanging="360"/>
       </w:pPr>
       <w:rPr>
         <w:rFonts w:ascii="Arial" w:hAnsi="Arial" w:cs="Arial" w:hint="default"/>
@@ -2438,12 +2473,12 @@
       <w:start w:val="1"/>
       <w:numFmt w:val="bullet"/>
       <w:lvlText w:val="●"/>
-      <w:lvlJc w:val="left"/>
-      <w:pPr>
-        <w:tabs>
-          <w:tab w:val="num" w:pos="0"/>
-        </w:tabs>
-        <w:ind w:left="465" w:hanging="360"/>
+      <w:lvlJc w:val="start"/>
+      <w:pPr>
+        <w:tabs>
+          <w:tab w:val="num" w:pos="0"/>
+        </w:tabs>
+        <w:ind w:start="465" w:hanging="360"/>
       </w:pPr>
       <w:rPr>
         <w:rFonts w:ascii="Arial" w:hAnsi="Arial" w:cs="Arial" w:hint="default"/>
@@ -2468,12 +2503,12 @@
       <w:start w:val="1"/>
       <w:numFmt w:val="bullet"/>
       <w:lvlText w:val="○"/>
-      <w:lvlJc w:val="left"/>
-      <w:pPr>
-        <w:tabs>
-          <w:tab w:val="num" w:pos="0"/>
-        </w:tabs>
-        <w:ind w:left="1440" w:hanging="360"/>
+      <w:lvlJc w:val="start"/>
+      <w:pPr>
+        <w:tabs>
+          <w:tab w:val="num" w:pos="0"/>
+        </w:tabs>
+        <w:ind w:start="1440" w:hanging="360"/>
       </w:pPr>
       <w:rPr>
         <w:rFonts w:ascii="Arial" w:hAnsi="Arial" w:cs="Arial" w:hint="default"/>
@@ -2498,12 +2533,12 @@
       <w:start w:val="1"/>
       <w:numFmt w:val="bullet"/>
       <w:lvlText w:val="■"/>
-      <w:lvlJc w:val="left"/>
-      <w:pPr>
-        <w:tabs>
-          <w:tab w:val="num" w:pos="0"/>
-        </w:tabs>
-        <w:ind w:left="2160" w:hanging="360"/>
+      <w:lvlJc w:val="start"/>
+      <w:pPr>
+        <w:tabs>
+          <w:tab w:val="num" w:pos="0"/>
+        </w:tabs>
+        <w:ind w:start="2160" w:hanging="360"/>
       </w:pPr>
       <w:rPr>
         <w:rFonts w:ascii="Arial" w:hAnsi="Arial" w:cs="Arial" w:hint="default"/>
@@ -2528,12 +2563,12 @@
       <w:start w:val="1"/>
       <w:numFmt w:val="bullet"/>
       <w:lvlText w:val="■"/>
-      <w:lvlJc w:val="left"/>
-      <w:pPr>
-        <w:tabs>
-          <w:tab w:val="num" w:pos="0"/>
-        </w:tabs>
-        <w:ind w:left="2880" w:hanging="360"/>
+      <w:lvlJc w:val="start"/>
+      <w:pPr>
+        <w:tabs>
+          <w:tab w:val="num" w:pos="0"/>
+        </w:tabs>
+        <w:ind w:start="2880" w:hanging="360"/>
       </w:pPr>
       <w:rPr>
         <w:rFonts w:ascii="Arial" w:hAnsi="Arial" w:cs="Arial" w:hint="default"/>
@@ -2558,12 +2593,12 @@
       <w:start w:val="1"/>
       <w:numFmt w:val="bullet"/>
       <w:lvlText w:val="■"/>
-      <w:lvlJc w:val="left"/>
-      <w:pPr>
-        <w:tabs>
-          <w:tab w:val="num" w:pos="0"/>
-        </w:tabs>
-        <w:ind w:left="3600" w:hanging="360"/>
+      <w:lvlJc w:val="start"/>
+      <w:pPr>
+        <w:tabs>
+          <w:tab w:val="num" w:pos="0"/>
+        </w:tabs>
+        <w:ind w:start="3600" w:hanging="360"/>
       </w:pPr>
       <w:rPr>
         <w:rFonts w:ascii="Arial" w:hAnsi="Arial" w:cs="Arial" w:hint="default"/>
@@ -2588,12 +2623,12 @@
       <w:start w:val="1"/>
       <w:numFmt w:val="bullet"/>
       <w:lvlText w:val="■"/>
-      <w:lvlJc w:val="left"/>
-      <w:pPr>
-        <w:tabs>
-          <w:tab w:val="num" w:pos="0"/>
-        </w:tabs>
-        <w:ind w:left="4320" w:hanging="360"/>
+      <w:lvlJc w:val="start"/>
+      <w:pPr>
+        <w:tabs>
+          <w:tab w:val="num" w:pos="0"/>
+        </w:tabs>
+        <w:ind w:start="4320" w:hanging="360"/>
       </w:pPr>
       <w:rPr>
         <w:rFonts w:ascii="Arial" w:hAnsi="Arial" w:cs="Arial" w:hint="default"/>
@@ -2618,12 +2653,12 @@
       <w:start w:val="1"/>
       <w:numFmt w:val="bullet"/>
       <w:lvlText w:val="■"/>
-      <w:lvlJc w:val="left"/>
-      <w:pPr>
-        <w:tabs>
-          <w:tab w:val="num" w:pos="0"/>
-        </w:tabs>
-        <w:ind w:left="5040" w:hanging="360"/>
+      <w:lvlJc w:val="start"/>
+      <w:pPr>
+        <w:tabs>
+          <w:tab w:val="num" w:pos="0"/>
+        </w:tabs>
+        <w:ind w:start="5040" w:hanging="360"/>
       </w:pPr>
       <w:rPr>
         <w:rFonts w:ascii="Arial" w:hAnsi="Arial" w:cs="Arial" w:hint="default"/>
@@ -2648,12 +2683,12 @@
       <w:start w:val="1"/>
       <w:numFmt w:val="bullet"/>
       <w:lvlText w:val="■"/>
-      <w:lvlJc w:val="left"/>
-      <w:pPr>
-        <w:tabs>
-          <w:tab w:val="num" w:pos="0"/>
-        </w:tabs>
-        <w:ind w:left="5760" w:hanging="360"/>
+      <w:lvlJc w:val="start"/>
+      <w:pPr>
+        <w:tabs>
+          <w:tab w:val="num" w:pos="0"/>
+        </w:tabs>
+        <w:ind w:start="5760" w:hanging="360"/>
       </w:pPr>
       <w:rPr>
         <w:rFonts w:ascii="Arial" w:hAnsi="Arial" w:cs="Arial" w:hint="default"/>
@@ -2678,12 +2713,12 @@
       <w:start w:val="1"/>
       <w:numFmt w:val="bullet"/>
       <w:lvlText w:val="■"/>
-      <w:lvlJc w:val="left"/>
-      <w:pPr>
-        <w:tabs>
-          <w:tab w:val="num" w:pos="0"/>
-        </w:tabs>
-        <w:ind w:left="6480" w:hanging="360"/>
+      <w:lvlJc w:val="start"/>
+      <w:pPr>
+        <w:tabs>
+          <w:tab w:val="num" w:pos="0"/>
+        </w:tabs>
+        <w:ind w:start="6480" w:hanging="360"/>
       </w:pPr>
       <w:rPr>
         <w:rFonts w:ascii="Arial" w:hAnsi="Arial" w:cs="Arial" w:hint="default"/>
@@ -2708,120 +2743,273 @@
   <w:abstractNum w:abstractNumId="7">
     <w:lvl w:ilvl="0">
       <w:start w:val="1"/>
-      <w:numFmt w:val="none"/>
-      <w:suff w:val="nothing"/>
-      <w:lvlText w:val=""/>
-      <w:lvlJc w:val="left"/>
-      <w:pPr>
-        <w:tabs>
-          <w:tab w:val="num" w:pos="0"/>
-        </w:tabs>
-        <w:ind w:left="0" w:hanging="0"/>
-      </w:pPr>
+      <w:numFmt w:val="bullet"/>
+      <w:lvlText w:val="●"/>
+      <w:lvlJc w:val="start"/>
+      <w:pPr>
+        <w:tabs>
+          <w:tab w:val="num" w:pos="0"/>
+        </w:tabs>
+        <w:ind w:start="465" w:hanging="360"/>
+      </w:pPr>
+      <w:rPr>
+        <w:rFonts w:ascii="Arial" w:hAnsi="Arial" w:cs="Arial" w:hint="default"/>
+        <w:smallCaps w:val="false"/>
+        <w:caps w:val="false"/>
+        <w:dstrike w:val="false"/>
+        <w:strike w:val="false"/>
+        <w:vertAlign w:val="baseline"/>
+        <w:position w:val="0"/>
+        <w:sz w:val="22"/>
+        <w:sz w:val="22"/>
+        <w:i w:val="false"/>
+        <w:u w:val="none"/>
+        <w:b w:val="false"/>
+        <w:szCs w:val="22"/>
+        <w:iCs w:val="false"/>
+        <w:bCs w:val="false"/>
+        <w:color w:val="000000"/>
+      </w:rPr>
     </w:lvl>
     <w:lvl w:ilvl="1">
       <w:start w:val="1"/>
-      <w:numFmt w:val="none"/>
-      <w:suff w:val="nothing"/>
-      <w:lvlText w:val=""/>
-      <w:lvlJc w:val="left"/>
-      <w:pPr>
-        <w:tabs>
-          <w:tab w:val="num" w:pos="0"/>
-        </w:tabs>
-        <w:ind w:left="0" w:hanging="0"/>
-      </w:pPr>
+      <w:numFmt w:val="bullet"/>
+      <w:lvlText w:val="○"/>
+      <w:lvlJc w:val="start"/>
+      <w:pPr>
+        <w:tabs>
+          <w:tab w:val="num" w:pos="0"/>
+        </w:tabs>
+        <w:ind w:start="1440" w:hanging="360"/>
+      </w:pPr>
+      <w:rPr>
+        <w:rFonts w:ascii="Arial" w:hAnsi="Arial" w:cs="Arial" w:hint="default"/>
+        <w:smallCaps w:val="false"/>
+        <w:caps w:val="false"/>
+        <w:dstrike w:val="false"/>
+        <w:strike w:val="false"/>
+        <w:vertAlign w:val="baseline"/>
+        <w:position w:val="0"/>
+        <w:sz w:val="22"/>
+        <w:sz w:val="22"/>
+        <w:i w:val="false"/>
+        <w:u w:val="none"/>
+        <w:b w:val="false"/>
+        <w:szCs w:val="22"/>
+        <w:iCs w:val="false"/>
+        <w:bCs w:val="false"/>
+        <w:color w:val="000000"/>
+      </w:rPr>
     </w:lvl>
     <w:lvl w:ilvl="2">
       <w:start w:val="1"/>
-      <w:numFmt w:val="none"/>
-      <w:suff w:val="nothing"/>
-      <w:lvlText w:val=""/>
-      <w:lvlJc w:val="left"/>
-      <w:pPr>
-        <w:tabs>
-          <w:tab w:val="num" w:pos="0"/>
-        </w:tabs>
-        <w:ind w:left="0" w:hanging="0"/>
-      </w:pPr>
+      <w:numFmt w:val="bullet"/>
+      <w:lvlText w:val="■"/>
+      <w:lvlJc w:val="start"/>
+      <w:pPr>
+        <w:tabs>
+          <w:tab w:val="num" w:pos="0"/>
+        </w:tabs>
+        <w:ind w:start="2160" w:hanging="360"/>
+      </w:pPr>
+      <w:rPr>
+        <w:rFonts w:ascii="Arial" w:hAnsi="Arial" w:cs="Arial" w:hint="default"/>
+        <w:smallCaps w:val="false"/>
+        <w:caps w:val="false"/>
+        <w:dstrike w:val="false"/>
+        <w:strike w:val="false"/>
+        <w:vertAlign w:val="baseline"/>
+        <w:position w:val="0"/>
+        <w:sz w:val="22"/>
+        <w:sz w:val="22"/>
+        <w:i w:val="false"/>
+        <w:u w:val="none"/>
+        <w:b w:val="false"/>
+        <w:szCs w:val="22"/>
+        <w:iCs w:val="false"/>
+        <w:bCs w:val="false"/>
+        <w:color w:val="000000"/>
+      </w:rPr>
     </w:lvl>
     <w:lvl w:ilvl="3">
       <w:start w:val="1"/>
-      <w:numFmt w:val="none"/>
-      <w:suff w:val="nothing"/>
-      <w:lvlText w:val=""/>
-      <w:lvlJc w:val="left"/>
-      <w:pPr>
-        <w:tabs>
-          <w:tab w:val="num" w:pos="0"/>
-        </w:tabs>
-        <w:ind w:left="0" w:hanging="0"/>
-      </w:pPr>
+      <w:numFmt w:val="bullet"/>
+      <w:lvlText w:val="■"/>
+      <w:lvlJc w:val="start"/>
+      <w:pPr>
+        <w:tabs>
+          <w:tab w:val="num" w:pos="0"/>
+        </w:tabs>
+        <w:ind w:start="2880" w:hanging="360"/>
+      </w:pPr>
+      <w:rPr>
+        <w:rFonts w:ascii="Arial" w:hAnsi="Arial" w:cs="Arial" w:hint="default"/>
+        <w:smallCaps w:val="false"/>
+        <w:caps w:val="false"/>
+        <w:dstrike w:val="false"/>
+        <w:strike w:val="false"/>
+        <w:vertAlign w:val="baseline"/>
+        <w:position w:val="0"/>
+        <w:sz w:val="22"/>
+        <w:sz w:val="22"/>
+        <w:i w:val="false"/>
+        <w:u w:val="none"/>
+        <w:b w:val="false"/>
+        <w:szCs w:val="22"/>
+        <w:iCs w:val="false"/>
+        <w:bCs w:val="false"/>
+        <w:color w:val="000000"/>
+      </w:rPr>
     </w:lvl>
     <w:lvl w:ilvl="4">
       <w:start w:val="1"/>
-      <w:numFmt w:val="none"/>
-      <w:suff w:val="nothing"/>
-      <w:lvlText w:val=""/>
-      <w:lvlJc w:val="left"/>
-      <w:pPr>
-        <w:tabs>
-          <w:tab w:val="num" w:pos="0"/>
-        </w:tabs>
-        <w:ind w:left="0" w:hanging="0"/>
-      </w:pPr>
+      <w:numFmt w:val="bullet"/>
+      <w:lvlText w:val="■"/>
+      <w:lvlJc w:val="start"/>
+      <w:pPr>
+        <w:tabs>
+          <w:tab w:val="num" w:pos="0"/>
+        </w:tabs>
+        <w:ind w:start="3600" w:hanging="360"/>
+      </w:pPr>
+      <w:rPr>
+        <w:rFonts w:ascii="Arial" w:hAnsi="Arial" w:cs="Arial" w:hint="default"/>
+        <w:smallCaps w:val="false"/>
+        <w:caps w:val="false"/>
+        <w:dstrike w:val="false"/>
+        <w:strike w:val="false"/>
+        <w:vertAlign w:val="baseline"/>
+        <w:position w:val="0"/>
+        <w:sz w:val="22"/>
+        <w:sz w:val="22"/>
+        <w:i w:val="false"/>
+        <w:u w:val="none"/>
+        <w:b w:val="false"/>
+        <w:szCs w:val="22"/>
+        <w:iCs w:val="false"/>
+        <w:bCs w:val="false"/>
+        <w:color w:val="000000"/>
+      </w:rPr>
     </w:lvl>
     <w:lvl w:ilvl="5">
       <w:start w:val="1"/>
-      <w:numFmt w:val="none"/>
-      <w:suff w:val="nothing"/>
-      <w:lvlText w:val=""/>
-      <w:lvlJc w:val="left"/>
-      <w:pPr>
-        <w:tabs>
-          <w:tab w:val="num" w:pos="0"/>
-        </w:tabs>
-        <w:ind w:left="0" w:hanging="0"/>
-      </w:pPr>
+      <w:numFmt w:val="bullet"/>
+      <w:lvlText w:val="■"/>
+      <w:lvlJc w:val="start"/>
+      <w:pPr>
+        <w:tabs>
+          <w:tab w:val="num" w:pos="0"/>
+        </w:tabs>
+        <w:ind w:start="4320" w:hanging="360"/>
+      </w:pPr>
+      <w:rPr>
+        <w:rFonts w:ascii="Arial" w:hAnsi="Arial" w:cs="Arial" w:hint="default"/>
+        <w:smallCaps w:val="false"/>
+        <w:caps w:val="false"/>
+        <w:dstrike w:val="false"/>
+        <w:strike w:val="false"/>
+        <w:vertAlign w:val="baseline"/>
+        <w:position w:val="0"/>
+        <w:sz w:val="22"/>
+        <w:sz w:val="22"/>
+        <w:i w:val="false"/>
+        <w:u w:val="none"/>
+        <w:b w:val="false"/>
+        <w:szCs w:val="22"/>
+        <w:iCs w:val="false"/>
+        <w:bCs w:val="false"/>
+        <w:color w:val="000000"/>
+      </w:rPr>
     </w:lvl>
     <w:lvl w:ilvl="6">
       <w:start w:val="1"/>
-      <w:numFmt w:val="none"/>
-      <w:suff w:val="nothing"/>
-      <w:lvlText w:val=""/>
-      <w:lvlJc w:val="left"/>
-      <w:pPr>
-        <w:tabs>
-          <w:tab w:val="num" w:pos="0"/>
-        </w:tabs>
-        <w:ind w:left="0" w:hanging="0"/>
-      </w:pPr>
+      <w:numFmt w:val="bullet"/>
+      <w:lvlText w:val="■"/>
+      <w:lvlJc w:val="start"/>
+      <w:pPr>
+        <w:tabs>
+          <w:tab w:val="num" w:pos="0"/>
+        </w:tabs>
+        <w:ind w:start="5040" w:hanging="360"/>
+      </w:pPr>
+      <w:rPr>
+        <w:rFonts w:ascii="Arial" w:hAnsi="Arial" w:cs="Arial" w:hint="default"/>
+        <w:smallCaps w:val="false"/>
+        <w:caps w:val="false"/>
+        <w:dstrike w:val="false"/>
+        <w:strike w:val="false"/>
+        <w:vertAlign w:val="baseline"/>
+        <w:position w:val="0"/>
+        <w:sz w:val="22"/>
+        <w:sz w:val="22"/>
+        <w:i w:val="false"/>
+        <w:u w:val="none"/>
+        <w:b w:val="false"/>
+        <w:szCs w:val="22"/>
+        <w:iCs w:val="false"/>
+        <w:bCs w:val="false"/>
+        <w:color w:val="000000"/>
+      </w:rPr>
     </w:lvl>
     <w:lvl w:ilvl="7">
       <w:start w:val="1"/>
-      <w:numFmt w:val="none"/>
-      <w:suff w:val="nothing"/>
-      <w:lvlText w:val=""/>
-      <w:lvlJc w:val="left"/>
-      <w:pPr>
-        <w:tabs>
-          <w:tab w:val="num" w:pos="0"/>
-        </w:tabs>
-        <w:ind w:left="0" w:hanging="0"/>
-      </w:pPr>
+      <w:numFmt w:val="bullet"/>
+      <w:lvlText w:val="■"/>
+      <w:lvlJc w:val="start"/>
+      <w:pPr>
+        <w:tabs>
+          <w:tab w:val="num" w:pos="0"/>
+        </w:tabs>
+        <w:ind w:start="5760" w:hanging="360"/>
+      </w:pPr>
+      <w:rPr>
+        <w:rFonts w:ascii="Arial" w:hAnsi="Arial" w:cs="Arial" w:hint="default"/>
+        <w:smallCaps w:val="false"/>
+        <w:caps w:val="false"/>
+        <w:dstrike w:val="false"/>
+        <w:strike w:val="false"/>
+        <w:vertAlign w:val="baseline"/>
+        <w:position w:val="0"/>
+        <w:sz w:val="22"/>
+        <w:sz w:val="22"/>
+        <w:i w:val="false"/>
+        <w:u w:val="none"/>
+        <w:b w:val="false"/>
+        <w:szCs w:val="22"/>
+        <w:iCs w:val="false"/>
+        <w:bCs w:val="false"/>
+        <w:color w:val="000000"/>
+      </w:rPr>
     </w:lvl>
     <w:lvl w:ilvl="8">
       <w:start w:val="1"/>
-      <w:numFmt w:val="none"/>
-      <w:suff w:val="nothing"/>
-      <w:lvlText w:val=""/>
-      <w:lvlJc w:val="left"/>
-      <w:pPr>
-        <w:tabs>
-          <w:tab w:val="num" w:pos="0"/>
-        </w:tabs>
-        <w:ind w:left="0" w:hanging="0"/>
-      </w:pPr>
+      <w:numFmt w:val="bullet"/>
+      <w:lvlText w:val="■"/>
+      <w:lvlJc w:val="start"/>
+      <w:pPr>
+        <w:tabs>
+          <w:tab w:val="num" w:pos="0"/>
+        </w:tabs>
+        <w:ind w:start="6480" w:hanging="360"/>
+      </w:pPr>
+      <w:rPr>
+        <w:rFonts w:ascii="Arial" w:hAnsi="Arial" w:cs="Arial" w:hint="default"/>
+        <w:smallCaps w:val="false"/>
+        <w:caps w:val="false"/>
+        <w:dstrike w:val="false"/>
+        <w:strike w:val="false"/>
+        <w:vertAlign w:val="baseline"/>
+        <w:position w:val="0"/>
+        <w:sz w:val="22"/>
+        <w:sz w:val="22"/>
+        <w:i w:val="false"/>
+        <w:u w:val="none"/>
+        <w:b w:val="false"/>
+        <w:szCs w:val="22"/>
+        <w:iCs w:val="false"/>
+        <w:bCs w:val="false"/>
+        <w:color w:val="000000"/>
+      </w:rPr>
     </w:lvl>
   </w:abstractNum>
   <w:num w:numId="1">
@@ -2862,6 +3050,7 @@
     </w:rPrDefault>
     <w:pPrDefault>
       <w:pPr>
+        <w:widowControl/>
         <w:suppressAutoHyphens w:val="true"/>
       </w:pPr>
     </w:pPrDefault>
@@ -2871,11 +3060,10 @@
     <w:qFormat/>
     <w:pPr>
       <w:widowControl/>
-      <w:suppressAutoHyphens w:val="true"/>
+      <w:kinsoku w:val="true"/>
       <w:overflowPunct w:val="true"/>
+      <w:autoSpaceDE w:val="true"/>
       <w:bidi w:val="0"/>
-      <w:spacing w:before="0" w:after="0"/>
-      <w:jc w:val="left"/>
     </w:pPr>
     <w:rPr>
       <w:rFonts w:ascii="Liberation Serif" w:hAnsi="Liberation Serif" w:eastAsia="Noto Serif CJK SC" w:cs="FreeSans"/>
@@ -2892,6 +3080,7 @@
     <w:next w:val="Normal"/>
     <w:qFormat/>
     <w:pPr>
+      <w:pBdr/>
       <w:spacing w:lineRule="auto" w:line="240" w:before="240" w:after="240"/>
     </w:pPr>
     <w:rPr>
@@ -2909,6 +3098,7 @@
     <w:next w:val="Normal"/>
     <w:qFormat/>
     <w:pPr>
+      <w:pBdr/>
       <w:spacing w:lineRule="auto" w:line="240" w:before="225" w:after="225"/>
     </w:pPr>
     <w:rPr>
@@ -2926,6 +3116,7 @@
     <w:next w:val="Normal"/>
     <w:qFormat/>
     <w:pPr>
+      <w:pBdr/>
       <w:spacing w:lineRule="auto" w:line="240" w:before="240" w:after="240"/>
     </w:pPr>
     <w:rPr>
@@ -2943,6 +3134,11 @@
       <w:color w:val="000080"/>
       <w:u w:val="single"/>
     </w:rPr>
+  </w:style>
+  <w:style w:type="character" w:styleId="NumberingSymbols">
+    <w:name w:val="Numbering Symbols"/>
+    <w:qFormat/>
+    <w:rPr/>
   </w:style>
   <w:style w:type="paragraph" w:styleId="Heading">
     <w:name w:val="Heading"/>
@@ -3007,11 +3203,11 @@
     <w:qFormat/>
     <w:pPr>
       <w:widowControl/>
-      <w:suppressAutoHyphens w:val="true"/>
+      <w:kinsoku w:val="true"/>
       <w:overflowPunct w:val="true"/>
+      <w:autoSpaceDE w:val="true"/>
       <w:bidi w:val="0"/>
-      <w:spacing w:before="0" w:after="0"/>
-      <w:jc w:val="left"/>
+      <w:jc w:val="start"/>
     </w:pPr>
     <w:rPr>
       <w:rFonts w:ascii="Liberation Serif" w:hAnsi="Liberation Serif" w:eastAsia="Noto Serif CJK SC" w:cs="FreeSans"/>

</xml_diff>